<commit_message>
master work part 3
</commit_message>
<xml_diff>
--- a/Dokumentacija/FTN_MSc_AleksaPopov.docx
+++ b/Dokumentacija/FTN_MSc_AleksaPopov.docx
@@ -71,7 +71,7 @@
                 <v:shape id="_x0000_i1025" type="#_x0000_t75" style="width:64.5pt;height:64.5pt" o:ole="" fillcolor="window">
                   <v:imagedata r:id="rId8" o:title=""/>
                 </v:shape>
-                <o:OLEObject Type="Embed" ProgID="CorelDraw.Graphic.7" ShapeID="_x0000_i1025" DrawAspect="Content" ObjectID="_1818929767" r:id="rId9"/>
+                <o:OLEObject Type="Embed" ProgID="CorelDraw.Graphic.7" ShapeID="_x0000_i1025" DrawAspect="Content" ObjectID="_1818951941" r:id="rId9"/>
               </w:object>
             </w:r>
           </w:p>
@@ -7606,6 +7606,14 @@
     </w:p>
     <w:sdt>
       <w:sdtPr>
+        <w:rPr>
+          <w:rFonts w:ascii="Calibri" w:hAnsi="Calibri"/>
+          <w:b w:val="0"/>
+          <w:bCs w:val="0"/>
+          <w:color w:val="auto"/>
+          <w:sz w:val="22"/>
+          <w:szCs w:val="22"/>
+        </w:rPr>
         <w:id w:val="825863683"/>
         <w:docPartObj>
           <w:docPartGallery w:val="Table of Contents"/>
@@ -7614,11 +7622,7 @@
       </w:sdtPr>
       <w:sdtEndPr>
         <w:rPr>
-          <w:rFonts w:ascii="Calibri" w:hAnsi="Calibri"/>
           <w:noProof/>
-          <w:color w:val="auto"/>
-          <w:sz w:val="22"/>
-          <w:szCs w:val="22"/>
         </w:rPr>
       </w:sdtEndPr>
       <w:sdtContent>
@@ -9915,55 +9919,46 @@
           <w:sz w:val="36"/>
           <w:szCs w:val="36"/>
         </w:rPr>
-        <w:t>Теоријско-</w:t>
-      </w:r>
-      <w:bookmarkStart w:id="7" w:name="_GoBack"/>
+        <w:t>Теоријско-технолошке основе</w:t>
+      </w:r>
+      <w:bookmarkStart w:id="7" w:name="_Toc18083376"/>
+      <w:bookmarkStart w:id="8" w:name="_Toc18083155"/>
+      <w:bookmarkStart w:id="9" w:name="_Toc18506404"/>
+      <w:bookmarkEnd w:id="6"/>
+    </w:p>
+    <w:p>
+      <w:pPr>
+        <w:pStyle w:val="Heading2"/>
+        <w:rPr>
+          <w:lang w:val="sr-Cyrl-RS"/>
+        </w:rPr>
+      </w:pPr>
+      <w:r>
+        <w:rPr>
+          <w:lang w:val="sr-Cyrl-RS"/>
+        </w:rPr>
+        <w:br/>
+      </w:r>
+      <w:r>
+        <w:br/>
+      </w:r>
+      <w:bookmarkStart w:id="10" w:name="_Toc208316268"/>
+      <w:r>
+        <w:rPr>
+          <w:lang w:val="sr-Cyrl-RS"/>
+        </w:rPr>
+        <w:t>3</w:t>
+      </w:r>
+      <w:r>
+        <w:t xml:space="preserve">.1 </w:t>
+      </w:r>
       <w:bookmarkEnd w:id="7"/>
-      <w:r>
-        <w:rPr>
-          <w:sz w:val="36"/>
-          <w:szCs w:val="36"/>
-        </w:rPr>
-        <w:t>технолошке основе</w:t>
-      </w:r>
-      <w:bookmarkStart w:id="8" w:name="_Toc18083376"/>
-      <w:bookmarkStart w:id="9" w:name="_Toc18083155"/>
-      <w:bookmarkStart w:id="10" w:name="_Toc18506404"/>
-      <w:bookmarkEnd w:id="6"/>
-    </w:p>
-    <w:p>
-      <w:pPr>
-        <w:pStyle w:val="Heading2"/>
-        <w:rPr>
-          <w:lang w:val="sr-Cyrl-RS"/>
-        </w:rPr>
-      </w:pPr>
-      <w:r>
-        <w:rPr>
-          <w:lang w:val="sr-Cyrl-RS"/>
-        </w:rPr>
-        <w:br/>
-      </w:r>
-      <w:r>
-        <w:br/>
-      </w:r>
-      <w:bookmarkStart w:id="11" w:name="_Toc208316268"/>
-      <w:r>
-        <w:rPr>
-          <w:lang w:val="sr-Cyrl-RS"/>
-        </w:rPr>
-        <w:t>3</w:t>
-      </w:r>
-      <w:r>
-        <w:t xml:space="preserve">.1 </w:t>
-      </w:r>
       <w:bookmarkEnd w:id="8"/>
       <w:bookmarkEnd w:id="9"/>
+      <w:r>
+        <w:t>Smart Grid</w:t>
+      </w:r>
       <w:bookmarkEnd w:id="10"/>
-      <w:r>
-        <w:t>Smart Grid</w:t>
-      </w:r>
-      <w:bookmarkEnd w:id="11"/>
     </w:p>
     <w:p>
       <w:pPr>
@@ -10147,7 +10142,7 @@
           <w:lang w:val="sr-Cyrl-RS"/>
         </w:rPr>
       </w:pPr>
-      <w:bookmarkStart w:id="12" w:name="_Toc208316269"/>
+      <w:bookmarkStart w:id="11" w:name="_Toc208316269"/>
       <w:r>
         <w:rPr>
           <w:lang w:val="sr-Cyrl-RS"/>
@@ -10163,7 +10158,7 @@
         </w:rPr>
         <w:t>Вишеслојне апликације и Микросервиси</w:t>
       </w:r>
-      <w:bookmarkEnd w:id="12"/>
+      <w:bookmarkEnd w:id="11"/>
     </w:p>
     <w:p>
       <w:pPr>
@@ -10459,7 +10454,7 @@
           <w:lang w:val="sr-Cyrl-RS"/>
         </w:rPr>
       </w:pPr>
-      <w:bookmarkStart w:id="13" w:name="_Toc208316270"/>
+      <w:bookmarkStart w:id="12" w:name="_Toc208316270"/>
       <w:r>
         <w:rPr>
           <w:lang w:val="sr-Cyrl-RS"/>
@@ -10475,7 +10470,7 @@
         </w:rPr>
         <w:t>Методологија развоја софтвера</w:t>
       </w:r>
-      <w:bookmarkEnd w:id="13"/>
+      <w:bookmarkEnd w:id="12"/>
     </w:p>
     <w:p>
       <w:pPr>
@@ -10605,7 +10600,7 @@
           <w:lang w:val="sr-Cyrl-RS"/>
         </w:rPr>
       </w:pPr>
-      <w:bookmarkStart w:id="14" w:name="_Toc208316271"/>
+      <w:bookmarkStart w:id="13" w:name="_Toc208316271"/>
       <w:r>
         <w:rPr>
           <w:lang w:val="sr-Cyrl-RS"/>
@@ -10615,7 +10610,7 @@
       <w:r>
         <w:t>RESTful API</w:t>
       </w:r>
-      <w:bookmarkEnd w:id="14"/>
+      <w:bookmarkEnd w:id="13"/>
     </w:p>
     <w:p>
       <w:pPr>
@@ -10623,8 +10618,6 @@
       </w:pPr>
       <w:r>
         <w:tab/>
-      </w:r>
-      <w:r>
         <w:t>RESTful API представља један од најраспрострањенијих начина за креирање комуникације између различитих софтверских система, посебно у контексту веб апликација и микросервисних архитектура. REST (Representational State Transfer) није технологија већ стил архитектуре који дефинише принципе и правила за размену података путем HTTP протокола. Основна идеја је да се ресурси система представе кроз јединствене URL адресе, док се операције над тим ресурсима изводе употребом стандардних HTTP метода као што су GET, POST, PUT и DELETE.</w:t>
       </w:r>
       <w:r>
@@ -10652,13 +10645,7 @@
         <w:jc w:val="both"/>
       </w:pPr>
       <w:r>
-        <w:t>У микросервисним архитектурама, RESTful API има</w:t>
-      </w:r>
-      <w:r>
-        <w:t xml:space="preserve"> посебну важност јер служи као мост </w:t>
-      </w:r>
-      <w:r>
-        <w:t>између независних сервиса. Сваки микросервис може да изложи своје податке и функционалности путем REST API-ja, што омогућава да се читав систем посматра као скуп мањих, повезаних целина. Предност овог приступа је у томе што се нови сервиси могу лако додавати, а постојећи мењати или ажурирати, без нарушавања функционисања остатка система.</w:t>
+        <w:t>У микросервисним архитектурама, RESTful API има посебну важност јер служи као мост између независних сервиса. Сваки микросервис може да изложи своје податке и функционалности путем REST API-ja, што омогућава да се читав систем посматра као скуп мањих, повезаних целина. Предност овог приступа је у томе што се нови сервиси могу лако додавати, а постојећи мењати или ажурирати, без нарушавања функционисања остатка система.</w:t>
       </w:r>
     </w:p>
     <w:p>
@@ -10673,14 +10660,14 @@
           <w:lang w:val="sr-Cyrl-RS"/>
         </w:rPr>
       </w:pPr>
-      <w:bookmarkStart w:id="15" w:name="_Toc208316272"/>
+      <w:bookmarkStart w:id="14" w:name="_Toc208316272"/>
       <w:r>
         <w:rPr>
           <w:lang w:val="sr-Cyrl-RS"/>
         </w:rPr>
         <w:t>3.5 Вештачка интелигенција</w:t>
       </w:r>
-      <w:bookmarkEnd w:id="15"/>
+      <w:bookmarkEnd w:id="14"/>
     </w:p>
     <w:p>
       <w:pPr>
@@ -10782,7 +10769,7 @@
           <w:lang w:val="sr-Cyrl-RS"/>
         </w:rPr>
       </w:pPr>
-      <w:bookmarkStart w:id="16" w:name="_Toc208316273"/>
+      <w:bookmarkStart w:id="15" w:name="_Toc208316273"/>
       <w:r>
         <w:lastRenderedPageBreak/>
         <w:t>4</w:t>
@@ -10801,7 +10788,7 @@
         </w:rPr>
         <w:t>Коришћене технологије</w:t>
       </w:r>
-      <w:bookmarkEnd w:id="16"/>
+      <w:bookmarkEnd w:id="15"/>
     </w:p>
     <w:p>
       <w:pPr>
@@ -11538,16 +11525,615 @@
         <w:lastRenderedPageBreak/>
         <w:br/>
       </w:r>
-      <w:bookmarkStart w:id="17" w:name="_Toc208316275"/>
+      <w:bookmarkStart w:id="16" w:name="_Toc208316275"/>
       <w:r>
         <w:rPr>
           <w:sz w:val="36"/>
           <w:szCs w:val="36"/>
           <w:lang w:val="sr-Cyrl-RS"/>
         </w:rPr>
-        <w:t>4. Модел Података</w:t>
+        <w:t xml:space="preserve">4. </w:t>
+      </w:r>
+      <w:bookmarkEnd w:id="16"/>
+      <w:r>
+        <w:rPr>
+          <w:sz w:val="36"/>
+          <w:szCs w:val="36"/>
+          <w:lang w:val="sr-Cyrl-RS"/>
+        </w:rPr>
+        <w:t>Функционална спецификација система</w:t>
+      </w:r>
+    </w:p>
+    <w:p>
+      <w:pPr>
+        <w:rPr>
+          <w:lang w:val="sr-Cyrl-RS"/>
+        </w:rPr>
+      </w:pPr>
+    </w:p>
+    <w:p>
+      <w:pPr>
+        <w:jc w:val="both"/>
+      </w:pPr>
+      <w:r>
+        <w:rPr>
+          <w:lang w:val="sr-Cyrl-RS"/>
+        </w:rPr>
+        <w:tab/>
+        <w:t xml:space="preserve">Систем за предикцју електричне енергије, ко и за управљање тргвином енергије за све корисникове батерије за циљ има да олакша цео ново-настали процес у потрошњи енергије. </w:t>
+      </w:r>
+      <w:r>
+        <w:rPr>
+          <w:lang w:val="sr-Cyrl-RS"/>
+        </w:rPr>
+        <w:t>Платформа је осмишљена тако да кориснику омогући једноставан приступ ценама електричне енергије, њиховој историји и предвиђањима будућих кретања. На тај начин корисник добија могућност да донесе информисане одлуке о куповини и продаји енергије, било ручно или путем аутоматизованих стратегија трговине.</w:t>
+      </w:r>
+      <w:r>
+        <w:rPr>
+          <w:lang w:val="sr-Cyrl-RS"/>
+        </w:rPr>
+        <w:t xml:space="preserve"> </w:t>
+      </w:r>
+      <w:r>
+        <w:t>Функционалности система могу се поделити у више целина:</w:t>
+      </w:r>
+    </w:p>
+    <w:p>
+      <w:pPr>
+        <w:pStyle w:val="ListParagraph"/>
+        <w:numPr>
+          <w:ilvl w:val="0"/>
+          <w:numId w:val="16"/>
+        </w:numPr>
+        <w:jc w:val="both"/>
+        <w:rPr>
+          <w:lang w:val="sr-Cyrl-RS"/>
+        </w:rPr>
+      </w:pPr>
+      <w:r>
+        <w:rPr>
+          <w:lang w:val="sr-Cyrl-RS"/>
+        </w:rPr>
+        <w:t>Корисничко управљање</w:t>
+      </w:r>
+    </w:p>
+    <w:p>
+      <w:pPr>
+        <w:pStyle w:val="ListParagraph"/>
+        <w:numPr>
+          <w:ilvl w:val="1"/>
+          <w:numId w:val="16"/>
+        </w:numPr>
+        <w:jc w:val="both"/>
+        <w:rPr>
+          <w:lang w:val="sr-Cyrl-RS"/>
+        </w:rPr>
+      </w:pPr>
+      <w:r>
+        <w:rPr>
+          <w:lang w:val="sr-Cyrl-RS"/>
+        </w:rPr>
+        <w:t>Регистрација и пријава корисни</w:t>
+      </w:r>
+      <w:r>
+        <w:rPr>
+          <w:lang w:val="sr-Cyrl-RS"/>
+        </w:rPr>
+        <w:t>ка путем сигурносних механизама</w:t>
+      </w:r>
+    </w:p>
+    <w:p>
+      <w:pPr>
+        <w:pStyle w:val="ListParagraph"/>
+        <w:numPr>
+          <w:ilvl w:val="1"/>
+          <w:numId w:val="16"/>
+        </w:numPr>
+        <w:jc w:val="both"/>
+        <w:rPr>
+          <w:lang w:val="sr-Cyrl-RS"/>
+        </w:rPr>
+      </w:pPr>
+      <w:r>
+        <w:rPr>
+          <w:lang w:val="sr-Cyrl-RS"/>
+        </w:rPr>
+        <w:t>Генерисање и коришћење JWT токена ради безбедне комуникације и приступа сервисима.</w:t>
+      </w:r>
+    </w:p>
+    <w:p>
+      <w:pPr>
+        <w:pStyle w:val="ListParagraph"/>
+        <w:numPr>
+          <w:ilvl w:val="1"/>
+          <w:numId w:val="16"/>
+        </w:numPr>
+        <w:jc w:val="both"/>
+        <w:rPr>
+          <w:lang w:val="sr-Cyrl-RS"/>
+        </w:rPr>
+      </w:pPr>
+      <w:r>
+        <w:rPr>
+          <w:lang w:val="sr-Cyrl-RS"/>
+        </w:rPr>
+        <w:t>Управљање виртуелним новчаником</w:t>
+      </w:r>
+    </w:p>
+    <w:p>
+      <w:pPr>
+        <w:pStyle w:val="ListParagraph"/>
+        <w:numPr>
+          <w:ilvl w:val="1"/>
+          <w:numId w:val="16"/>
+        </w:numPr>
+        <w:jc w:val="both"/>
+        <w:rPr>
+          <w:lang w:val="sr-Cyrl-RS"/>
+        </w:rPr>
+      </w:pPr>
+      <w:r>
+        <w:rPr>
+          <w:lang w:val="sr-Cyrl-RS"/>
+        </w:rPr>
+        <w:t>Могућност админа да блокира корисника или батерије по потреби</w:t>
+      </w:r>
+    </w:p>
+    <w:p>
+      <w:pPr>
+        <w:pStyle w:val="ListParagraph"/>
+        <w:numPr>
+          <w:ilvl w:val="0"/>
+          <w:numId w:val="16"/>
+        </w:numPr>
+        <w:jc w:val="both"/>
+        <w:rPr>
+          <w:lang w:val="sr-Cyrl-RS"/>
+        </w:rPr>
+      </w:pPr>
+      <w:r>
+        <w:rPr>
+          <w:lang w:val="sr-Cyrl-RS"/>
+        </w:rPr>
+        <w:t>Контролна табла</w:t>
+      </w:r>
+    </w:p>
+    <w:p>
+      <w:pPr>
+        <w:pStyle w:val="ListParagraph"/>
+        <w:numPr>
+          <w:ilvl w:val="1"/>
+          <w:numId w:val="16"/>
+        </w:numPr>
+        <w:jc w:val="both"/>
+        <w:rPr>
+          <w:lang w:val="sr-Cyrl-RS"/>
+        </w:rPr>
+      </w:pPr>
+      <w:r>
+        <w:rPr>
+          <w:lang w:val="sr-Cyrl-RS"/>
+        </w:rPr>
+        <w:t>Приказ тр</w:t>
+      </w:r>
+      <w:r>
+        <w:rPr>
+          <w:lang w:val="sr-Cyrl-RS"/>
+        </w:rPr>
+        <w:t>енутне цене електричне енергије</w:t>
+      </w:r>
+    </w:p>
+    <w:p>
+      <w:pPr>
+        <w:pStyle w:val="ListParagraph"/>
+        <w:numPr>
+          <w:ilvl w:val="1"/>
+          <w:numId w:val="16"/>
+        </w:numPr>
+        <w:jc w:val="both"/>
+        <w:rPr>
+          <w:lang w:val="sr-Cyrl-RS"/>
+        </w:rPr>
+      </w:pPr>
+      <w:r>
+        <w:rPr>
+          <w:lang w:val="sr-Cyrl-RS"/>
+        </w:rPr>
+        <w:t>Визуелизација историје цена</w:t>
+      </w:r>
+    </w:p>
+    <w:p>
+      <w:pPr>
+        <w:pStyle w:val="ListParagraph"/>
+        <w:numPr>
+          <w:ilvl w:val="1"/>
+          <w:numId w:val="16"/>
+        </w:numPr>
+        <w:jc w:val="both"/>
+        <w:rPr>
+          <w:lang w:val="sr-Cyrl-RS"/>
+        </w:rPr>
+      </w:pPr>
+      <w:r>
+        <w:rPr>
+          <w:lang w:val="sr-Cyrl-RS"/>
+        </w:rPr>
+        <w:t>Приказ предвиђен</w:t>
+      </w:r>
+      <w:r>
+        <w:rPr>
+          <w:lang w:val="sr-Cyrl-RS"/>
+        </w:rPr>
+        <w:t>их цена добијених од AI сервиса</w:t>
+      </w:r>
+    </w:p>
+    <w:p>
+      <w:pPr>
+        <w:pStyle w:val="ListParagraph"/>
+        <w:numPr>
+          <w:ilvl w:val="1"/>
+          <w:numId w:val="16"/>
+        </w:numPr>
+        <w:jc w:val="both"/>
+        <w:rPr>
+          <w:lang w:val="sr-Cyrl-RS"/>
+        </w:rPr>
+      </w:pPr>
+      <w:r>
+        <w:rPr>
+          <w:lang w:val="sr-Cyrl-RS"/>
+        </w:rPr>
+        <w:t>Јасно организован кориснички инте</w:t>
+      </w:r>
+      <w:r>
+        <w:rPr>
+          <w:lang w:val="sr-Cyrl-RS"/>
+        </w:rPr>
+        <w:t>рфејс, уз могућност праћења најновијих вести</w:t>
+      </w:r>
+    </w:p>
+    <w:p>
+      <w:pPr>
+        <w:pStyle w:val="ListParagraph"/>
+        <w:numPr>
+          <w:ilvl w:val="0"/>
+          <w:numId w:val="16"/>
+        </w:numPr>
+        <w:jc w:val="both"/>
+        <w:rPr>
+          <w:lang w:val="sr-Cyrl-RS"/>
+        </w:rPr>
+      </w:pPr>
+      <w:r>
+        <w:rPr>
+          <w:lang w:val="sr-Cyrl-RS"/>
+        </w:rPr>
+        <w:t>Управљање батеријама</w:t>
+      </w:r>
+    </w:p>
+    <w:p>
+      <w:pPr>
+        <w:pStyle w:val="ListParagraph"/>
+        <w:numPr>
+          <w:ilvl w:val="1"/>
+          <w:numId w:val="16"/>
+        </w:numPr>
+        <w:jc w:val="both"/>
+        <w:rPr>
+          <w:lang w:val="sr-Cyrl-RS"/>
+        </w:rPr>
+      </w:pPr>
+      <w:r>
+        <w:rPr>
+          <w:lang w:val="sr-Cyrl-RS"/>
+        </w:rPr>
+        <w:t>Регистрација батерија и дефинисање њихових параметара</w:t>
+      </w:r>
+    </w:p>
+    <w:p>
+      <w:pPr>
+        <w:pStyle w:val="ListParagraph"/>
+        <w:numPr>
+          <w:ilvl w:val="1"/>
+          <w:numId w:val="16"/>
+        </w:numPr>
+        <w:jc w:val="both"/>
+        <w:rPr>
+          <w:lang w:val="sr-Cyrl-RS"/>
+        </w:rPr>
+      </w:pPr>
+      <w:r>
+        <w:rPr>
+          <w:lang w:val="sr-Cyrl-RS"/>
+        </w:rPr>
+        <w:t>Праћење стања батерије у реалном времену</w:t>
+      </w:r>
+    </w:p>
+    <w:p>
+      <w:pPr>
+        <w:pStyle w:val="ListParagraph"/>
+        <w:numPr>
+          <w:ilvl w:val="1"/>
+          <w:numId w:val="16"/>
+        </w:numPr>
+        <w:jc w:val="both"/>
+        <w:rPr>
+          <w:lang w:val="sr-Cyrl-RS"/>
+        </w:rPr>
+      </w:pPr>
+      <w:r>
+        <w:rPr>
+          <w:lang w:val="sr-Cyrl-RS"/>
+        </w:rPr>
+        <w:t>Додела једне од понуђених стратегија трговине или ручно управљање</w:t>
+      </w:r>
+    </w:p>
+    <w:p>
+      <w:pPr>
+        <w:pStyle w:val="ListParagraph"/>
+        <w:numPr>
+          <w:ilvl w:val="0"/>
+          <w:numId w:val="16"/>
+        </w:numPr>
+        <w:jc w:val="both"/>
+        <w:rPr>
+          <w:lang w:val="sr-Cyrl-RS"/>
+        </w:rPr>
+      </w:pPr>
+      <w:r>
+        <w:rPr>
+          <w:lang w:val="sr-Cyrl-RS"/>
+        </w:rPr>
+        <w:t>Стратегије трговине и аутоматизација</w:t>
+      </w:r>
+    </w:p>
+    <w:p>
+      <w:pPr>
+        <w:pStyle w:val="ListParagraph"/>
+        <w:numPr>
+          <w:ilvl w:val="1"/>
+          <w:numId w:val="16"/>
+        </w:numPr>
+        <w:jc w:val="both"/>
+        <w:rPr>
+          <w:lang w:val="sr-Cyrl-RS"/>
+        </w:rPr>
+      </w:pPr>
+      <w:r>
+        <w:rPr>
+          <w:lang w:val="sr-Cyrl-RS"/>
+        </w:rPr>
+        <w:t xml:space="preserve">Избор и примена унапред </w:t>
+      </w:r>
+      <w:r>
+        <w:rPr>
+          <w:lang w:val="sr-Cyrl-RS"/>
+        </w:rPr>
+        <w:t>дефинисаних стратегија трговине</w:t>
+      </w:r>
+    </w:p>
+    <w:p>
+      <w:pPr>
+        <w:pStyle w:val="ListParagraph"/>
+        <w:numPr>
+          <w:ilvl w:val="1"/>
+          <w:numId w:val="16"/>
+        </w:numPr>
+        <w:jc w:val="both"/>
+        <w:rPr>
+          <w:lang w:val="sr-Cyrl-RS"/>
+        </w:rPr>
+      </w:pPr>
+      <w:r>
+        <w:rPr>
+          <w:lang w:val="sr-Cyrl-RS"/>
+        </w:rPr>
+        <w:t>Аутоматизовано управљање батеријама на осн</w:t>
+      </w:r>
+      <w:r>
+        <w:rPr>
+          <w:lang w:val="sr-Cyrl-RS"/>
+        </w:rPr>
+        <w:t>ову стратегија</w:t>
+      </w:r>
+    </w:p>
+    <w:p>
+      <w:pPr>
+        <w:pStyle w:val="ListParagraph"/>
+        <w:numPr>
+          <w:ilvl w:val="1"/>
+          <w:numId w:val="16"/>
+        </w:numPr>
+        <w:jc w:val="both"/>
+        <w:rPr>
+          <w:lang w:val="sr-Cyrl-RS"/>
+        </w:rPr>
+      </w:pPr>
+      <w:r>
+        <w:rPr>
+          <w:lang w:val="sr-Cyrl-RS"/>
+        </w:rPr>
+        <w:t>Евиденција и чу</w:t>
+      </w:r>
+      <w:r>
+        <w:rPr>
+          <w:lang w:val="sr-Cyrl-RS"/>
+        </w:rPr>
+        <w:t>вање свих извршених трансакција</w:t>
+      </w:r>
+    </w:p>
+    <w:p>
+      <w:pPr>
+        <w:pStyle w:val="ListParagraph"/>
+        <w:numPr>
+          <w:ilvl w:val="0"/>
+          <w:numId w:val="16"/>
+        </w:numPr>
+        <w:jc w:val="both"/>
+        <w:rPr>
+          <w:lang w:val="sr-Cyrl-RS"/>
+        </w:rPr>
+      </w:pPr>
+      <w:r>
+        <w:rPr>
+          <w:lang w:val="sr-Cyrl-RS"/>
+        </w:rPr>
+        <w:t>Вештачка интелигенција</w:t>
+      </w:r>
+    </w:p>
+    <w:p>
+      <w:pPr>
+        <w:pStyle w:val="ListParagraph"/>
+        <w:numPr>
+          <w:ilvl w:val="1"/>
+          <w:numId w:val="16"/>
+        </w:numPr>
+        <w:jc w:val="both"/>
+        <w:rPr>
+          <w:lang w:val="sr-Cyrl-RS"/>
+        </w:rPr>
+      </w:pPr>
+      <w:r>
+        <w:rPr>
+          <w:lang w:val="sr-Cyrl-RS"/>
+        </w:rPr>
+        <w:t>Предикција цена електричне енергије коришћењем модела машинског учења</w:t>
+      </w:r>
+    </w:p>
+    <w:p>
+      <w:pPr>
+        <w:pStyle w:val="ListParagraph"/>
+        <w:numPr>
+          <w:ilvl w:val="1"/>
+          <w:numId w:val="16"/>
+        </w:numPr>
+        <w:jc w:val="both"/>
+        <w:rPr>
+          <w:lang w:val="sr-Cyrl-RS"/>
+        </w:rPr>
+      </w:pPr>
+      <w:r>
+        <w:rPr>
+          <w:lang w:val="sr-Cyrl-RS"/>
+        </w:rPr>
+        <w:t>Обрада историјских података и ген</w:t>
+      </w:r>
+      <w:r>
+        <w:rPr>
+          <w:lang w:val="sr-Cyrl-RS"/>
+        </w:rPr>
+        <w:t>ерисање прогноза за наредни дан</w:t>
+      </w:r>
+    </w:p>
+    <w:p>
+      <w:pPr>
+        <w:pStyle w:val="ListParagraph"/>
+        <w:numPr>
+          <w:ilvl w:val="1"/>
+          <w:numId w:val="16"/>
+        </w:numPr>
+        <w:jc w:val="both"/>
+        <w:rPr>
+          <w:lang w:val="sr-Cyrl-RS"/>
+        </w:rPr>
+      </w:pPr>
+      <w:r>
+        <w:rPr>
+          <w:lang w:val="sr-Cyrl-RS"/>
+        </w:rPr>
+        <w:t>Испор</w:t>
+      </w:r>
+      <w:r>
+        <w:rPr>
+          <w:lang w:val="sr-Cyrl-RS"/>
+        </w:rPr>
+        <w:t>ука резултата у реалном времену</w:t>
+      </w:r>
+    </w:p>
+    <w:p>
+      <w:pPr>
+        <w:rPr>
+          <w:lang w:val="sr-Cyrl-RS"/>
+        </w:rPr>
+      </w:pPr>
+    </w:p>
+    <w:p>
+      <w:pPr>
+        <w:rPr>
+          <w:lang w:val="sr-Cyrl-RS"/>
+        </w:rPr>
+      </w:pPr>
+    </w:p>
+    <w:p>
+      <w:pPr>
+        <w:rPr>
+          <w:lang w:val="sr-Cyrl-RS"/>
+        </w:rPr>
+      </w:pPr>
+    </w:p>
+    <w:p>
+      <w:pPr>
+        <w:rPr>
+          <w:lang w:val="sr-Cyrl-RS"/>
+        </w:rPr>
+      </w:pPr>
+    </w:p>
+    <w:p>
+      <w:pPr>
+        <w:rPr>
+          <w:lang w:val="sr-Cyrl-RS"/>
+        </w:rPr>
+      </w:pPr>
+    </w:p>
+    <w:p>
+      <w:pPr>
+        <w:pStyle w:val="Heading1"/>
+        <w:rPr>
+          <w:sz w:val="32"/>
+          <w:szCs w:val="32"/>
+        </w:rPr>
+      </w:pPr>
+    </w:p>
+    <w:p>
+      <w:pPr>
+        <w:pStyle w:val="Heading1"/>
+        <w:rPr>
+          <w:sz w:val="36"/>
+          <w:szCs w:val="36"/>
+          <w:lang w:val="sr-Cyrl-RS"/>
+        </w:rPr>
+      </w:pPr>
+      <w:bookmarkStart w:id="17" w:name="_Toc208316276"/>
+      <w:r>
+        <w:rPr>
+          <w:sz w:val="36"/>
+          <w:szCs w:val="36"/>
+        </w:rPr>
+        <w:t xml:space="preserve">5. </w:t>
       </w:r>
       <w:bookmarkEnd w:id="17"/>
+      <w:r>
+        <w:rPr>
+          <w:sz w:val="36"/>
+          <w:szCs w:val="36"/>
+        </w:rPr>
+        <w:t>А</w:t>
+      </w:r>
+      <w:r>
+        <w:rPr>
+          <w:sz w:val="36"/>
+          <w:szCs w:val="36"/>
+          <w:lang w:val="sr-Cyrl-RS"/>
+        </w:rPr>
+        <w:t>рхитектура система</w:t>
+      </w:r>
+    </w:p>
+    <w:p>
+      <w:pPr>
+        <w:rPr>
+          <w:lang w:val="sr-Cyrl-RS"/>
+        </w:rPr>
+      </w:pPr>
     </w:p>
     <w:p>
       <w:pPr>
@@ -11556,132 +12142,137 @@
           <w:lang w:val="sr-Cyrl-RS"/>
         </w:rPr>
       </w:pPr>
-    </w:p>
-    <w:p>
-      <w:pPr>
-        <w:ind w:firstLine="720"/>
+      <w:r>
+        <w:rPr>
+          <w:lang w:val="sr-Cyrl-RS"/>
+        </w:rPr>
+        <w:tab/>
+      </w:r>
+      <w:r>
+        <w:rPr>
+          <w:lang w:val="sr-Cyrl-RS"/>
+        </w:rPr>
+        <w:t>Архитектура ове платформе заснована је на микросервисном моделу, што значи да је систем подељен на више независних сервиса који међусобно комуницирају и сваки обавља специфичну функцију унутар целокупне платформе. Овај приступ омогућава да се комплексни проблем трговања енергијом подели на мање, лакше управљиве јединице, које се могу развијати, тестирати и ажурирати независно.</w:t>
+      </w:r>
+      <w:r>
+        <w:rPr>
+          <w:lang w:val="sr-Cyrl-RS"/>
+        </w:rPr>
+        <w:t xml:space="preserve"> Пројекат се састоји од шест главних компоненти:</w:t>
+      </w:r>
+    </w:p>
+    <w:p>
+      <w:pPr>
+        <w:pStyle w:val="ListParagraph"/>
+        <w:numPr>
+          <w:ilvl w:val="0"/>
+          <w:numId w:val="17"/>
+        </w:numPr>
         <w:jc w:val="both"/>
         <w:rPr>
-          <w:sz w:val="23"/>
-          <w:szCs w:val="23"/>
-          <w:lang w:val="sr-Cyrl-RS"/>
-        </w:rPr>
-      </w:pPr>
-      <w:r>
-        <w:rPr>
-          <w:lang w:val="sr-Cyrl-RS"/>
-        </w:rPr>
-        <w:t xml:space="preserve">Модел </w:t>
-      </w:r>
-      <w:r>
-        <w:rPr>
-          <w:lang w:val="sr-Cyrl-RS"/>
-        </w:rPr>
-        <w:tab/>
-        <w:t>података,</w:t>
-      </w:r>
-      <w:r>
-        <w:rPr>
-          <w:lang w:val="sr-Cyrl-RS"/>
-        </w:rPr>
-        <w:t xml:space="preserve"> чији је </w:t>
-      </w:r>
-      <w:r>
-        <w:rPr>
-          <w:sz w:val="23"/>
-          <w:szCs w:val="23"/>
-        </w:rPr>
-        <w:t xml:space="preserve">UML </w:t>
-      </w:r>
-      <w:r>
-        <w:rPr>
-          <w:sz w:val="23"/>
-          <w:szCs w:val="23"/>
-          <w:lang w:val="sr-Cyrl-RS"/>
-        </w:rPr>
-        <w:t>дијаграм</w:t>
-      </w:r>
-      <w:r>
-        <w:rPr>
-          <w:lang w:val="sr-Cyrl-RS"/>
-        </w:rPr>
-        <w:t xml:space="preserve"> креиран </w:t>
-      </w:r>
-      <w:r>
-        <w:rPr>
-          <w:lang w:val="sr-Cyrl-RS"/>
-        </w:rPr>
-        <w:t xml:space="preserve">помоћу </w:t>
-      </w:r>
-      <w:r>
-        <w:rPr>
-          <w:rFonts w:cstheme="minorHAnsi"/>
-          <w:color w:val="00000A"/>
-          <w:sz w:val="23"/>
-          <w:szCs w:val="23"/>
-        </w:rPr>
-        <w:t>Enteprise</w:t>
-      </w:r>
-      <w:r>
-        <w:rPr>
-          <w:rFonts w:cstheme="minorHAnsi"/>
-          <w:color w:val="00000A"/>
-          <w:sz w:val="23"/>
-          <w:szCs w:val="23"/>
-          <w:lang w:val="sr-Cyrl-RS"/>
-        </w:rPr>
-        <w:t xml:space="preserve"> </w:t>
-      </w:r>
-      <w:r>
-        <w:rPr>
-          <w:rFonts w:cstheme="minorHAnsi"/>
-          <w:color w:val="00000A"/>
-          <w:sz w:val="23"/>
-          <w:szCs w:val="23"/>
-        </w:rPr>
-        <w:t>Architect</w:t>
-      </w:r>
-      <w:r>
-        <w:rPr>
-          <w:rFonts w:cstheme="minorHAnsi"/>
-          <w:color w:val="00000A"/>
-          <w:sz w:val="23"/>
-          <w:szCs w:val="23"/>
-          <w:lang w:val="sr-Cyrl-RS"/>
-        </w:rPr>
-        <w:t xml:space="preserve">-а, служи као оријентир за моделовање објеката и итеракција између њих. Он је дефинисан </w:t>
-      </w:r>
-      <w:r>
-        <w:rPr>
-          <w:sz w:val="23"/>
-          <w:szCs w:val="23"/>
-        </w:rPr>
-        <w:t>CIM</w:t>
-      </w:r>
-      <w:r>
-        <w:rPr>
-          <w:sz w:val="23"/>
-          <w:szCs w:val="23"/>
-          <w:lang w:val="sr-Cyrl-RS"/>
-        </w:rPr>
-        <w:t xml:space="preserve"> профилом. </w:t>
-      </w:r>
-      <w:r>
-        <w:rPr>
-          <w:sz w:val="23"/>
-          <w:szCs w:val="23"/>
-          <w:lang w:val="sr-Cyrl-RS"/>
-        </w:rPr>
-        <w:br/>
-        <w:t>Приказани модел система је упрошћен у великој мери.</w:t>
-      </w:r>
-      <w:r>
-        <w:rPr>
-          <w:sz w:val="23"/>
-          <w:szCs w:val="23"/>
-          <w:lang w:val="sr-Cyrl-RS"/>
-        </w:rPr>
-        <w:t xml:space="preserve"> Међутим сама комплексност овог модела не игра главну улогу у комплекности решавања самог проблема. </w:t>
+          <w:lang w:val="sr-Cyrl-RS"/>
+        </w:rPr>
+      </w:pPr>
+      <w:r>
+        <w:t>Frontend aplikacija</w:t>
+      </w:r>
+    </w:p>
+    <w:p>
+      <w:pPr>
+        <w:pStyle w:val="ListParagraph"/>
+        <w:numPr>
+          <w:ilvl w:val="0"/>
+          <w:numId w:val="17"/>
+        </w:numPr>
+        <w:jc w:val="both"/>
+        <w:rPr>
+          <w:lang w:val="sr-Cyrl-RS"/>
+        </w:rPr>
+      </w:pPr>
+      <w:r>
+        <w:rPr>
+          <w:lang w:val="sr-Cyrl-RS"/>
+        </w:rPr>
+        <w:t>Микросервис за кориснике</w:t>
+      </w:r>
+    </w:p>
+    <w:p>
+      <w:pPr>
+        <w:pStyle w:val="ListParagraph"/>
+        <w:numPr>
+          <w:ilvl w:val="0"/>
+          <w:numId w:val="17"/>
+        </w:numPr>
+        <w:jc w:val="both"/>
+        <w:rPr>
+          <w:lang w:val="sr-Cyrl-RS"/>
+        </w:rPr>
+      </w:pPr>
+      <w:r>
+        <w:rPr>
+          <w:lang w:val="sr-Cyrl-RS"/>
+        </w:rPr>
+        <w:t>Микросервис за базу</w:t>
+      </w:r>
+    </w:p>
+    <w:p>
+      <w:pPr>
+        <w:pStyle w:val="ListParagraph"/>
+        <w:numPr>
+          <w:ilvl w:val="0"/>
+          <w:numId w:val="17"/>
+        </w:numPr>
+        <w:jc w:val="both"/>
+        <w:rPr>
+          <w:lang w:val="sr-Cyrl-RS"/>
+        </w:rPr>
+      </w:pPr>
+      <w:r>
+        <w:rPr>
+          <w:lang w:val="sr-Cyrl-RS"/>
+        </w:rPr>
+        <w:t xml:space="preserve">Микросервис за </w:t>
+      </w:r>
+      <w:r>
+        <w:t>AI</w:t>
+      </w:r>
+    </w:p>
+    <w:p>
+      <w:pPr>
+        <w:pStyle w:val="ListParagraph"/>
+        <w:numPr>
+          <w:ilvl w:val="0"/>
+          <w:numId w:val="17"/>
+        </w:numPr>
+        <w:jc w:val="both"/>
+        <w:rPr>
+          <w:lang w:val="sr-Cyrl-RS"/>
+        </w:rPr>
+      </w:pPr>
+      <w:r>
+        <w:rPr>
+          <w:lang w:val="sr-Cyrl-RS"/>
+        </w:rPr>
+        <w:t>Микросервис за трансакције</w:t>
+      </w:r>
+    </w:p>
+    <w:p>
+      <w:pPr>
+        <w:pStyle w:val="ListParagraph"/>
+        <w:numPr>
+          <w:ilvl w:val="0"/>
+          <w:numId w:val="17"/>
+        </w:numPr>
+        <w:jc w:val="both"/>
+        <w:rPr>
+          <w:lang w:val="sr-Cyrl-RS"/>
+        </w:rPr>
+      </w:pPr>
+      <w:r>
+        <w:rPr>
+          <w:lang w:val="sr-Cyrl-RS"/>
+        </w:rPr>
+        <w:t>База података</w:t>
       </w:r>
     </w:p>
     <w:p>
@@ -11693,15 +12284,15 @@
       </w:pPr>
       <w:r>
         <w:rPr>
-          <w:noProof/>
-          <w:sz w:val="23"/>
-          <w:szCs w:val="23"/>
+          <w:rFonts w:ascii="Times New Roman" w:hAnsi="Times New Roman"/>
+          <w:iCs/>
+          <w:szCs w:val="20"/>
         </w:rPr>
         <w:drawing>
-          <wp:inline distT="0" distB="0" distL="0" distR="0" wp14:anchorId="76070CBE" wp14:editId="5D657179">
-            <wp:extent cx="5325452" cy="7000875"/>
-            <wp:effectExtent l="0" t="0" r="8890" b="0"/>
-            <wp:docPr id="4" name="Picture 4"/>
+          <wp:inline distT="0" distB="0" distL="0" distR="0" wp14:anchorId="06BB3ACC" wp14:editId="220EC347">
+            <wp:extent cx="4124325" cy="5375301"/>
+            <wp:effectExtent l="0" t="0" r="0" b="0"/>
+            <wp:docPr id="1503258139" name="Picture 1"/>
             <wp:cNvGraphicFramePr>
               <a:graphicFrameLocks xmlns:a="http://schemas.openxmlformats.org/drawingml/2006/main" noChangeAspect="1"/>
             </wp:cNvGraphicFramePr>
@@ -11709,13 +12300,13 @@
               <a:graphicData uri="http://schemas.openxmlformats.org/drawingml/2006/picture">
                 <pic:pic xmlns:pic="http://schemas.openxmlformats.org/drawingml/2006/picture">
                   <pic:nvPicPr>
-                    <pic:cNvPr id="0" name="Picture 2"/>
+                    <pic:cNvPr id="0" name="Picture 1"/>
                     <pic:cNvPicPr>
                       <a:picLocks noChangeAspect="1" noChangeArrowheads="1"/>
                     </pic:cNvPicPr>
                   </pic:nvPicPr>
                   <pic:blipFill>
-                    <a:blip r:embed="rId26">
+                    <a:blip r:embed="rId26" cstate="print">
                       <a:extLst>
                         <a:ext uri="{28A0092B-C50C-407E-A947-70E740481C1C}">
                           <a14:useLocalDpi xmlns:a14="http://schemas.microsoft.com/office/drawing/2010/main" val="0"/>
@@ -11730,7 +12321,7 @@
                   <pic:spPr bwMode="auto">
                     <a:xfrm>
                       <a:off x="0" y="0"/>
-                      <a:ext cx="5336887" cy="7015907"/>
+                      <a:ext cx="4306649" cy="5612927"/>
                     </a:xfrm>
                     <a:prstGeom prst="rect">
                       <a:avLst/>
@@ -11751,598 +12342,222 @@
           <w:lang w:val="sr-Cyrl-RS"/>
         </w:rPr>
         <w:br/>
-        <w:t>Слика 5. – Модел Података</w:t>
+        <w:t>Слика 3. – Архитектура система</w:t>
       </w:r>
     </w:p>
     <w:p>
       <w:pPr>
         <w:jc w:val="both"/>
         <w:rPr>
-          <w:sz w:val="23"/>
-          <w:szCs w:val="23"/>
-          <w:lang w:val="sr-Cyrl-RS"/>
-        </w:rPr>
-      </w:pPr>
-      <w:r>
-        <w:rPr>
-          <w:sz w:val="23"/>
-          <w:szCs w:val="23"/>
+          <w:lang w:val="sr-Cyrl-RS"/>
+        </w:rPr>
+      </w:pPr>
+      <w:r>
+        <w:rPr>
           <w:lang w:val="sr-Cyrl-RS"/>
         </w:rPr>
         <w:lastRenderedPageBreak/>
-        <w:t>Добро дефинисано решење једноставног модела омогућује једноставну имплементацију и у случају повећања комплексности модела</w:t>
+        <w:t>Кориснички интерфејс омоућава јасан приказ свих информација као и систем за лако коришћење. И</w:t>
+      </w:r>
+      <w:r>
+        <w:rPr>
+          <w:lang w:val="sr-Cyrl-RS"/>
+        </w:rPr>
+        <w:t>зграђен је у React-у, уз коришћење Redux-а за управљање глобалним стањем.</w:t>
+      </w:r>
+      <w:r>
+        <w:rPr>
+          <w:lang w:val="sr-Cyrl-RS"/>
+        </w:rPr>
+        <w:t xml:space="preserve"> </w:t>
+      </w:r>
+      <w:r>
+        <w:rPr>
+          <w:lang w:val="sr-Cyrl-RS"/>
+        </w:rPr>
+        <w:t>Он омогућава преглед тренутних и историјских цена, приказ предвиђања, управљање батеријама и стратегијама, као и контролу виртуелног новчаника. Дизајниран је да буде прегледан, једноставан и прилагођен корисницима.</w:t>
+      </w:r>
+      <w:r>
+        <w:rPr>
+          <w:lang w:val="sr-Cyrl-RS"/>
+        </w:rPr>
+        <w:t xml:space="preserve"> Сви подаци о </w:t>
+      </w:r>
+      <w:r>
+        <w:rPr>
+          <w:lang w:val="sr-Cyrl-RS"/>
+        </w:rPr>
+        <w:t>корисницима, батеријама, стратегијама, трансакцијама и историји цена чувају се у MongoDB бази. Као документо-оријентисана NoSQL база, MongoDB омогућава флексибилно моделирање података и ефикасно складиштење великих количина информација. За једноставнији рад са моделима података користи се Mongoose библиотека.</w:t>
       </w:r>
     </w:p>
     <w:p>
       <w:pPr>
         <w:jc w:val="both"/>
         <w:rPr>
-          <w:sz w:val="23"/>
-          <w:szCs w:val="23"/>
-          <w:lang w:val="sr-Cyrl-RS"/>
-        </w:rPr>
-      </w:pPr>
-      <w:r>
-        <w:rPr>
-          <w:sz w:val="23"/>
-          <w:szCs w:val="23"/>
-          <w:lang w:val="sr-Cyrl-RS"/>
-        </w:rPr>
-        <w:t>Модел података састављен је од тринаест класа од којих су осам апстрактне а пет су конкретне. Класе на које ће се овај рад фокусирати, и које су од главног значаја јесу конкретне класе јер корисник на самом приказу сајта не мора да зна, нити ће му бити приказана логика целог система.</w:t>
+          <w:lang w:val="sr-Cyrl-RS"/>
+        </w:rPr>
+      </w:pPr>
+      <w:r>
+        <w:rPr>
+          <w:lang w:val="sr-Cyrl-RS"/>
+        </w:rPr>
+        <w:t>Микросервиси, као што је вец споменуто, деле се на четири главне компоненте, и свака од њих има кључну улогу коју извршава. Први микросервис за кориснике (</w:t>
+      </w:r>
+      <w:r>
+        <w:rPr>
+          <w:lang w:val="sr-Cyrl-RS"/>
+        </w:rPr>
+        <w:t>microservice-user</w:t>
+      </w:r>
+      <w:r>
+        <w:rPr>
+          <w:lang w:val="sr-Cyrl-RS"/>
+        </w:rPr>
+        <w:t>)</w:t>
+      </w:r>
+      <w:r>
+        <w:rPr>
+          <w:lang w:val="sr-Cyrl-RS"/>
+        </w:rPr>
+        <w:t xml:space="preserve">, </w:t>
+      </w:r>
+      <w:r>
+        <w:rPr>
+          <w:lang w:val="sr-Cyrl-RS"/>
+        </w:rPr>
+        <w:t>је одговоран за управљање корисничким налозима. Он обухвата регистрацију нових корисника, пријаву, аутентификацију и издавање сигурносних JWT токена. JWT токени омогућавају сигуран приступ корисника различитим сервисима платформе без потребе за поновном пријавом, чиме се побољшава корисничко искуство и обезбеђује безбедност система. User Service такође прати корисничке активности и интегрише управљање виртуелним новчаником који се користи за трговину енергијом.</w:t>
+      </w:r>
+      <w:r>
+        <w:rPr>
+          <w:lang w:val="sr-Cyrl-RS"/>
+        </w:rPr>
+        <w:t xml:space="preserve"> Овај сервис има исто и функционлност да подржава админ кориснике, као и њихове активности. То су могућност да се блокирају други корисници, као и њихове батерије по потреби. </w:t>
+      </w:r>
+      <w:r>
+        <w:rPr>
+          <w:lang w:val="sr-Cyrl-RS"/>
+        </w:rPr>
+        <w:t>Следеци микросервис је микросервис за трансакције (</w:t>
+      </w:r>
+      <w:r>
+        <w:rPr>
+          <w:lang w:val="sr-Cyrl-RS"/>
+        </w:rPr>
+        <w:t>microservice-trade</w:t>
+      </w:r>
+      <w:r>
+        <w:rPr>
+          <w:lang w:val="sr-Cyrl-RS"/>
+        </w:rPr>
+        <w:t>).О</w:t>
+      </w:r>
+      <w:r>
+        <w:rPr>
+          <w:lang w:val="sr-Cyrl-RS"/>
+        </w:rPr>
+        <w:t>вај сервис садржи пословну логику платформе. Он управља стањем батерија, анализира предикције цена добијене од AI сервиса и аутоматски доноси одлуке о куповини или продаји енергије на основу дефинисаних стратегија корисника. Trade Service омогућава кориснику да одабере једну од предефинисаних стратегија или да управља батеријама ручно, али кључна предност је у аутоматском раду који се одвија у позадини, без потребе за сталном интервенцијом корисника.</w:t>
+      </w:r>
+      <w:r>
+        <w:rPr>
+          <w:lang w:val="sr-Cyrl-RS"/>
+        </w:rPr>
+        <w:t xml:space="preserve"> Микросервис који има директан приступ бази ( </w:t>
+      </w:r>
+      <w:r>
+        <w:rPr>
+          <w:lang w:val="sr-Cyrl-RS"/>
+        </w:rPr>
+        <w:t>microservice-data</w:t>
+      </w:r>
+      <w:r>
+        <w:rPr>
+          <w:lang w:val="sr-Cyrl-RS"/>
+        </w:rPr>
+        <w:t xml:space="preserve">), је централна тачка приступа бази података, обезбеђујуци потребне податке свим осталим сервисима. Овај микросервис симулира улогу </w:t>
+      </w:r>
+      <w:r>
+        <w:rPr>
+          <w:lang w:val="sr-Cyrl-RS"/>
+        </w:rPr>
+        <w:t>DaaS</w:t>
+      </w:r>
+      <w:r>
+        <w:rPr>
+          <w:lang w:val="sr-Cyrl-RS"/>
+        </w:rPr>
+        <w:t xml:space="preserve"> провајдера. Уместо да сваки сервис директно пристуа бази података, сви захтеви за читање или писање иду искучиво преко овог сервиса.  На овај начин постиже сеизолација података и смањење међузависности између сервиса. Овај приступ се може посматрати као варијанта патерна</w:t>
+      </w:r>
+      <w:r>
+        <w:rPr>
+          <w:lang w:val="sr-Cyrl-RS"/>
+        </w:rPr>
+        <w:t xml:space="preserve"> Database per Service</w:t>
+      </w:r>
+      <w:r>
+        <w:rPr>
+          <w:lang w:val="sr-Cyrl-RS"/>
+        </w:rPr>
+        <w:t>, где се изолација постиже на нивоу шеме. У каснијој фази, систем се може проширити тако да сваки сервис има своју сопствену шему или базу, чиме се у потпуности остварује изолација података.</w:t>
+      </w:r>
+      <w:r>
+        <w:rPr>
+          <w:lang w:val="sr-Cyrl-RS"/>
+        </w:rPr>
+        <w:t xml:space="preserve"> Главни разлог такође за избор овог приступа јесте што знатно олакшава развијање огромне апликације у пракси, и довршавање главних функционалности без компликација са подацима. Последњи микросервис је микросервис за вештачли интелигенцију (</w:t>
+      </w:r>
+      <w:r>
+        <w:rPr>
+          <w:lang w:val="sr-Cyrl-RS"/>
+        </w:rPr>
+        <w:t>microservice-AI</w:t>
+      </w:r>
+      <w:r>
+        <w:rPr>
+          <w:lang w:val="sr-Cyrl-RS"/>
+        </w:rPr>
+        <w:t>). О</w:t>
+      </w:r>
+      <w:r>
+        <w:rPr>
+          <w:lang w:val="sr-Cyrl-RS"/>
+        </w:rPr>
+        <w:t>во је специјализовани микросервис који користи машинско учење за анализу историјских и тренутних података о ценама енергије. На основу предиктивних модела, AI Service обезбеђује прогнозе будућих цена и омогућава Trade Service-у да доноси информисане одлуке у реалном времену. У овом систему је коришћен Python за развој AI сервиса, као и библиотеке попут pandas и scikit-learn за припрему података и тренинг модела.</w:t>
+      </w:r>
+      <w:r>
+        <w:rPr>
+          <w:lang w:val="sr-Cyrl-RS"/>
+        </w:rPr>
+        <w:t xml:space="preserve"> Овај сервис константно пружа микросервису податке потребне за управљање батерија, као и њихове појединачне трансакције.</w:t>
       </w:r>
     </w:p>
     <w:p>
       <w:pPr>
         <w:jc w:val="both"/>
         <w:rPr>
-          <w:sz w:val="23"/>
-          <w:szCs w:val="23"/>
-          <w:lang w:val="sr-Cyrl-RS"/>
-        </w:rPr>
-      </w:pPr>
-      <w:r>
-        <w:rPr>
-          <w:sz w:val="23"/>
-          <w:szCs w:val="23"/>
-          <w:lang w:val="sr-Cyrl-RS"/>
-        </w:rPr>
-        <w:t>Пет главних конкретних класа чине:</w:t>
-      </w:r>
-    </w:p>
-    <w:p>
-      <w:pPr>
-        <w:pStyle w:val="ListParagraph"/>
-        <w:numPr>
-          <w:ilvl w:val="0"/>
-          <w:numId w:val="9"/>
-        </w:numPr>
+          <w:lang w:val="sr-Cyrl-RS"/>
+        </w:rPr>
+      </w:pPr>
+      <w:r>
+        <w:rPr>
+          <w:lang w:val="sr-Cyrl-RS"/>
+        </w:rPr>
+        <w:t>Сви сервиси су реализовани као Docker контејнери, што омогућава изолацију окружења, поуздано извршавање и лаку преносивост система између различитих развојних и продукционих окружења. За покретање и повезивање контејнера користи се Docker Compose, што олакшава управљање свим сервисима у једном логичком систему.</w:t>
+      </w:r>
+    </w:p>
+    <w:p>
+      <w:pPr>
         <w:jc w:val="both"/>
         <w:rPr>
-          <w:sz w:val="23"/>
-          <w:szCs w:val="23"/>
-          <w:lang w:val="sr-Cyrl-RS"/>
-        </w:rPr>
-      </w:pPr>
-      <w:r>
-        <w:rPr>
-          <w:b/>
-          <w:bCs/>
-        </w:rPr>
-        <w:t xml:space="preserve">Substation – </w:t>
-      </w:r>
-      <w:r>
-        <w:rPr>
-          <w:lang w:val="sr-Cyrl-RS"/>
-        </w:rPr>
-        <w:t>Трансформаторска станица</w:t>
-      </w:r>
-    </w:p>
-    <w:p>
-      <w:pPr>
-        <w:pStyle w:val="ListParagraph"/>
-        <w:numPr>
-          <w:ilvl w:val="0"/>
-          <w:numId w:val="9"/>
-        </w:numPr>
-        <w:jc w:val="both"/>
-        <w:rPr>
-          <w:sz w:val="23"/>
-          <w:szCs w:val="23"/>
-          <w:lang w:val="sr-Cyrl-RS"/>
-        </w:rPr>
-      </w:pPr>
-      <w:r>
-        <w:rPr>
-          <w:b/>
-          <w:bCs/>
-        </w:rPr>
-        <w:t xml:space="preserve">Disconnector – </w:t>
-      </w:r>
-      <w:r>
-        <w:rPr>
-          <w:lang w:val="sr-Cyrl-RS"/>
-        </w:rPr>
-        <w:t>Уре</w:t>
-      </w:r>
-      <w:r>
-        <w:t>ђај за брзо искључивање електронских система са њиховог примарног извора напајања</w:t>
-      </w:r>
-    </w:p>
-    <w:p>
-      <w:pPr>
-        <w:pStyle w:val="ListParagraph"/>
-        <w:numPr>
-          <w:ilvl w:val="0"/>
-          <w:numId w:val="9"/>
-        </w:numPr>
-        <w:jc w:val="both"/>
-        <w:rPr>
-          <w:sz w:val="23"/>
-          <w:szCs w:val="23"/>
-          <w:lang w:val="sr-Cyrl-RS"/>
-        </w:rPr>
-      </w:pPr>
-      <w:r>
-        <w:rPr>
-          <w:b/>
-          <w:bCs/>
-        </w:rPr>
-        <w:t>Fuse –</w:t>
-      </w:r>
-      <w:r>
-        <w:rPr>
-          <w:b/>
-          <w:bCs/>
-          <w:lang w:val="sr-Cyrl-RS"/>
-        </w:rPr>
-        <w:t xml:space="preserve"> </w:t>
-      </w:r>
-      <w:r>
-        <w:rPr>
-          <w:lang w:val="sr-Cyrl-RS"/>
-        </w:rPr>
-        <w:t>Прекидач који се користи за одвајање електри</w:t>
-      </w:r>
-      <w:r>
-        <w:rPr>
-          <w:lang w:val="sr-Cyrl-RS"/>
-        </w:rPr>
-        <w:t>ч</w:t>
-      </w:r>
-      <w:r>
-        <w:rPr>
-          <w:lang w:val="sr-Cyrl-RS"/>
-        </w:rPr>
-        <w:t>не опреме од електричне мреже</w:t>
-      </w:r>
-    </w:p>
-    <w:p>
-      <w:pPr>
-        <w:pStyle w:val="ListParagraph"/>
-        <w:numPr>
-          <w:ilvl w:val="0"/>
-          <w:numId w:val="9"/>
-        </w:numPr>
-        <w:jc w:val="both"/>
-        <w:rPr>
-          <w:sz w:val="23"/>
-          <w:szCs w:val="23"/>
-          <w:lang w:val="sr-Cyrl-RS"/>
-        </w:rPr>
-      </w:pPr>
-      <w:r>
-        <w:rPr>
-          <w:b/>
-          <w:bCs/>
-        </w:rPr>
-        <w:t>LoadBreakSwitch</w:t>
-      </w:r>
-      <w:r>
-        <w:rPr>
-          <w:b/>
-          <w:bCs/>
-          <w:lang w:val="sr-Cyrl-RS"/>
-        </w:rPr>
-        <w:t xml:space="preserve"> - </w:t>
-      </w:r>
-      <w:r>
-        <w:rPr>
-          <w:lang w:val="sr-Cyrl-RS"/>
-        </w:rPr>
-        <w:t>Прекидач за искључивање дизајниран да обезбеди стварање или прекид одређених струја</w:t>
-      </w:r>
-    </w:p>
-    <w:p>
-      <w:pPr>
-        <w:pStyle w:val="ListParagraph"/>
-        <w:numPr>
-          <w:ilvl w:val="0"/>
-          <w:numId w:val="9"/>
-        </w:numPr>
-        <w:jc w:val="both"/>
-        <w:rPr>
-          <w:sz w:val="23"/>
-          <w:szCs w:val="23"/>
-          <w:lang w:val="sr-Cyrl-RS"/>
-        </w:rPr>
-      </w:pPr>
-      <w:r>
-        <w:rPr>
-          <w:b/>
-          <w:bCs/>
-        </w:rPr>
-        <w:t>Breaker</w:t>
-      </w:r>
-      <w:r>
-        <w:rPr>
-          <w:b/>
-          <w:bCs/>
-          <w:lang w:val="sr-Cyrl-RS"/>
-        </w:rPr>
-        <w:t xml:space="preserve"> </w:t>
-      </w:r>
-      <w:r>
-        <w:rPr>
-          <w:b/>
-          <w:bCs/>
-        </w:rPr>
-        <w:t>-</w:t>
-      </w:r>
-      <w:r>
-        <w:rPr>
-          <w:b/>
-          <w:bCs/>
-          <w:lang w:val="sr-Cyrl-RS"/>
-        </w:rPr>
-        <w:t xml:space="preserve"> </w:t>
-      </w:r>
-      <w:r>
-        <w:rPr>
-          <w:lang w:val="sr-Cyrl-RS"/>
-        </w:rPr>
-        <w:t>Прекидач који је дизајниран да обезбеди укључивање и искључивање у систем.</w:t>
-      </w:r>
-    </w:p>
-    <w:p>
-      <w:pPr>
-        <w:jc w:val="both"/>
-        <w:rPr>
-          <w:lang w:val="sr-Cyrl-RS"/>
-        </w:rPr>
-      </w:pPr>
-      <w:r>
-        <w:rPr>
-          <w:sz w:val="23"/>
-          <w:szCs w:val="23"/>
-          <w:lang w:val="sr-Cyrl-RS"/>
-        </w:rPr>
-        <w:t xml:space="preserve">Ентитети </w:t>
-      </w:r>
-      <w:r>
-        <w:t>Disconnector</w:t>
-      </w:r>
-      <w:r>
-        <w:rPr>
-          <w:lang w:val="sr-Cyrl-RS"/>
-        </w:rPr>
-        <w:t>,</w:t>
-      </w:r>
-      <w:r>
-        <w:t xml:space="preserve"> Fuse</w:t>
-      </w:r>
-      <w:r>
-        <w:rPr>
-          <w:lang w:val="sr-Cyrl-RS"/>
-        </w:rPr>
-        <w:t>,</w:t>
-      </w:r>
-      <w:r>
-        <w:t xml:space="preserve"> LoadBreakSwitch</w:t>
-      </w:r>
-      <w:r>
-        <w:rPr>
-          <w:lang w:val="sr-Cyrl-RS"/>
-        </w:rPr>
-        <w:t xml:space="preserve"> и </w:t>
-      </w:r>
-      <w:r>
-        <w:t>Breaker</w:t>
-      </w:r>
-      <w:r>
-        <w:rPr>
-          <w:lang w:val="sr-Cyrl-RS"/>
-        </w:rPr>
-        <w:t xml:space="preserve"> су деца ентитета </w:t>
-      </w:r>
-      <w:r>
-        <w:t>Switch</w:t>
-      </w:r>
-      <w:r>
-        <w:rPr>
-          <w:lang w:val="sr-Cyrl-RS"/>
-        </w:rPr>
-        <w:t xml:space="preserve"> (прекидач) . Они су груписани као листа прекидача у трансформаторској станици. Ови ентитети ће заједно са станицом чинити суштину овог рада и приказ ће се фокусирати на њих.</w:t>
-      </w:r>
-      <w:r>
-        <w:rPr>
-          <w:lang w:val="sr-Cyrl-RS"/>
-        </w:rPr>
-        <w:br/>
-        <w:t>Поред наведених атрибута самих ентитета додати су, ради функционалности самог рада и следећи атрибути:</w:t>
-      </w:r>
-    </w:p>
-    <w:p>
-      <w:pPr>
-        <w:pStyle w:val="ListParagraph"/>
-        <w:numPr>
-          <w:ilvl w:val="0"/>
-          <w:numId w:val="10"/>
-        </w:numPr>
-        <w:jc w:val="both"/>
-        <w:rPr>
-          <w:sz w:val="23"/>
-          <w:szCs w:val="23"/>
-          <w:lang w:val="sr-Cyrl-RS"/>
-        </w:rPr>
-      </w:pPr>
-      <w:r>
-        <w:rPr>
-          <w:sz w:val="23"/>
-          <w:szCs w:val="23"/>
-        </w:rPr>
-        <w:t xml:space="preserve">Id – </w:t>
-      </w:r>
-      <w:r>
-        <w:rPr>
-          <w:sz w:val="23"/>
-          <w:szCs w:val="23"/>
-          <w:lang w:val="sr-Cyrl-RS"/>
-        </w:rPr>
-        <w:t>јединствени идентификатор</w:t>
-      </w:r>
-    </w:p>
-    <w:p>
-      <w:pPr>
-        <w:pStyle w:val="ListParagraph"/>
-        <w:numPr>
-          <w:ilvl w:val="0"/>
-          <w:numId w:val="10"/>
-        </w:numPr>
-        <w:jc w:val="both"/>
-        <w:rPr>
-          <w:sz w:val="23"/>
-          <w:szCs w:val="23"/>
-          <w:lang w:val="sr-Cyrl-RS"/>
-        </w:rPr>
-      </w:pPr>
-      <w:r>
-        <w:rPr>
-          <w:sz w:val="23"/>
-          <w:szCs w:val="23"/>
-        </w:rPr>
-        <w:t xml:space="preserve">CreateDateTime – </w:t>
-      </w:r>
-      <w:r>
-        <w:rPr>
-          <w:sz w:val="23"/>
-          <w:szCs w:val="23"/>
-          <w:lang w:val="sr-Cyrl-RS"/>
-        </w:rPr>
-        <w:t>време креирања ентитета</w:t>
-      </w:r>
-    </w:p>
-    <w:p>
-      <w:pPr>
-        <w:pStyle w:val="ListParagraph"/>
-        <w:numPr>
-          <w:ilvl w:val="0"/>
-          <w:numId w:val="10"/>
-        </w:numPr>
-        <w:jc w:val="both"/>
-        <w:rPr>
-          <w:sz w:val="23"/>
-          <w:szCs w:val="23"/>
-          <w:lang w:val="sr-Cyrl-RS"/>
-        </w:rPr>
-      </w:pPr>
-      <w:r>
-        <w:rPr>
-          <w:sz w:val="23"/>
-          <w:szCs w:val="23"/>
-        </w:rPr>
-        <w:t xml:space="preserve">LastModifiedDateTime – </w:t>
-      </w:r>
-      <w:r>
-        <w:rPr>
-          <w:sz w:val="23"/>
-          <w:szCs w:val="23"/>
-          <w:lang w:val="sr-Cyrl-RS"/>
-        </w:rPr>
-        <w:t>време брисања ентитета</w:t>
-      </w:r>
-    </w:p>
-    <w:p>
-      <w:pPr>
-        <w:jc w:val="both"/>
-        <w:rPr>
-          <w:sz w:val="23"/>
-          <w:szCs w:val="23"/>
-          <w:lang w:val="sr-Cyrl-RS"/>
-        </w:rPr>
-      </w:pPr>
-      <w:r>
-        <w:rPr>
-          <w:sz w:val="23"/>
-          <w:szCs w:val="23"/>
-          <w:lang w:val="sr-Cyrl-RS"/>
-        </w:rPr>
-        <w:t xml:space="preserve">Напоменуте промене су круцијалне за основне операције које се врше на </w:t>
-      </w:r>
-      <w:r>
-        <w:rPr>
-          <w:sz w:val="23"/>
-          <w:szCs w:val="23"/>
-          <w:lang w:val="sr-Cyrl-RS"/>
-        </w:rPr>
-        <w:t xml:space="preserve">пројектном раду. Јединствени идентификатор служи за праћење података и њихово нумерисање. Омогућује да брисање и модификација ентитета увек буду извршене </w:t>
-      </w:r>
-      <w:r>
-        <w:rPr>
-          <w:sz w:val="23"/>
-          <w:szCs w:val="23"/>
-          <w:lang w:val="sr-Cyrl-RS"/>
-        </w:rPr>
-        <w:t>над</w:t>
-      </w:r>
-      <w:r>
-        <w:rPr>
-          <w:sz w:val="23"/>
-          <w:szCs w:val="23"/>
-          <w:lang w:val="sr-Cyrl-RS"/>
-        </w:rPr>
-        <w:t xml:space="preserve"> траженим објектом. Време креирања и брисања ентитета</w:t>
-      </w:r>
-      <w:r>
-        <w:rPr>
-          <w:sz w:val="23"/>
-          <w:szCs w:val="23"/>
-          <w:lang w:val="sr-Cyrl-RS"/>
-        </w:rPr>
-        <w:t>,</w:t>
-      </w:r>
-      <w:r>
-        <w:rPr>
-          <w:sz w:val="23"/>
-          <w:szCs w:val="23"/>
-          <w:lang w:val="sr-Cyrl-RS"/>
-        </w:rPr>
-        <w:t xml:space="preserve"> поред одређених значаја за </w:t>
-      </w:r>
-      <w:r>
-        <w:rPr>
-          <w:sz w:val="23"/>
-          <w:szCs w:val="23"/>
-          <w:lang w:val="sr-Cyrl-RS"/>
-        </w:rPr>
-        <w:t>задњу страну</w:t>
-      </w:r>
-      <w:r>
-        <w:rPr>
-          <w:sz w:val="23"/>
-          <w:szCs w:val="23"/>
-          <w:lang w:val="en-GB"/>
-        </w:rPr>
-        <w:t>,</w:t>
-      </w:r>
-      <w:r>
-        <w:rPr>
-          <w:sz w:val="23"/>
-          <w:szCs w:val="23"/>
-          <w:lang w:val="sr-Cyrl-RS"/>
-        </w:rPr>
-        <w:t xml:space="preserve"> на </w:t>
-      </w:r>
-      <w:r>
-        <w:rPr>
-          <w:sz w:val="23"/>
-          <w:szCs w:val="23"/>
-          <w:lang w:val="sr-Cyrl-RS"/>
-        </w:rPr>
-        <w:t>предњој</w:t>
-      </w:r>
-      <w:r>
-        <w:rPr>
-          <w:sz w:val="23"/>
-          <w:szCs w:val="23"/>
-          <w:lang w:val="sr-Cyrl-RS"/>
-        </w:rPr>
-        <w:t xml:space="preserve"> страни служе </w:t>
-      </w:r>
-      <w:r>
-        <w:rPr>
-          <w:sz w:val="23"/>
-          <w:szCs w:val="23"/>
-          <w:lang w:val="sr-Cyrl-RS"/>
-        </w:rPr>
-        <w:t>за</w:t>
-      </w:r>
-      <w:r>
-        <w:rPr>
-          <w:sz w:val="23"/>
-          <w:szCs w:val="23"/>
-          <w:lang w:val="sr-Cyrl-RS"/>
-        </w:rPr>
-        <w:t xml:space="preserve"> праћењ</w:t>
-      </w:r>
-      <w:r>
-        <w:rPr>
-          <w:sz w:val="23"/>
-          <w:szCs w:val="23"/>
-          <w:lang w:val="sr-Cyrl-RS"/>
-        </w:rPr>
-        <w:t>е</w:t>
-      </w:r>
-      <w:r>
-        <w:rPr>
-          <w:sz w:val="23"/>
-          <w:szCs w:val="23"/>
-          <w:lang w:val="sr-Cyrl-RS"/>
-        </w:rPr>
-        <w:t xml:space="preserve"> бројног стања и измена чија сама употреба ће бити детаљније објашњена у даљем наставку рада.</w:t>
-      </w:r>
-    </w:p>
-    <w:p>
-      <w:pPr>
-        <w:rPr>
-          <w:sz w:val="23"/>
-          <w:szCs w:val="23"/>
-          <w:lang w:val="sr-Cyrl-RS"/>
-        </w:rPr>
-      </w:pPr>
-    </w:p>
-    <w:p>
-      <w:pPr>
-        <w:rPr>
-          <w:lang w:val="sr-Cyrl-RS"/>
-        </w:rPr>
-      </w:pPr>
-    </w:p>
-    <w:p>
-      <w:pPr>
-        <w:rPr>
-          <w:lang w:val="sr-Cyrl-RS"/>
-        </w:rPr>
-      </w:pPr>
-    </w:p>
-    <w:p>
-      <w:pPr>
-        <w:rPr>
-          <w:lang w:val="sr-Cyrl-RS"/>
-        </w:rPr>
-      </w:pPr>
-    </w:p>
-    <w:p>
-      <w:pPr>
-        <w:rPr>
-          <w:lang w:val="sr-Cyrl-RS"/>
-        </w:rPr>
-      </w:pPr>
-    </w:p>
-    <w:p>
-      <w:pPr>
-        <w:rPr>
-          <w:lang w:val="sr-Cyrl-RS"/>
-        </w:rPr>
-      </w:pPr>
-    </w:p>
-    <w:p>
-      <w:pPr>
-        <w:pStyle w:val="Heading1"/>
-        <w:rPr>
-          <w:sz w:val="32"/>
-          <w:szCs w:val="32"/>
-        </w:rPr>
-      </w:pPr>
+          <w:lang w:val="sr-Cyrl-RS"/>
+        </w:rPr>
+      </w:pPr>
+      <w:r>
+        <w:rPr>
+          <w:lang w:val="sr-Cyrl-RS"/>
+        </w:rPr>
+        <w:lastRenderedPageBreak/>
+        <w:t>Комуникација између сервиса се остварује преко RESTful API-ја, што омогућава интероперабилност и једноставну интеграцију нових сервиса или функционалности у систему. Сваки сервис може бити реализован у различитим технологијама, што пружа велику флексибилност и омогућава да се за сваки тип задатка користи најбоља доступна технологија.</w:t>
+      </w:r>
     </w:p>
     <w:p>
       <w:pPr>
@@ -12353,260 +12568,45 @@
           <w:lang w:val="sr-Cyrl-RS"/>
         </w:rPr>
       </w:pPr>
-      <w:bookmarkStart w:id="18" w:name="_Toc208316276"/>
       <w:r>
         <w:rPr>
           <w:sz w:val="36"/>
           <w:szCs w:val="36"/>
-        </w:rPr>
-        <w:t xml:space="preserve">5. Backend </w:t>
-      </w:r>
+          <w:lang w:val="sr-Cyrl-RS"/>
+        </w:rPr>
+        <w:br/>
+      </w:r>
+      <w:bookmarkStart w:id="18" w:name="_Toc208316277"/>
       <w:r>
         <w:rPr>
           <w:sz w:val="36"/>
           <w:szCs w:val="36"/>
           <w:lang w:val="sr-Cyrl-RS"/>
         </w:rPr>
-        <w:t>функционалност</w:t>
-      </w:r>
-      <w:bookmarkEnd w:id="18"/>
-    </w:p>
-    <w:p>
-      <w:pPr>
-        <w:rPr>
-          <w:lang w:val="sr-Cyrl-RS"/>
-        </w:rPr>
-      </w:pPr>
-    </w:p>
-    <w:p>
-      <w:pPr>
-        <w:rPr>
-          <w:lang w:val="sr-Cyrl-RS"/>
-        </w:rPr>
-      </w:pPr>
-      <w:r>
-        <w:rPr>
-          <w:lang w:val="sr-Cyrl-RS"/>
-        </w:rPr>
-        <w:tab/>
-        <w:t xml:space="preserve">Пројектни рад, као што је већ споменуто, ослања се на већ израђену </w:t>
-      </w:r>
-      <w:r>
-        <w:rPr>
-          <w:lang w:val="sr-Cyrl-RS"/>
-        </w:rPr>
-        <w:t>задњу</w:t>
-      </w:r>
-      <w:r>
-        <w:rPr>
-          <w:lang w:val="sr-Cyrl-RS"/>
-        </w:rPr>
-        <w:t xml:space="preserve"> страну</w:t>
-      </w:r>
-      <w:r>
-        <w:rPr>
-          <w:lang w:val="sr-Cyrl-RS"/>
-        </w:rPr>
-        <w:t xml:space="preserve"> (</w:t>
-      </w:r>
-      <w:r>
-        <w:t>backend</w:t>
-      </w:r>
-      <w:r>
-        <w:rPr>
-          <w:lang w:val="sr-Cyrl-RS"/>
-        </w:rPr>
-        <w:t>)</w:t>
-      </w:r>
-      <w:r>
-        <w:rPr>
-          <w:lang w:val="sr-Cyrl-RS"/>
-        </w:rPr>
-        <w:t xml:space="preserve">. У следећем пасусу биће укратко објашњена софтверска структура те стране. </w:t>
-      </w:r>
-    </w:p>
-    <w:p>
-      <w:pPr>
-        <w:jc w:val="center"/>
-        <w:rPr>
-          <w:lang w:val="sr-Cyrl-RS"/>
-        </w:rPr>
-      </w:pPr>
-      <w:r>
-        <w:rPr>
-          <w:noProof/>
-        </w:rPr>
-        <w:drawing>
-          <wp:inline distT="0" distB="0" distL="0" distR="0" wp14:anchorId="3ECE48AC" wp14:editId="5581745B">
-            <wp:extent cx="4953000" cy="4610100"/>
-            <wp:effectExtent l="0" t="0" r="0" b="0"/>
-            <wp:docPr id="8" name="Picture 8"/>
-            <wp:cNvGraphicFramePr>
-              <a:graphicFrameLocks xmlns:a="http://schemas.openxmlformats.org/drawingml/2006/main" noChangeAspect="1"/>
-            </wp:cNvGraphicFramePr>
-            <a:graphic xmlns:a="http://schemas.openxmlformats.org/drawingml/2006/main">
-              <a:graphicData uri="http://schemas.openxmlformats.org/drawingml/2006/picture">
-                <pic:pic xmlns:pic="http://schemas.openxmlformats.org/drawingml/2006/picture">
-                  <pic:nvPicPr>
-                    <pic:cNvPr id="0" name="Picture 7"/>
-                    <pic:cNvPicPr>
-                      <a:picLocks noChangeAspect="1" noChangeArrowheads="1"/>
-                    </pic:cNvPicPr>
-                  </pic:nvPicPr>
-                  <pic:blipFill>
-                    <a:blip r:embed="rId27">
-                      <a:extLst>
-                        <a:ext uri="{28A0092B-C50C-407E-A947-70E740481C1C}">
-                          <a14:useLocalDpi xmlns:a14="http://schemas.microsoft.com/office/drawing/2010/main" val="0"/>
-                        </a:ext>
-                      </a:extLst>
-                    </a:blip>
-                    <a:srcRect/>
-                    <a:stretch>
-                      <a:fillRect/>
-                    </a:stretch>
-                  </pic:blipFill>
-                  <pic:spPr bwMode="auto">
-                    <a:xfrm>
-                      <a:off x="0" y="0"/>
-                      <a:ext cx="4953000" cy="4610100"/>
-                    </a:xfrm>
-                    <a:prstGeom prst="rect">
-                      <a:avLst/>
-                    </a:prstGeom>
-                    <a:noFill/>
-                    <a:ln>
-                      <a:noFill/>
-                    </a:ln>
-                  </pic:spPr>
-                </pic:pic>
-              </a:graphicData>
-            </a:graphic>
-          </wp:inline>
-        </w:drawing>
-      </w:r>
-      <w:r>
-        <w:br/>
-        <w:t xml:space="preserve">Slika 6 – </w:t>
-      </w:r>
-      <w:r>
-        <w:rPr>
-          <w:lang w:val="sr-Cyrl-RS"/>
-        </w:rPr>
-        <w:t>Архитектура решења</w:t>
-      </w:r>
-    </w:p>
-    <w:p>
-      <w:pPr>
-        <w:jc w:val="center"/>
-        <w:rPr>
-          <w:lang w:val="sr-Cyrl-RS"/>
-        </w:rPr>
-      </w:pPr>
-    </w:p>
-    <w:p>
-      <w:pPr>
-        <w:jc w:val="both"/>
-        <w:rPr>
-          <w:sz w:val="23"/>
-          <w:szCs w:val="23"/>
-          <w:lang w:val="sr-Cyrl-RS"/>
-        </w:rPr>
-      </w:pPr>
-      <w:r>
-        <w:rPr>
-          <w:lang w:val="sr-Cyrl-RS"/>
-        </w:rPr>
-        <w:t xml:space="preserve">На слици је приказана структура наше </w:t>
-      </w:r>
-      <w:r>
-        <w:rPr>
-          <w:lang w:val="sr-Cyrl-RS"/>
-        </w:rPr>
-        <w:t>веб апликације. Искоришћена је већ објашњена, вишеслојна архитектура софтвера. Подељена је у слојеве ради олакшаног рада над сложеном апликацијом. Компоненте унута</w:t>
-      </w:r>
-      <w:r>
-        <w:rPr>
-          <w:lang w:val="sr-Cyrl-RS"/>
-        </w:rPr>
-        <w:t>р</w:t>
-      </w:r>
-      <w:r>
-        <w:rPr>
-          <w:lang w:val="sr-Cyrl-RS"/>
-        </w:rPr>
-        <w:t xml:space="preserve"> одређеног слоја комуницирају само са суседним слојевима помоћу добро дефинисаних интерфејса (</w:t>
-      </w:r>
-      <w:r>
-        <w:t>Dependency</w:t>
-      </w:r>
-      <w:r>
-        <w:rPr>
-          <w:i/>
-          <w:iCs/>
-        </w:rPr>
-        <w:t xml:space="preserve"> </w:t>
-      </w:r>
-      <w:r>
-        <w:t>injection</w:t>
-      </w:r>
-      <w:r>
-        <w:rPr>
-          <w:lang w:val="sr-Cyrl-RS"/>
-        </w:rPr>
-        <w:t xml:space="preserve">). Све компоненте у заједници обезбеђују главну функционалност, док се свака компонента бави логиком која се само односи на тај слој. Презентациони слој бави се приказом података корисницима и биће детаљније објашњен у наставку рада. Сервисни слој комуницира са слојем за приступ бази који је одговоран за извршавање потрених упита над базом. База се креира на основу </w:t>
-      </w:r>
-      <w:r>
-        <w:t>Domain dll-a</w:t>
-      </w:r>
-      <w:r>
-        <w:rPr>
-          <w:lang w:val="sr-Cyrl-RS"/>
-        </w:rPr>
-        <w:t xml:space="preserve">, који садржи модел података, и </w:t>
-      </w:r>
-      <w:r>
-        <w:rPr>
-          <w:sz w:val="23"/>
-          <w:szCs w:val="23"/>
-        </w:rPr>
-        <w:t>Context dll-a</w:t>
-      </w:r>
-      <w:r>
-        <w:rPr>
-          <w:sz w:val="23"/>
-          <w:szCs w:val="23"/>
-          <w:lang w:val="sr-Cyrl-RS"/>
-        </w:rPr>
-        <w:t xml:space="preserve"> који користи тај модел података за креирање миграција и омогућава приступ бази података слоју за приступ подацима. </w:t>
-      </w:r>
-    </w:p>
-    <w:p>
-      <w:pPr>
-        <w:pStyle w:val="Heading1"/>
+        <w:t xml:space="preserve">6. </w:t>
+      </w:r>
+      <w:r>
         <w:rPr>
           <w:sz w:val="36"/>
           <w:szCs w:val="36"/>
           <w:lang w:val="sr-Cyrl-RS"/>
         </w:rPr>
-      </w:pPr>
+        <w:t xml:space="preserve"> </w:t>
+      </w:r>
       <w:r>
         <w:rPr>
           <w:sz w:val="36"/>
           <w:szCs w:val="36"/>
           <w:lang w:val="sr-Cyrl-RS"/>
         </w:rPr>
-        <w:lastRenderedPageBreak/>
-        <w:br/>
-      </w:r>
-      <w:bookmarkStart w:id="19" w:name="_Toc208316277"/>
+        <w:t xml:space="preserve">Архитектура </w:t>
+      </w:r>
       <w:r>
         <w:rPr>
           <w:sz w:val="36"/>
           <w:szCs w:val="36"/>
-          <w:lang w:val="sr-Cyrl-RS"/>
-        </w:rPr>
-        <w:t xml:space="preserve">6. </w:t>
+        </w:rPr>
+        <w:t>frontend</w:t>
       </w:r>
       <w:r>
         <w:rPr>
@@ -12614,385 +12614,38 @@
           <w:szCs w:val="36"/>
           <w:lang w:val="sr-Cyrl-RS"/>
         </w:rPr>
-        <w:t xml:space="preserve"> </w:t>
-      </w:r>
+        <w:t xml:space="preserve"> апликације</w:t>
+      </w:r>
+      <w:bookmarkEnd w:id="18"/>
       <w:r>
         <w:rPr>
           <w:sz w:val="36"/>
           <w:szCs w:val="36"/>
           <w:lang w:val="sr-Cyrl-RS"/>
         </w:rPr>
-        <w:t xml:space="preserve">Архитектура </w:t>
-      </w:r>
-      <w:r>
-        <w:rPr>
-          <w:sz w:val="36"/>
-          <w:szCs w:val="36"/>
-        </w:rPr>
-        <w:t>frontend</w:t>
-      </w:r>
-      <w:r>
-        <w:rPr>
-          <w:sz w:val="36"/>
-          <w:szCs w:val="36"/>
-          <w:lang w:val="sr-Cyrl-RS"/>
-        </w:rPr>
-        <w:t xml:space="preserve"> апликације</w:t>
-      </w:r>
+        <w:t xml:space="preserve"> </w:t>
+      </w:r>
+    </w:p>
+    <w:p>
+      <w:pPr>
+        <w:rPr>
+          <w:lang w:val="sr-Cyrl-RS"/>
+        </w:rPr>
+      </w:pPr>
+    </w:p>
+    <w:p>
+      <w:pPr>
+        <w:jc w:val="both"/>
+      </w:pPr>
+      <w:r>
+        <w:rPr>
+          <w:lang w:val="sr-Cyrl-RS"/>
+        </w:rPr>
+        <w:tab/>
+        <w:t>Предња страна апликације је подељена у више компоненти. Компоненте су подељене на два типа,</w:t>
+      </w:r>
+      <w:bookmarkStart w:id="19" w:name="_GoBack"/>
       <w:bookmarkEnd w:id="19"/>
-      <w:r>
-        <w:rPr>
-          <w:sz w:val="36"/>
-          <w:szCs w:val="36"/>
-          <w:lang w:val="sr-Cyrl-RS"/>
-        </w:rPr>
-        <w:t xml:space="preserve"> </w:t>
-      </w:r>
-    </w:p>
-    <w:p>
-      <w:pPr>
-        <w:rPr>
-          <w:lang w:val="sr-Cyrl-RS"/>
-        </w:rPr>
-      </w:pPr>
-    </w:p>
-    <w:p>
-      <w:pPr>
-        <w:jc w:val="both"/>
-        <w:rPr>
-          <w:lang w:val="sr-Cyrl-RS"/>
-        </w:rPr>
-      </w:pPr>
-      <w:r>
-        <w:rPr>
-          <w:lang w:val="sr-Cyrl-RS"/>
-        </w:rPr>
-        <w:tab/>
-        <w:t>Предња страна апликације је подељена у више компоненти. Компоненте су подељене на два типа, оне које су стално приказане и оне које се мењају у зависности од корис</w:t>
-      </w:r>
-      <w:r>
-        <w:rPr>
-          <w:lang w:val="sr-Cyrl-RS"/>
-        </w:rPr>
-        <w:t>н</w:t>
-      </w:r>
-      <w:r>
-        <w:rPr>
-          <w:lang w:val="sr-Cyrl-RS"/>
-        </w:rPr>
-        <w:t>ичке акције.</w:t>
-      </w:r>
-      <w:r>
-        <w:rPr>
-          <w:lang w:val="sr-Cyrl-RS"/>
-        </w:rPr>
-        <w:t xml:space="preserve"> Све компоненте су прављене узимајући у обзир разне димензије екрана. С циљем да корисник има једнако добро видљив приказ и на екрану мобилног телефона, али и на великом екрану персоналног рачунара.</w:t>
-      </w:r>
-      <w:r>
-        <w:rPr>
-          <w:lang w:val="sr-Cyrl-RS"/>
-        </w:rPr>
-        <w:t xml:space="preserve"> </w:t>
-      </w:r>
-      <w:r>
-        <w:rPr>
-          <w:lang w:val="sr-Cyrl-RS"/>
-        </w:rPr>
-        <w:t>Свака компонента се састоји из одређених стања (</w:t>
-      </w:r>
-      <w:r>
-        <w:t>state</w:t>
-      </w:r>
-      <w:r>
-        <w:rPr>
-          <w:lang w:val="sr-Cyrl-RS"/>
-        </w:rPr>
-        <w:t>), за извршавање одређених акција које су јединствене за њу. Такође, свака компонента користи</w:t>
-      </w:r>
-      <w:r>
-        <w:rPr>
-          <w:lang w:val="en-GB"/>
-        </w:rPr>
-        <w:t xml:space="preserve"> </w:t>
-      </w:r>
-      <w:r>
-        <w:rPr>
-          <w:lang w:val="sr-Cyrl-RS"/>
-        </w:rPr>
-        <w:t xml:space="preserve">хукове </w:t>
-      </w:r>
-      <w:r>
-        <w:t>(React Hooks)</w:t>
-      </w:r>
-      <w:r>
-        <w:rPr>
-          <w:i/>
-          <w:iCs/>
-        </w:rPr>
-        <w:t xml:space="preserve"> </w:t>
-      </w:r>
-      <w:r>
-        <w:rPr>
-          <w:lang w:val="sr-Cyrl-RS"/>
-        </w:rPr>
-        <w:t xml:space="preserve">за преузимање стања из </w:t>
-      </w:r>
-      <w:r>
-        <w:t xml:space="preserve">Redux </w:t>
-      </w:r>
-      <w:r>
-        <w:rPr>
-          <w:lang w:val="sr-Cyrl-RS"/>
-        </w:rPr>
-        <w:t xml:space="preserve">складишта. </w:t>
-      </w:r>
-      <w:r>
-        <w:t>Redux</w:t>
-      </w:r>
-      <w:r>
-        <w:rPr>
-          <w:lang w:val="sr-Cyrl-RS"/>
-        </w:rPr>
-        <w:t xml:space="preserve"> ажурира стања апликације користећи </w:t>
-      </w:r>
-      <w:r>
-        <w:t>Actions</w:t>
-      </w:r>
-      <w:r>
-        <w:rPr>
-          <w:lang w:val="sr-Cyrl-RS"/>
-        </w:rPr>
-        <w:t xml:space="preserve">, што представља добављање података из базе, користећи пакет </w:t>
-      </w:r>
-      <w:r>
-        <w:t>Axios.</w:t>
-      </w:r>
-    </w:p>
-    <w:p>
-      <w:pPr>
-        <w:jc w:val="both"/>
-        <w:rPr>
-          <w:lang w:val="sr-Cyrl-RS"/>
-        </w:rPr>
-      </w:pPr>
-      <w:r>
-        <w:rPr>
-          <w:lang w:val="sr-Cyrl-RS"/>
-        </w:rPr>
-        <w:t>Хукови (</w:t>
-      </w:r>
-      <w:r>
-        <w:t>React Hooks</w:t>
-      </w:r>
-      <w:r>
-        <w:rPr>
-          <w:lang w:val="sr-Cyrl-RS"/>
-        </w:rPr>
-        <w:t xml:space="preserve">) омогућавају коришћење стања и других ствари у </w:t>
-      </w:r>
-      <w:r>
-        <w:t>React</w:t>
-      </w:r>
-      <w:r>
-        <w:rPr>
-          <w:lang w:val="sr-Cyrl-RS"/>
-        </w:rPr>
-        <w:t xml:space="preserve">-у, без писања засебних класа. Такође, на врло моћан и експресиван начин омогућују поново искоришћавање функциоланости између компоненти. </w:t>
-      </w:r>
-    </w:p>
-    <w:p>
-      <w:pPr>
-        <w:jc w:val="both"/>
-        <w:rPr>
-          <w:lang w:val="sr-Cyrl-RS"/>
-        </w:rPr>
-      </w:pPr>
-      <w:r>
-        <w:t>Redux</w:t>
-      </w:r>
-      <w:r>
-        <w:rPr>
-          <w:lang w:val="sr-Cyrl-RS"/>
-        </w:rPr>
-        <w:t xml:space="preserve"> складиште представља једноставан и практичан начин за чување стања унутар апликације.</w:t>
-      </w:r>
-    </w:p>
-    <w:p>
-      <w:pPr>
-        <w:jc w:val="both"/>
-      </w:pPr>
-      <w:r>
-        <w:t>Axios</w:t>
-      </w:r>
-      <w:r>
-        <w:rPr>
-          <w:lang w:val="sr-Cyrl-RS"/>
-        </w:rPr>
-        <w:t xml:space="preserve"> је једноставан </w:t>
-      </w:r>
-      <w:r>
-        <w:t>HTTP</w:t>
-      </w:r>
-      <w:r>
-        <w:rPr>
-          <w:lang w:val="sr-Cyrl-RS"/>
-        </w:rPr>
-        <w:t xml:space="preserve"> клијент за веб прегледник заснован на систему</w:t>
-      </w:r>
-      <w:r>
-        <w:rPr>
-          <w:lang w:val="sr-Cyrl-RS"/>
-        </w:rPr>
-        <w:t xml:space="preserve"> </w:t>
-      </w:r>
-      <w:r>
-        <w:rPr>
-          <w:lang w:val="sr-Cyrl-RS"/>
-        </w:rPr>
-        <w:t>„обећања“</w:t>
-      </w:r>
-      <w:r>
-        <w:rPr>
-          <w:lang w:val="sr-Cyrl-RS"/>
-        </w:rPr>
-        <w:t xml:space="preserve"> </w:t>
-      </w:r>
-      <w:r>
-        <w:rPr>
-          <w:lang w:val="sr-Cyrl-RS"/>
-        </w:rPr>
-        <w:t>(</w:t>
-      </w:r>
-      <w:r>
-        <w:t>promise based</w:t>
-      </w:r>
-      <w:r>
-        <w:rPr>
-          <w:lang w:val="sr-Cyrl-RS"/>
-        </w:rPr>
-        <w:t xml:space="preserve">). Пружа веома компактну и једноставну библиотеку са проширивим интерфејсом. </w:t>
-      </w:r>
-    </w:p>
-    <w:p>
-      <w:pPr>
-        <w:jc w:val="both"/>
-        <w:rPr>
-          <w:lang w:val="sr-Cyrl-RS"/>
-        </w:rPr>
-      </w:pPr>
-      <w:r>
-        <w:rPr>
-          <w:lang w:val="sr-Cyrl-RS"/>
-        </w:rPr>
-        <w:t>Поред овога, апликација је писана на начин да неке ствари добавља из локалног складишта (</w:t>
-      </w:r>
-      <w:r>
-        <w:rPr>
-          <w:lang w:val="en-GB"/>
-        </w:rPr>
-        <w:t>local storage</w:t>
-      </w:r>
-      <w:r>
-        <w:rPr>
-          <w:lang w:val="sr-Cyrl-RS"/>
-        </w:rPr>
-        <w:t xml:space="preserve">), користећи пакет </w:t>
-      </w:r>
-      <w:r>
-        <w:t>Redux Persist</w:t>
-      </w:r>
-      <w:r>
-        <w:rPr>
-          <w:lang w:val="sr-Cyrl-RS"/>
-        </w:rPr>
-        <w:t xml:space="preserve">. </w:t>
-      </w:r>
-      <w:r>
-        <w:rPr>
-          <w:lang w:val="sr-Cyrl-RS"/>
-        </w:rPr>
-        <w:t xml:space="preserve">Пример </w:t>
-      </w:r>
-      <w:r>
-        <w:rPr>
-          <w:lang w:val="sr-Cyrl-RS"/>
-        </w:rPr>
-        <w:t>функционалности ко</w:t>
-      </w:r>
-      <w:r>
-        <w:rPr>
-          <w:lang w:val="sr-Cyrl-RS"/>
-        </w:rPr>
-        <w:t xml:space="preserve">ја је </w:t>
-      </w:r>
-      <w:r>
-        <w:rPr>
-          <w:lang w:val="sr-Cyrl-RS"/>
-        </w:rPr>
-        <w:t>остварен</w:t>
-      </w:r>
-      <w:r>
-        <w:rPr>
-          <w:lang w:val="sr-Cyrl-RS"/>
-        </w:rPr>
-        <w:t>а</w:t>
-      </w:r>
-      <w:r>
-        <w:rPr>
-          <w:lang w:val="sr-Cyrl-RS"/>
-        </w:rPr>
-        <w:t xml:space="preserve"> на овај начин </w:t>
-      </w:r>
-      <w:r>
-        <w:rPr>
-          <w:lang w:val="sr-Cyrl-RS"/>
-        </w:rPr>
-        <w:t>је</w:t>
-      </w:r>
-      <w:r>
-        <w:rPr>
-          <w:lang w:val="sr-Cyrl-RS"/>
-        </w:rPr>
-        <w:t xml:space="preserve"> „</w:t>
-      </w:r>
-      <w:r>
-        <w:t>to-do</w:t>
-      </w:r>
-      <w:r>
-        <w:rPr>
-          <w:lang w:val="sr-Cyrl-RS"/>
-        </w:rPr>
-        <w:t>“ листа</w:t>
-      </w:r>
-      <w:r>
-        <w:rPr>
-          <w:lang w:val="sr-Cyrl-RS"/>
-        </w:rPr>
-        <w:t>.</w:t>
-      </w:r>
-    </w:p>
-    <w:p>
-      <w:pPr>
-        <w:jc w:val="both"/>
-      </w:pPr>
-      <w:r>
-        <w:t>Redux Persist</w:t>
-      </w:r>
-      <w:r>
-        <w:rPr>
-          <w:lang w:val="sr-Cyrl-RS"/>
-        </w:rPr>
-        <w:t xml:space="preserve"> је библиотека која омогућава чување </w:t>
-      </w:r>
-      <w:r>
-        <w:t xml:space="preserve">Redux store-a </w:t>
-      </w:r>
-      <w:r>
-        <w:rPr>
-          <w:lang w:val="sr-Cyrl-RS"/>
-        </w:rPr>
-        <w:t>у локалном складишту апликације.</w:t>
-      </w:r>
     </w:p>
     <w:p>
       <w:pPr>
@@ -13023,7 +12676,7 @@
                     </pic:cNvPicPr>
                   </pic:nvPicPr>
                   <pic:blipFill>
-                    <a:blip r:embed="rId28">
+                    <a:blip r:embed="rId27">
                       <a:extLst>
                         <a:ext uri="{28A0092B-C50C-407E-A947-70E740481C1C}">
                           <a14:useLocalDpi xmlns:a14="http://schemas.microsoft.com/office/drawing/2010/main" val="0"/>
@@ -13095,7 +12748,6 @@
       </w:pPr>
       <w:bookmarkStart w:id="20" w:name="_Toc208316278"/>
       <w:r>
-        <w:lastRenderedPageBreak/>
         <w:t xml:space="preserve">6.1 </w:t>
       </w:r>
       <w:r>
@@ -13224,7 +12876,7 @@
                     </pic:cNvPicPr>
                   </pic:nvPicPr>
                   <pic:blipFill>
-                    <a:blip r:embed="rId29">
+                    <a:blip r:embed="rId28">
                       <a:extLst>
                         <a:ext uri="{28A0092B-C50C-407E-A947-70E740481C1C}">
                           <a14:useLocalDpi xmlns:a14="http://schemas.microsoft.com/office/drawing/2010/main" val="0"/>
@@ -13275,6 +12927,7 @@
         <w:rPr>
           <w:lang w:val="sr-Cyrl-RS"/>
         </w:rPr>
+        <w:lastRenderedPageBreak/>
         <w:t>6.2 Компоненте променљивог приказа</w:t>
       </w:r>
       <w:bookmarkEnd w:id="21"/>
@@ -13329,7 +12982,7 @@
                     </pic:cNvPicPr>
                   </pic:nvPicPr>
                   <pic:blipFill>
-                    <a:blip r:embed="rId30">
+                    <a:blip r:embed="rId29">
                       <a:extLst>
                         <a:ext uri="{28A0092B-C50C-407E-A947-70E740481C1C}">
                           <a14:useLocalDpi xmlns:a14="http://schemas.microsoft.com/office/drawing/2010/main" val="0"/>
@@ -13521,6 +13174,7 @@
         <w:rPr>
           <w:noProof/>
         </w:rPr>
+        <w:lastRenderedPageBreak/>
         <w:drawing>
           <wp:inline distT="0" distB="0" distL="0" distR="0" wp14:anchorId="7FD4FCA6" wp14:editId="58517922">
             <wp:extent cx="5931535" cy="3371215"/>
@@ -13539,7 +13193,7 @@
                     </pic:cNvPicPr>
                   </pic:nvPicPr>
                   <pic:blipFill>
-                    <a:blip r:embed="rId31" cstate="print">
+                    <a:blip r:embed="rId30" cstate="print">
                       <a:extLst>
                         <a:ext uri="{28A0092B-C50C-407E-A947-70E740481C1C}">
                           <a14:useLocalDpi xmlns:a14="http://schemas.microsoft.com/office/drawing/2010/main" val="0"/>
@@ -13645,7 +13299,6 @@
         <w:rPr>
           <w:lang w:val="sr-Cyrl-RS"/>
         </w:rPr>
-        <w:lastRenderedPageBreak/>
         <w:t xml:space="preserve">7.2 </w:t>
       </w:r>
       <w:r>
@@ -13703,6 +13356,7 @@
         <w:rPr>
           <w:noProof/>
         </w:rPr>
+        <w:lastRenderedPageBreak/>
         <w:drawing>
           <wp:inline distT="0" distB="0" distL="0" distR="0" wp14:anchorId="6E1B2E9C" wp14:editId="61056CB5">
             <wp:extent cx="5144494" cy="3105726"/>
@@ -13721,7 +13375,7 @@
                     </pic:cNvPicPr>
                   </pic:nvPicPr>
                   <pic:blipFill>
-                    <a:blip r:embed="rId32">
+                    <a:blip r:embed="rId31">
                       <a:extLst>
                         <a:ext uri="{28A0092B-C50C-407E-A947-70E740481C1C}">
                           <a14:useLocalDpi xmlns:a14="http://schemas.microsoft.com/office/drawing/2010/main" val="0"/>
@@ -13803,7 +13457,7 @@
                     </pic:cNvPicPr>
                   </pic:nvPicPr>
                   <pic:blipFill>
-                    <a:blip r:embed="rId33">
+                    <a:blip r:embed="rId32">
                       <a:extLst>
                         <a:ext uri="{28A0092B-C50C-407E-A947-70E740481C1C}">
                           <a14:useLocalDpi xmlns:a14="http://schemas.microsoft.com/office/drawing/2010/main" val="0"/>
@@ -13872,36 +13526,36 @@
         <w:br/>
       </w:r>
       <w:r>
+        <w:t>C</w:t>
+      </w:r>
+      <w:r>
+        <w:t>heckbox</w:t>
+      </w:r>
+      <w:r>
+        <w:t xml:space="preserve"> </w:t>
+      </w:r>
+      <w:r>
+        <w:rPr>
+          <w:lang w:val="sr-Cyrl-RS"/>
+        </w:rPr>
+        <w:t xml:space="preserve">на левој страни </w:t>
+      </w:r>
+      <w:r>
+        <w:rPr>
+          <w:lang w:val="sr-Cyrl-RS"/>
+        </w:rPr>
+        <w:t>навбара омогућава ову радњу (Слика 13), једноставним кликом на пољем са именом жељеног тржишта.</w:t>
+      </w:r>
+    </w:p>
+    <w:p>
+      <w:pPr>
+        <w:jc w:val="center"/>
+      </w:pPr>
+      <w:r>
+        <w:rPr>
+          <w:noProof/>
+        </w:rPr>
         <w:lastRenderedPageBreak/>
-        <w:t>C</w:t>
-      </w:r>
-      <w:r>
-        <w:t>heckbox</w:t>
-      </w:r>
-      <w:r>
-        <w:t xml:space="preserve"> </w:t>
-      </w:r>
-      <w:r>
-        <w:rPr>
-          <w:lang w:val="sr-Cyrl-RS"/>
-        </w:rPr>
-        <w:t xml:space="preserve">на левој страни </w:t>
-      </w:r>
-      <w:r>
-        <w:rPr>
-          <w:lang w:val="sr-Cyrl-RS"/>
-        </w:rPr>
-        <w:t>навбара омогућава ову радњу (Слика 13), једноставним кликом на пољем са именом жељеног тржишта.</w:t>
-      </w:r>
-    </w:p>
-    <w:p>
-      <w:pPr>
-        <w:jc w:val="center"/>
-      </w:pPr>
-      <w:r>
-        <w:rPr>
-          <w:noProof/>
-        </w:rPr>
         <w:drawing>
           <wp:inline distT="0" distB="0" distL="0" distR="0" wp14:anchorId="47B0F0D6" wp14:editId="485F540E">
             <wp:extent cx="5895541" cy="2631882"/>
@@ -13920,7 +13574,7 @@
                     </pic:cNvPicPr>
                   </pic:nvPicPr>
                   <pic:blipFill>
-                    <a:blip r:embed="rId34" cstate="print">
+                    <a:blip r:embed="rId33" cstate="print">
                       <a:extLst>
                         <a:ext uri="{28A0092B-C50C-407E-A947-70E740481C1C}">
                           <a14:useLocalDpi xmlns:a14="http://schemas.microsoft.com/office/drawing/2010/main" val="0"/>
@@ -14089,7 +13743,7 @@
                     </pic:cNvPicPr>
                   </pic:nvPicPr>
                   <pic:blipFill>
-                    <a:blip r:embed="rId35">
+                    <a:blip r:embed="rId34">
                       <a:extLst>
                         <a:ext uri="{28A0092B-C50C-407E-A947-70E740481C1C}">
                           <a14:useLocalDpi xmlns:a14="http://schemas.microsoft.com/office/drawing/2010/main" val="0"/>
@@ -14206,7 +13860,7 @@
                     </pic:cNvPicPr>
                   </pic:nvPicPr>
                   <pic:blipFill>
-                    <a:blip r:embed="rId36" cstate="print">
+                    <a:blip r:embed="rId35" cstate="print">
                       <a:extLst>
                         <a:ext uri="{28A0092B-C50C-407E-A947-70E740481C1C}">
                           <a14:useLocalDpi xmlns:a14="http://schemas.microsoft.com/office/drawing/2010/main" val="0"/>
@@ -14306,7 +13960,7 @@
                     </pic:cNvPicPr>
                   </pic:nvPicPr>
                   <pic:blipFill>
-                    <a:blip r:embed="rId37" cstate="print">
+                    <a:blip r:embed="rId36" cstate="print">
                       <a:extLst>
                         <a:ext uri="{28A0092B-C50C-407E-A947-70E740481C1C}">
                           <a14:useLocalDpi xmlns:a14="http://schemas.microsoft.com/office/drawing/2010/main" val="0"/>
@@ -14483,7 +14137,7 @@
                     </pic:cNvPicPr>
                   </pic:nvPicPr>
                   <pic:blipFill>
-                    <a:blip r:embed="rId38">
+                    <a:blip r:embed="rId37">
                       <a:extLst>
                         <a:ext uri="{28A0092B-C50C-407E-A947-70E740481C1C}">
                           <a14:useLocalDpi xmlns:a14="http://schemas.microsoft.com/office/drawing/2010/main" val="0"/>
@@ -14567,7 +14221,7 @@
                     </pic:cNvPicPr>
                   </pic:nvPicPr>
                   <pic:blipFill>
-                    <a:blip r:embed="rId39" cstate="print">
+                    <a:blip r:embed="rId38" cstate="print">
                       <a:extLst>
                         <a:ext uri="{28A0092B-C50C-407E-A947-70E740481C1C}">
                           <a14:useLocalDpi xmlns:a14="http://schemas.microsoft.com/office/drawing/2010/main" val="0"/>
@@ -14809,7 +14463,7 @@
                     </pic:cNvPicPr>
                   </pic:nvPicPr>
                   <pic:blipFill>
-                    <a:blip r:embed="rId40" cstate="print">
+                    <a:blip r:embed="rId39" cstate="print">
                       <a:extLst>
                         <a:ext uri="{28A0092B-C50C-407E-A947-70E740481C1C}">
                           <a14:useLocalDpi xmlns:a14="http://schemas.microsoft.com/office/drawing/2010/main" val="0"/>
@@ -14931,7 +14585,7 @@
                     </pic:cNvPicPr>
                   </pic:nvPicPr>
                   <pic:blipFill>
-                    <a:blip r:embed="rId41" cstate="print">
+                    <a:blip r:embed="rId40" cstate="print">
                       <a:extLst>
                         <a:ext uri="{28A0092B-C50C-407E-A947-70E740481C1C}">
                           <a14:useLocalDpi xmlns:a14="http://schemas.microsoft.com/office/drawing/2010/main" val="0"/>
@@ -15090,7 +14744,7 @@
                     </pic:cNvPicPr>
                   </pic:nvPicPr>
                   <pic:blipFill>
-                    <a:blip r:embed="rId42">
+                    <a:blip r:embed="rId41">
                       <a:extLst>
                         <a:ext uri="{28A0092B-C50C-407E-A947-70E740481C1C}">
                           <a14:useLocalDpi xmlns:a14="http://schemas.microsoft.com/office/drawing/2010/main" val="0"/>
@@ -15224,7 +14878,7 @@
                     </pic:cNvPicPr>
                   </pic:nvPicPr>
                   <pic:blipFill>
-                    <a:blip r:embed="rId43" cstate="print">
+                    <a:blip r:embed="rId42" cstate="print">
                       <a:extLst>
                         <a:ext uri="{28A0092B-C50C-407E-A947-70E740481C1C}">
                           <a14:useLocalDpi xmlns:a14="http://schemas.microsoft.com/office/drawing/2010/main" val="0"/>
@@ -15302,7 +14956,7 @@
                     </pic:cNvPicPr>
                   </pic:nvPicPr>
                   <pic:blipFill>
-                    <a:blip r:embed="rId44" cstate="print">
+                    <a:blip r:embed="rId43" cstate="print">
                       <a:extLst>
                         <a:ext uri="{28A0092B-C50C-407E-A947-70E740481C1C}">
                           <a14:useLocalDpi xmlns:a14="http://schemas.microsoft.com/office/drawing/2010/main" val="0"/>
@@ -15433,7 +15087,7 @@
                     </pic:cNvPicPr>
                   </pic:nvPicPr>
                   <pic:blipFill>
-                    <a:blip r:embed="rId45">
+                    <a:blip r:embed="rId44">
                       <a:extLst>
                         <a:ext uri="{28A0092B-C50C-407E-A947-70E740481C1C}">
                           <a14:useLocalDpi xmlns:a14="http://schemas.microsoft.com/office/drawing/2010/main" val="0"/>
@@ -15578,7 +15232,7 @@
                     </pic:cNvPicPr>
                   </pic:nvPicPr>
                   <pic:blipFill>
-                    <a:blip r:embed="rId46">
+                    <a:blip r:embed="rId45">
                       <a:extLst>
                         <a:ext uri="{28A0092B-C50C-407E-A947-70E740481C1C}">
                           <a14:useLocalDpi xmlns:a14="http://schemas.microsoft.com/office/drawing/2010/main" val="0"/>
@@ -15638,7 +15292,7 @@
                     </pic:cNvPicPr>
                   </pic:nvPicPr>
                   <pic:blipFill>
-                    <a:blip r:embed="rId47">
+                    <a:blip r:embed="rId46">
                       <a:extLst>
                         <a:ext uri="{28A0092B-C50C-407E-A947-70E740481C1C}">
                           <a14:useLocalDpi xmlns:a14="http://schemas.microsoft.com/office/drawing/2010/main" val="0"/>
@@ -15775,7 +15429,7 @@
                     </pic:cNvPicPr>
                   </pic:nvPicPr>
                   <pic:blipFill>
-                    <a:blip r:embed="rId48">
+                    <a:blip r:embed="rId47">
                       <a:extLst>
                         <a:ext uri="{28A0092B-C50C-407E-A947-70E740481C1C}">
                           <a14:useLocalDpi xmlns:a14="http://schemas.microsoft.com/office/drawing/2010/main" val="0"/>
@@ -15873,7 +15527,7 @@
                     </pic:cNvPicPr>
                   </pic:nvPicPr>
                   <pic:blipFill>
-                    <a:blip r:embed="rId49" cstate="print">
+                    <a:blip r:embed="rId48" cstate="print">
                       <a:extLst>
                         <a:ext uri="{28A0092B-C50C-407E-A947-70E740481C1C}">
                           <a14:useLocalDpi xmlns:a14="http://schemas.microsoft.com/office/drawing/2010/main" val="0"/>
@@ -15933,7 +15587,7 @@
                     </pic:cNvPicPr>
                   </pic:nvPicPr>
                   <pic:blipFill>
-                    <a:blip r:embed="rId50" cstate="print">
+                    <a:blip r:embed="rId49" cstate="print">
                       <a:extLst>
                         <a:ext uri="{28A0092B-C50C-407E-A947-70E740481C1C}">
                           <a14:useLocalDpi xmlns:a14="http://schemas.microsoft.com/office/drawing/2010/main" val="0"/>
@@ -16226,7 +15880,7 @@
                     </pic:cNvPicPr>
                   </pic:nvPicPr>
                   <pic:blipFill>
-                    <a:blip r:embed="rId51" cstate="print">
+                    <a:blip r:embed="rId50" cstate="print">
                       <a:extLst>
                         <a:ext uri="{28A0092B-C50C-407E-A947-70E740481C1C}">
                           <a14:useLocalDpi xmlns:a14="http://schemas.microsoft.com/office/drawing/2010/main" val="0"/>
@@ -16378,7 +16032,7 @@
       <w:r>
         <w:t xml:space="preserve">: </w:t>
       </w:r>
-      <w:hyperlink r:id="rId52" w:history="1">
+      <w:hyperlink r:id="rId51" w:history="1">
         <w:r>
           <w:rPr>
             <w:rStyle w:val="Hyperlink"/>
@@ -16609,7 +16263,7 @@
         <w:rStyle w:val="PageNumber"/>
         <w:noProof/>
       </w:rPr>
-      <w:t>4</w:t>
+      <w:t>14</w:t>
     </w:r>
     <w:r>
       <w:rPr>
@@ -18531,6 +18185,119 @@
     </w:lvl>
   </w:abstractNum>
   <w:abstractNum w:abstractNumId="11" w15:restartNumberingAfterBreak="0">
+    <w:nsid w:val="57145E91"/>
+    <w:multiLevelType w:val="hybridMultilevel"/>
+    <w:tmpl w:val="583C7C74"/>
+    <w:lvl w:ilvl="0" w:tplc="04090001">
+      <w:start w:val="1"/>
+      <w:numFmt w:val="bullet"/>
+      <w:lvlText w:val=""/>
+      <w:lvlJc w:val="left"/>
+      <w:pPr>
+        <w:ind w:left="720" w:hanging="360"/>
+      </w:pPr>
+      <w:rPr>
+        <w:rFonts w:ascii="Symbol" w:hAnsi="Symbol" w:hint="default"/>
+      </w:rPr>
+    </w:lvl>
+    <w:lvl w:ilvl="1" w:tplc="04090003">
+      <w:start w:val="1"/>
+      <w:numFmt w:val="bullet"/>
+      <w:lvlText w:val="o"/>
+      <w:lvlJc w:val="left"/>
+      <w:pPr>
+        <w:ind w:left="1440" w:hanging="360"/>
+      </w:pPr>
+      <w:rPr>
+        <w:rFonts w:ascii="Courier New" w:hAnsi="Courier New" w:cs="Courier New" w:hint="default"/>
+      </w:rPr>
+    </w:lvl>
+    <w:lvl w:ilvl="2" w:tplc="04090005" w:tentative="1">
+      <w:start w:val="1"/>
+      <w:numFmt w:val="bullet"/>
+      <w:lvlText w:val=""/>
+      <w:lvlJc w:val="left"/>
+      <w:pPr>
+        <w:ind w:left="2160" w:hanging="360"/>
+      </w:pPr>
+      <w:rPr>
+        <w:rFonts w:ascii="Wingdings" w:hAnsi="Wingdings" w:hint="default"/>
+      </w:rPr>
+    </w:lvl>
+    <w:lvl w:ilvl="3" w:tplc="04090001" w:tentative="1">
+      <w:start w:val="1"/>
+      <w:numFmt w:val="bullet"/>
+      <w:lvlText w:val=""/>
+      <w:lvlJc w:val="left"/>
+      <w:pPr>
+        <w:ind w:left="2880" w:hanging="360"/>
+      </w:pPr>
+      <w:rPr>
+        <w:rFonts w:ascii="Symbol" w:hAnsi="Symbol" w:hint="default"/>
+      </w:rPr>
+    </w:lvl>
+    <w:lvl w:ilvl="4" w:tplc="04090003" w:tentative="1">
+      <w:start w:val="1"/>
+      <w:numFmt w:val="bullet"/>
+      <w:lvlText w:val="o"/>
+      <w:lvlJc w:val="left"/>
+      <w:pPr>
+        <w:ind w:left="3600" w:hanging="360"/>
+      </w:pPr>
+      <w:rPr>
+        <w:rFonts w:ascii="Courier New" w:hAnsi="Courier New" w:cs="Courier New" w:hint="default"/>
+      </w:rPr>
+    </w:lvl>
+    <w:lvl w:ilvl="5" w:tplc="04090005" w:tentative="1">
+      <w:start w:val="1"/>
+      <w:numFmt w:val="bullet"/>
+      <w:lvlText w:val=""/>
+      <w:lvlJc w:val="left"/>
+      <w:pPr>
+        <w:ind w:left="4320" w:hanging="360"/>
+      </w:pPr>
+      <w:rPr>
+        <w:rFonts w:ascii="Wingdings" w:hAnsi="Wingdings" w:hint="default"/>
+      </w:rPr>
+    </w:lvl>
+    <w:lvl w:ilvl="6" w:tplc="04090001" w:tentative="1">
+      <w:start w:val="1"/>
+      <w:numFmt w:val="bullet"/>
+      <w:lvlText w:val=""/>
+      <w:lvlJc w:val="left"/>
+      <w:pPr>
+        <w:ind w:left="5040" w:hanging="360"/>
+      </w:pPr>
+      <w:rPr>
+        <w:rFonts w:ascii="Symbol" w:hAnsi="Symbol" w:hint="default"/>
+      </w:rPr>
+    </w:lvl>
+    <w:lvl w:ilvl="7" w:tplc="04090003" w:tentative="1">
+      <w:start w:val="1"/>
+      <w:numFmt w:val="bullet"/>
+      <w:lvlText w:val="o"/>
+      <w:lvlJc w:val="left"/>
+      <w:pPr>
+        <w:ind w:left="5760" w:hanging="360"/>
+      </w:pPr>
+      <w:rPr>
+        <w:rFonts w:ascii="Courier New" w:hAnsi="Courier New" w:cs="Courier New" w:hint="default"/>
+      </w:rPr>
+    </w:lvl>
+    <w:lvl w:ilvl="8" w:tplc="04090005" w:tentative="1">
+      <w:start w:val="1"/>
+      <w:numFmt w:val="bullet"/>
+      <w:lvlText w:val=""/>
+      <w:lvlJc w:val="left"/>
+      <w:pPr>
+        <w:ind w:left="6480" w:hanging="360"/>
+      </w:pPr>
+      <w:rPr>
+        <w:rFonts w:ascii="Wingdings" w:hAnsi="Wingdings" w:hint="default"/>
+      </w:rPr>
+    </w:lvl>
+  </w:abstractNum>
+  <w:abstractNum w:abstractNumId="12" w15:restartNumberingAfterBreak="0">
     <w:nsid w:val="70524DBC"/>
     <w:multiLevelType w:val="hybridMultilevel"/>
     <w:tmpl w:val="57887536"/>
@@ -18669,7 +18436,7 @@
       </w:rPr>
     </w:lvl>
   </w:abstractNum>
-  <w:abstractNum w:abstractNumId="12" w15:restartNumberingAfterBreak="0">
+  <w:abstractNum w:abstractNumId="13" w15:restartNumberingAfterBreak="0">
     <w:nsid w:val="738F00A9"/>
     <w:multiLevelType w:val="hybridMultilevel"/>
     <w:tmpl w:val="24202BBE"/>
@@ -18782,96 +18549,10 @@
       </w:rPr>
     </w:lvl>
   </w:abstractNum>
-  <w:abstractNum w:abstractNumId="13" w15:restartNumberingAfterBreak="0">
-    <w:nsid w:val="792C715F"/>
+  <w:abstractNum w:abstractNumId="14" w15:restartNumberingAfterBreak="0">
+    <w:nsid w:val="776C2BAA"/>
     <w:multiLevelType w:val="hybridMultilevel"/>
-    <w:tmpl w:val="37E0D864"/>
-    <w:lvl w:ilvl="0" w:tplc="0409000F">
-      <w:start w:val="1"/>
-      <w:numFmt w:val="decimal"/>
-      <w:lvlText w:val="%1."/>
-      <w:lvlJc w:val="left"/>
-      <w:pPr>
-        <w:ind w:left="720" w:hanging="360"/>
-      </w:pPr>
-    </w:lvl>
-    <w:lvl w:ilvl="1" w:tplc="04090019" w:tentative="1">
-      <w:start w:val="1"/>
-      <w:numFmt w:val="lowerLetter"/>
-      <w:lvlText w:val="%2."/>
-      <w:lvlJc w:val="left"/>
-      <w:pPr>
-        <w:ind w:left="1440" w:hanging="360"/>
-      </w:pPr>
-    </w:lvl>
-    <w:lvl w:ilvl="2" w:tplc="0409001B" w:tentative="1">
-      <w:start w:val="1"/>
-      <w:numFmt w:val="lowerRoman"/>
-      <w:lvlText w:val="%3."/>
-      <w:lvlJc w:val="right"/>
-      <w:pPr>
-        <w:ind w:left="2160" w:hanging="180"/>
-      </w:pPr>
-    </w:lvl>
-    <w:lvl w:ilvl="3" w:tplc="0409000F" w:tentative="1">
-      <w:start w:val="1"/>
-      <w:numFmt w:val="decimal"/>
-      <w:lvlText w:val="%4."/>
-      <w:lvlJc w:val="left"/>
-      <w:pPr>
-        <w:ind w:left="2880" w:hanging="360"/>
-      </w:pPr>
-    </w:lvl>
-    <w:lvl w:ilvl="4" w:tplc="04090019" w:tentative="1">
-      <w:start w:val="1"/>
-      <w:numFmt w:val="lowerLetter"/>
-      <w:lvlText w:val="%5."/>
-      <w:lvlJc w:val="left"/>
-      <w:pPr>
-        <w:ind w:left="3600" w:hanging="360"/>
-      </w:pPr>
-    </w:lvl>
-    <w:lvl w:ilvl="5" w:tplc="0409001B" w:tentative="1">
-      <w:start w:val="1"/>
-      <w:numFmt w:val="lowerRoman"/>
-      <w:lvlText w:val="%6."/>
-      <w:lvlJc w:val="right"/>
-      <w:pPr>
-        <w:ind w:left="4320" w:hanging="180"/>
-      </w:pPr>
-    </w:lvl>
-    <w:lvl w:ilvl="6" w:tplc="0409000F" w:tentative="1">
-      <w:start w:val="1"/>
-      <w:numFmt w:val="decimal"/>
-      <w:lvlText w:val="%7."/>
-      <w:lvlJc w:val="left"/>
-      <w:pPr>
-        <w:ind w:left="5040" w:hanging="360"/>
-      </w:pPr>
-    </w:lvl>
-    <w:lvl w:ilvl="7" w:tplc="04090019" w:tentative="1">
-      <w:start w:val="1"/>
-      <w:numFmt w:val="lowerLetter"/>
-      <w:lvlText w:val="%8."/>
-      <w:lvlJc w:val="left"/>
-      <w:pPr>
-        <w:ind w:left="5760" w:hanging="360"/>
-      </w:pPr>
-    </w:lvl>
-    <w:lvl w:ilvl="8" w:tplc="0409001B" w:tentative="1">
-      <w:start w:val="1"/>
-      <w:numFmt w:val="lowerRoman"/>
-      <w:lvlText w:val="%9."/>
-      <w:lvlJc w:val="right"/>
-      <w:pPr>
-        <w:ind w:left="6480" w:hanging="180"/>
-      </w:pPr>
-    </w:lvl>
-  </w:abstractNum>
-  <w:abstractNum w:abstractNumId="14" w15:restartNumberingAfterBreak="0">
-    <w:nsid w:val="7FC325D9"/>
-    <w:multiLevelType w:val="hybridMultilevel"/>
-    <w:tmpl w:val="4942E4DC"/>
+    <w:tmpl w:val="C4963A58"/>
     <w:lvl w:ilvl="0" w:tplc="04090001">
       <w:start w:val="1"/>
       <w:numFmt w:val="bullet"/>
@@ -18981,8 +18662,207 @@
       </w:rPr>
     </w:lvl>
   </w:abstractNum>
+  <w:abstractNum w:abstractNumId="15" w15:restartNumberingAfterBreak="0">
+    <w:nsid w:val="792C715F"/>
+    <w:multiLevelType w:val="hybridMultilevel"/>
+    <w:tmpl w:val="37E0D864"/>
+    <w:lvl w:ilvl="0" w:tplc="0409000F">
+      <w:start w:val="1"/>
+      <w:numFmt w:val="decimal"/>
+      <w:lvlText w:val="%1."/>
+      <w:lvlJc w:val="left"/>
+      <w:pPr>
+        <w:ind w:left="720" w:hanging="360"/>
+      </w:pPr>
+    </w:lvl>
+    <w:lvl w:ilvl="1" w:tplc="04090019" w:tentative="1">
+      <w:start w:val="1"/>
+      <w:numFmt w:val="lowerLetter"/>
+      <w:lvlText w:val="%2."/>
+      <w:lvlJc w:val="left"/>
+      <w:pPr>
+        <w:ind w:left="1440" w:hanging="360"/>
+      </w:pPr>
+    </w:lvl>
+    <w:lvl w:ilvl="2" w:tplc="0409001B" w:tentative="1">
+      <w:start w:val="1"/>
+      <w:numFmt w:val="lowerRoman"/>
+      <w:lvlText w:val="%3."/>
+      <w:lvlJc w:val="right"/>
+      <w:pPr>
+        <w:ind w:left="2160" w:hanging="180"/>
+      </w:pPr>
+    </w:lvl>
+    <w:lvl w:ilvl="3" w:tplc="0409000F" w:tentative="1">
+      <w:start w:val="1"/>
+      <w:numFmt w:val="decimal"/>
+      <w:lvlText w:val="%4."/>
+      <w:lvlJc w:val="left"/>
+      <w:pPr>
+        <w:ind w:left="2880" w:hanging="360"/>
+      </w:pPr>
+    </w:lvl>
+    <w:lvl w:ilvl="4" w:tplc="04090019" w:tentative="1">
+      <w:start w:val="1"/>
+      <w:numFmt w:val="lowerLetter"/>
+      <w:lvlText w:val="%5."/>
+      <w:lvlJc w:val="left"/>
+      <w:pPr>
+        <w:ind w:left="3600" w:hanging="360"/>
+      </w:pPr>
+    </w:lvl>
+    <w:lvl w:ilvl="5" w:tplc="0409001B" w:tentative="1">
+      <w:start w:val="1"/>
+      <w:numFmt w:val="lowerRoman"/>
+      <w:lvlText w:val="%6."/>
+      <w:lvlJc w:val="right"/>
+      <w:pPr>
+        <w:ind w:left="4320" w:hanging="180"/>
+      </w:pPr>
+    </w:lvl>
+    <w:lvl w:ilvl="6" w:tplc="0409000F" w:tentative="1">
+      <w:start w:val="1"/>
+      <w:numFmt w:val="decimal"/>
+      <w:lvlText w:val="%7."/>
+      <w:lvlJc w:val="left"/>
+      <w:pPr>
+        <w:ind w:left="5040" w:hanging="360"/>
+      </w:pPr>
+    </w:lvl>
+    <w:lvl w:ilvl="7" w:tplc="04090019" w:tentative="1">
+      <w:start w:val="1"/>
+      <w:numFmt w:val="lowerLetter"/>
+      <w:lvlText w:val="%8."/>
+      <w:lvlJc w:val="left"/>
+      <w:pPr>
+        <w:ind w:left="5760" w:hanging="360"/>
+      </w:pPr>
+    </w:lvl>
+    <w:lvl w:ilvl="8" w:tplc="0409001B" w:tentative="1">
+      <w:start w:val="1"/>
+      <w:numFmt w:val="lowerRoman"/>
+      <w:lvlText w:val="%9."/>
+      <w:lvlJc w:val="right"/>
+      <w:pPr>
+        <w:ind w:left="6480" w:hanging="180"/>
+      </w:pPr>
+    </w:lvl>
+  </w:abstractNum>
+  <w:abstractNum w:abstractNumId="16" w15:restartNumberingAfterBreak="0">
+    <w:nsid w:val="7FC325D9"/>
+    <w:multiLevelType w:val="hybridMultilevel"/>
+    <w:tmpl w:val="4942E4DC"/>
+    <w:lvl w:ilvl="0" w:tplc="04090001">
+      <w:start w:val="1"/>
+      <w:numFmt w:val="bullet"/>
+      <w:lvlText w:val=""/>
+      <w:lvlJc w:val="left"/>
+      <w:pPr>
+        <w:ind w:left="720" w:hanging="360"/>
+      </w:pPr>
+      <w:rPr>
+        <w:rFonts w:ascii="Symbol" w:hAnsi="Symbol" w:hint="default"/>
+      </w:rPr>
+    </w:lvl>
+    <w:lvl w:ilvl="1" w:tplc="04090003" w:tentative="1">
+      <w:start w:val="1"/>
+      <w:numFmt w:val="bullet"/>
+      <w:lvlText w:val="o"/>
+      <w:lvlJc w:val="left"/>
+      <w:pPr>
+        <w:ind w:left="1440" w:hanging="360"/>
+      </w:pPr>
+      <w:rPr>
+        <w:rFonts w:ascii="Courier New" w:hAnsi="Courier New" w:cs="Courier New" w:hint="default"/>
+      </w:rPr>
+    </w:lvl>
+    <w:lvl w:ilvl="2" w:tplc="04090005" w:tentative="1">
+      <w:start w:val="1"/>
+      <w:numFmt w:val="bullet"/>
+      <w:lvlText w:val=""/>
+      <w:lvlJc w:val="left"/>
+      <w:pPr>
+        <w:ind w:left="2160" w:hanging="360"/>
+      </w:pPr>
+      <w:rPr>
+        <w:rFonts w:ascii="Wingdings" w:hAnsi="Wingdings" w:hint="default"/>
+      </w:rPr>
+    </w:lvl>
+    <w:lvl w:ilvl="3" w:tplc="04090001" w:tentative="1">
+      <w:start w:val="1"/>
+      <w:numFmt w:val="bullet"/>
+      <w:lvlText w:val=""/>
+      <w:lvlJc w:val="left"/>
+      <w:pPr>
+        <w:ind w:left="2880" w:hanging="360"/>
+      </w:pPr>
+      <w:rPr>
+        <w:rFonts w:ascii="Symbol" w:hAnsi="Symbol" w:hint="default"/>
+      </w:rPr>
+    </w:lvl>
+    <w:lvl w:ilvl="4" w:tplc="04090003" w:tentative="1">
+      <w:start w:val="1"/>
+      <w:numFmt w:val="bullet"/>
+      <w:lvlText w:val="o"/>
+      <w:lvlJc w:val="left"/>
+      <w:pPr>
+        <w:ind w:left="3600" w:hanging="360"/>
+      </w:pPr>
+      <w:rPr>
+        <w:rFonts w:ascii="Courier New" w:hAnsi="Courier New" w:cs="Courier New" w:hint="default"/>
+      </w:rPr>
+    </w:lvl>
+    <w:lvl w:ilvl="5" w:tplc="04090005" w:tentative="1">
+      <w:start w:val="1"/>
+      <w:numFmt w:val="bullet"/>
+      <w:lvlText w:val=""/>
+      <w:lvlJc w:val="left"/>
+      <w:pPr>
+        <w:ind w:left="4320" w:hanging="360"/>
+      </w:pPr>
+      <w:rPr>
+        <w:rFonts w:ascii="Wingdings" w:hAnsi="Wingdings" w:hint="default"/>
+      </w:rPr>
+    </w:lvl>
+    <w:lvl w:ilvl="6" w:tplc="04090001" w:tentative="1">
+      <w:start w:val="1"/>
+      <w:numFmt w:val="bullet"/>
+      <w:lvlText w:val=""/>
+      <w:lvlJc w:val="left"/>
+      <w:pPr>
+        <w:ind w:left="5040" w:hanging="360"/>
+      </w:pPr>
+      <w:rPr>
+        <w:rFonts w:ascii="Symbol" w:hAnsi="Symbol" w:hint="default"/>
+      </w:rPr>
+    </w:lvl>
+    <w:lvl w:ilvl="7" w:tplc="04090003" w:tentative="1">
+      <w:start w:val="1"/>
+      <w:numFmt w:val="bullet"/>
+      <w:lvlText w:val="o"/>
+      <w:lvlJc w:val="left"/>
+      <w:pPr>
+        <w:ind w:left="5760" w:hanging="360"/>
+      </w:pPr>
+      <w:rPr>
+        <w:rFonts w:ascii="Courier New" w:hAnsi="Courier New" w:cs="Courier New" w:hint="default"/>
+      </w:rPr>
+    </w:lvl>
+    <w:lvl w:ilvl="8" w:tplc="04090005" w:tentative="1">
+      <w:start w:val="1"/>
+      <w:numFmt w:val="bullet"/>
+      <w:lvlText w:val=""/>
+      <w:lvlJc w:val="left"/>
+      <w:pPr>
+        <w:ind w:left="6480" w:hanging="360"/>
+      </w:pPr>
+      <w:rPr>
+        <w:rFonts w:ascii="Wingdings" w:hAnsi="Wingdings" w:hint="default"/>
+      </w:rPr>
+    </w:lvl>
+  </w:abstractNum>
   <w:num w:numId="1">
-    <w:abstractNumId w:val="11"/>
+    <w:abstractNumId w:val="12"/>
   </w:num>
   <w:num w:numId="2">
     <w:abstractNumId w:val="7"/>
@@ -19003,7 +18883,7 @@
     <w:abstractNumId w:val="6"/>
   </w:num>
   <w:num w:numId="8">
-    <w:abstractNumId w:val="13"/>
+    <w:abstractNumId w:val="15"/>
   </w:num>
   <w:num w:numId="9">
     <w:abstractNumId w:val="8"/>
@@ -19012,10 +18892,10 @@
     <w:abstractNumId w:val="10"/>
   </w:num>
   <w:num w:numId="11">
-    <w:abstractNumId w:val="12"/>
+    <w:abstractNumId w:val="13"/>
   </w:num>
   <w:num w:numId="12">
-    <w:abstractNumId w:val="14"/>
+    <w:abstractNumId w:val="16"/>
   </w:num>
   <w:num w:numId="13">
     <w:abstractNumId w:val="1"/>
@@ -19025,6 +18905,12 @@
   </w:num>
   <w:num w:numId="15">
     <w:abstractNumId w:val="3"/>
+  </w:num>
+  <w:num w:numId="16">
+    <w:abstractNumId w:val="11"/>
+  </w:num>
+  <w:num w:numId="17">
+    <w:abstractNumId w:val="14"/>
   </w:num>
   <w:numIdMacAtCleanup w:val="4"/>
 </w:numbering>
@@ -20438,579 +20324,6 @@
 </w:styles>
 </file>
 
-<file path=word/glossary/document.xml><?xml version="1.0" encoding="utf-8"?>
-<w:glossaryDocument xmlns:wpc="http://schemas.microsoft.com/office/word/2010/wordprocessingCanvas" xmlns:cx="http://schemas.microsoft.com/office/drawing/2014/chartex" xmlns:cx1="http://schemas.microsoft.com/office/drawing/2015/9/8/chartex" xmlns:mc="http://schemas.openxmlformats.org/markup-compatibility/2006" xmlns:o="urn:schemas-microsoft-com:office:office" xmlns:r="http://schemas.openxmlformats.org/officeDocument/2006/relationships" xmlns:m="http://schemas.openxmlformats.org/officeDocument/2006/math" xmlns:v="urn:schemas-microsoft-com:vml" xmlns:wp14="http://schemas.microsoft.com/office/word/2010/wordprocessingDrawing" xmlns:wp="http://schemas.openxmlformats.org/drawingml/2006/wordprocessingDrawing" xmlns:w10="urn:schemas-microsoft-com:office:word" xmlns:w="http://schemas.openxmlformats.org/wordprocessingml/2006/main" xmlns:w14="http://schemas.microsoft.com/office/word/2010/wordml" xmlns:w15="http://schemas.microsoft.com/office/word/2012/wordml" xmlns:w16se="http://schemas.microsoft.com/office/word/2015/wordml/symex" xmlns:wpg="http://schemas.microsoft.com/office/word/2010/wordprocessingGroup" xmlns:wpi="http://schemas.microsoft.com/office/word/2010/wordprocessingInk" xmlns:wne="http://schemas.microsoft.com/office/word/2006/wordml" xmlns:wps="http://schemas.microsoft.com/office/word/2010/wordprocessingShape" mc:Ignorable="w14 w15 w16se wp14"/>
-</file>
-
-<file path=word/glossary/fontTable.xml><?xml version="1.0" encoding="utf-8"?>
-<w:fonts xmlns:mc="http://schemas.openxmlformats.org/markup-compatibility/2006" xmlns:r="http://schemas.openxmlformats.org/officeDocument/2006/relationships" xmlns:w="http://schemas.openxmlformats.org/wordprocessingml/2006/main" xmlns:w14="http://schemas.microsoft.com/office/word/2010/wordml" xmlns:w15="http://schemas.microsoft.com/office/word/2012/wordml" xmlns:w16se="http://schemas.microsoft.com/office/word/2015/wordml/symex" mc:Ignorable="w14 w15 w16se">
-  <w:font w:name="Symbol">
-    <w:panose1 w:val="05050102010706020507"/>
-    <w:charset w:val="02"/>
-    <w:family w:val="roman"/>
-    <w:pitch w:val="variable"/>
-    <w:sig w:usb0="00000000" w:usb1="10000000" w:usb2="00000000" w:usb3="00000000" w:csb0="80000000" w:csb1="00000000"/>
-  </w:font>
-  <w:font w:name="Times New Roman">
-    <w:panose1 w:val="02020603050405020304"/>
-    <w:charset w:val="00"/>
-    <w:family w:val="roman"/>
-    <w:pitch w:val="variable"/>
-    <w:sig w:usb0="E0002EFF" w:usb1="C000785B" w:usb2="00000009" w:usb3="00000000" w:csb0="000001FF" w:csb1="00000000"/>
-  </w:font>
-  <w:font w:name="Courier New">
-    <w:panose1 w:val="02070309020205020404"/>
-    <w:charset w:val="00"/>
-    <w:family w:val="modern"/>
-    <w:pitch w:val="fixed"/>
-    <w:sig w:usb0="E0002EFF" w:usb1="C0007843" w:usb2="00000009" w:usb3="00000000" w:csb0="000001FF" w:csb1="00000000"/>
-  </w:font>
-  <w:font w:name="Wingdings">
-    <w:panose1 w:val="05000000000000000000"/>
-    <w:charset w:val="02"/>
-    <w:family w:val="auto"/>
-    <w:pitch w:val="variable"/>
-    <w:sig w:usb0="00000000" w:usb1="10000000" w:usb2="00000000" w:usb3="00000000" w:csb0="80000000" w:csb1="00000000"/>
-  </w:font>
-  <w:font w:name="Arial">
-    <w:panose1 w:val="020B0604020202020204"/>
-    <w:charset w:val="00"/>
-    <w:family w:val="swiss"/>
-    <w:pitch w:val="variable"/>
-    <w:sig w:usb0="E0002EFF" w:usb1="C000785B" w:usb2="00000009" w:usb3="00000000" w:csb0="000001FF" w:csb1="00000000"/>
-  </w:font>
-  <w:font w:name="Calibri">
-    <w:panose1 w:val="020F0502020204030204"/>
-    <w:charset w:val="00"/>
-    <w:family w:val="swiss"/>
-    <w:pitch w:val="variable"/>
-    <w:sig w:usb0="E4002EFF" w:usb1="C000247B" w:usb2="00000009" w:usb3="00000000" w:csb0="000001FF" w:csb1="00000000"/>
-  </w:font>
-  <w:font w:name="Cambria">
-    <w:panose1 w:val="02040503050406030204"/>
-    <w:charset w:val="00"/>
-    <w:family w:val="roman"/>
-    <w:pitch w:val="variable"/>
-    <w:sig w:usb0="E00006FF" w:usb1="420024FF" w:usb2="02000000" w:usb3="00000000" w:csb0="0000019F" w:csb1="00000000"/>
-  </w:font>
-  <w:font w:name="Tahoma">
-    <w:panose1 w:val="020B0604030504040204"/>
-    <w:charset w:val="00"/>
-    <w:family w:val="swiss"/>
-    <w:pitch w:val="variable"/>
-    <w:sig w:usb0="E1002EFF" w:usb1="C000605B" w:usb2="00000029" w:usb3="00000000" w:csb0="000101FF" w:csb1="00000000"/>
-  </w:font>
-  <w:font w:name="VogueBold">
-    <w:charset w:val="00"/>
-    <w:family w:val="auto"/>
-    <w:pitch w:val="variable"/>
-    <w:sig w:usb0="00000083" w:usb1="00000000" w:usb2="00000000" w:usb3="00000000" w:csb0="00000009" w:csb1="00000000"/>
-  </w:font>
-  <w:font w:name="TimesRoman">
-    <w:altName w:val="Times New Roman"/>
-    <w:charset w:val="00"/>
-    <w:family w:val="auto"/>
-    <w:pitch w:val="variable"/>
-    <w:sig w:usb0="00000083" w:usb1="00000000" w:usb2="00000000" w:usb3="00000000" w:csb0="00000009" w:csb1="00000000"/>
-  </w:font>
-  <w:font w:name="CHelvItalic">
-    <w:charset w:val="00"/>
-    <w:family w:val="auto"/>
-    <w:pitch w:val="variable"/>
-    <w:sig w:usb0="00000083" w:usb1="00000000" w:usb2="00000000" w:usb3="00000000" w:csb0="00000009" w:csb1="00000000"/>
-  </w:font>
-  <w:font w:name="Calibri Light">
-    <w:panose1 w:val="020F0302020204030204"/>
-    <w:charset w:val="00"/>
-    <w:family w:val="swiss"/>
-    <w:pitch w:val="variable"/>
-    <w:sig w:usb0="E4002EFF" w:usb1="C000247B" w:usb2="00000009" w:usb3="00000000" w:csb0="000001FF" w:csb1="00000000"/>
-  </w:font>
-</w:fonts>
-</file>
-
-<file path=word/glossary/settings.xml><?xml version="1.0" encoding="utf-8"?>
-<w:settings xmlns:mc="http://schemas.openxmlformats.org/markup-compatibility/2006" xmlns:o="urn:schemas-microsoft-com:office:office" xmlns:r="http://schemas.openxmlformats.org/officeDocument/2006/relationships" xmlns:m="http://schemas.openxmlformats.org/officeDocument/2006/math" xmlns:v="urn:schemas-microsoft-com:vml" xmlns:w10="urn:schemas-microsoft-com:office:word" xmlns:w="http://schemas.openxmlformats.org/wordprocessingml/2006/main" xmlns:w14="http://schemas.microsoft.com/office/word/2010/wordml" xmlns:w15="http://schemas.microsoft.com/office/word/2012/wordml" xmlns:w16se="http://schemas.microsoft.com/office/word/2015/wordml/symex" xmlns:sl="http://schemas.openxmlformats.org/schemaLibrary/2006/main" mc:Ignorable="w14 w15 w16se">
-  <w:view w:val="normal"/>
-  <w:defaultTabStop w:val="720"/>
-  <w:characterSpacingControl w:val="doNotCompress"/>
-  <w:compat>
-    <w:useFELayout/>
-    <w:compatSetting w:name="compatibilityMode" w:uri="http://schemas.microsoft.com/office/word" w:val="15"/>
-    <w:compatSetting w:name="overrideTableStyleFontSizeAndJustification" w:uri="http://schemas.microsoft.com/office/word" w:val="1"/>
-    <w:compatSetting w:name="enableOpenTypeFeatures" w:uri="http://schemas.microsoft.com/office/word" w:val="1"/>
-    <w:compatSetting w:name="doNotFlipMirrorIndents" w:uri="http://schemas.microsoft.com/office/word" w:val="1"/>
-    <w:compatSetting w:name="differentiateMultirowTableHeaders" w:uri="http://schemas.microsoft.com/office/word" w:val="1"/>
-  </w:compat>
-  <w:rsids>
-    <w:rsidRoot w:val="00E83799"/>
-    <w:rsid w:val="0010569B"/>
-    <w:rsid w:val="00E83799"/>
-  </w:rsids>
-  <m:mathPr>
-    <m:mathFont m:val="Cambria Math"/>
-    <m:brkBin m:val="before"/>
-    <m:brkBinSub m:val="--"/>
-    <m:smallFrac m:val="0"/>
-    <m:dispDef/>
-    <m:lMargin m:val="0"/>
-    <m:rMargin m:val="0"/>
-    <m:defJc m:val="centerGroup"/>
-    <m:wrapIndent m:val="1440"/>
-    <m:intLim m:val="subSup"/>
-    <m:naryLim m:val="undOvr"/>
-  </m:mathPr>
-  <w:themeFontLang w:val="en-US"/>
-  <w:clrSchemeMapping w:bg1="light1" w:t1="dark1" w:bg2="light2" w:t2="dark2" w:accent1="accent1" w:accent2="accent2" w:accent3="accent3" w:accent4="accent4" w:accent5="accent5" w:accent6="accent6" w:hyperlink="hyperlink" w:followedHyperlink="followedHyperlink"/>
-  <w:decimalSymbol w:val="."/>
-  <w:listSeparator w:val=","/>
-  <w15:chartTrackingRefBased/>
-</w:settings>
-</file>
-
-<file path=word/glossary/styles.xml><?xml version="1.0" encoding="utf-8"?>
-<w:styles xmlns:mc="http://schemas.openxmlformats.org/markup-compatibility/2006" xmlns:r="http://schemas.openxmlformats.org/officeDocument/2006/relationships" xmlns:w="http://schemas.openxmlformats.org/wordprocessingml/2006/main" xmlns:w14="http://schemas.microsoft.com/office/word/2010/wordml" xmlns:w15="http://schemas.microsoft.com/office/word/2012/wordml" xmlns:w16se="http://schemas.microsoft.com/office/word/2015/wordml/symex" mc:Ignorable="w14 w15 w16se">
-  <w:docDefaults>
-    <w:rPrDefault>
-      <w:rPr>
-        <w:rFonts w:asciiTheme="minorHAnsi" w:eastAsiaTheme="minorEastAsia" w:hAnsiTheme="minorHAnsi" w:cstheme="minorBidi"/>
-        <w:sz w:val="22"/>
-        <w:szCs w:val="22"/>
-        <w:lang w:val="en-US" w:eastAsia="en-US" w:bidi="ar-SA"/>
-      </w:rPr>
-    </w:rPrDefault>
-    <w:pPrDefault>
-      <w:pPr>
-        <w:spacing w:after="160" w:line="259" w:lineRule="auto"/>
-      </w:pPr>
-    </w:pPrDefault>
-  </w:docDefaults>
-  <w:latentStyles w:defLockedState="0" w:defUIPriority="99" w:defSemiHidden="0" w:defUnhideWhenUsed="0" w:defQFormat="0" w:count="371">
-    <w:lsdException w:name="Normal" w:uiPriority="0" w:qFormat="1"/>
-    <w:lsdException w:name="heading 1" w:uiPriority="9" w:qFormat="1"/>
-    <w:lsdException w:name="heading 2" w:semiHidden="1" w:uiPriority="9" w:unhideWhenUsed="1" w:qFormat="1"/>
-    <w:lsdException w:name="heading 3" w:semiHidden="1" w:uiPriority="9" w:unhideWhenUsed="1" w:qFormat="1"/>
-    <w:lsdException w:name="heading 4" w:semiHidden="1" w:uiPriority="9" w:unhideWhenUsed="1" w:qFormat="1"/>
-    <w:lsdException w:name="heading 5" w:semiHidden="1" w:uiPriority="9" w:unhideWhenUsed="1" w:qFormat="1"/>
-    <w:lsdException w:name="heading 6" w:semiHidden="1" w:uiPriority="9" w:unhideWhenUsed="1" w:qFormat="1"/>
-    <w:lsdException w:name="heading 7" w:semiHidden="1" w:uiPriority="9" w:unhideWhenUsed="1" w:qFormat="1"/>
-    <w:lsdException w:name="heading 8" w:semiHidden="1" w:uiPriority="9" w:unhideWhenUsed="1" w:qFormat="1"/>
-    <w:lsdException w:name="heading 9" w:semiHidden="1" w:uiPriority="9" w:unhideWhenUsed="1" w:qFormat="1"/>
-    <w:lsdException w:name="index 1" w:semiHidden="1" w:unhideWhenUsed="1"/>
-    <w:lsdException w:name="index 2" w:semiHidden="1" w:unhideWhenUsed="1"/>
-    <w:lsdException w:name="index 3" w:semiHidden="1" w:unhideWhenUsed="1"/>
-    <w:lsdException w:name="index 4" w:semiHidden="1" w:unhideWhenUsed="1"/>
-    <w:lsdException w:name="index 5" w:semiHidden="1" w:unhideWhenUsed="1"/>
-    <w:lsdException w:name="index 6" w:semiHidden="1" w:unhideWhenUsed="1"/>
-    <w:lsdException w:name="index 7" w:semiHidden="1" w:unhideWhenUsed="1"/>
-    <w:lsdException w:name="index 8" w:semiHidden="1" w:unhideWhenUsed="1"/>
-    <w:lsdException w:name="index 9" w:semiHidden="1" w:unhideWhenUsed="1"/>
-    <w:lsdException w:name="toc 1" w:semiHidden="1" w:uiPriority="39" w:unhideWhenUsed="1"/>
-    <w:lsdException w:name="toc 2" w:semiHidden="1" w:uiPriority="39" w:unhideWhenUsed="1"/>
-    <w:lsdException w:name="toc 3" w:semiHidden="1" w:uiPriority="39" w:unhideWhenUsed="1"/>
-    <w:lsdException w:name="toc 4" w:semiHidden="1" w:uiPriority="39" w:unhideWhenUsed="1"/>
-    <w:lsdException w:name="toc 5" w:semiHidden="1" w:uiPriority="39" w:unhideWhenUsed="1"/>
-    <w:lsdException w:name="toc 6" w:semiHidden="1" w:uiPriority="39" w:unhideWhenUsed="1"/>
-    <w:lsdException w:name="toc 7" w:semiHidden="1" w:uiPriority="39" w:unhideWhenUsed="1"/>
-    <w:lsdException w:name="toc 8" w:semiHidden="1" w:uiPriority="39" w:unhideWhenUsed="1"/>
-    <w:lsdException w:name="toc 9" w:semiHidden="1" w:uiPriority="39" w:unhideWhenUsed="1"/>
-    <w:lsdException w:name="Normal Indent" w:semiHidden="1" w:unhideWhenUsed="1"/>
-    <w:lsdException w:name="footnote text" w:semiHidden="1" w:unhideWhenUsed="1"/>
-    <w:lsdException w:name="annotation text" w:semiHidden="1" w:unhideWhenUsed="1"/>
-    <w:lsdException w:name="header" w:semiHidden="1" w:unhideWhenUsed="1"/>
-    <w:lsdException w:name="footer" w:semiHidden="1" w:unhideWhenUsed="1"/>
-    <w:lsdException w:name="index heading" w:semiHidden="1" w:unhideWhenUsed="1"/>
-    <w:lsdException w:name="caption" w:semiHidden="1" w:uiPriority="35" w:unhideWhenUsed="1" w:qFormat="1"/>
-    <w:lsdException w:name="table of figures" w:semiHidden="1" w:unhideWhenUsed="1"/>
-    <w:lsdException w:name="envelope address" w:semiHidden="1" w:unhideWhenUsed="1"/>
-    <w:lsdException w:name="envelope return" w:semiHidden="1" w:unhideWhenUsed="1"/>
-    <w:lsdException w:name="footnote reference" w:semiHidden="1" w:unhideWhenUsed="1"/>
-    <w:lsdException w:name="annotation reference" w:semiHidden="1" w:unhideWhenUsed="1"/>
-    <w:lsdException w:name="line number" w:semiHidden="1" w:unhideWhenUsed="1"/>
-    <w:lsdException w:name="page number" w:semiHidden="1" w:unhideWhenUsed="1"/>
-    <w:lsdException w:name="endnote reference" w:semiHidden="1" w:unhideWhenUsed="1"/>
-    <w:lsdException w:name="endnote text" w:semiHidden="1" w:unhideWhenUsed="1"/>
-    <w:lsdException w:name="table of authorities" w:semiHidden="1" w:unhideWhenUsed="1"/>
-    <w:lsdException w:name="macro" w:semiHidden="1" w:unhideWhenUsed="1"/>
-    <w:lsdException w:name="toa heading" w:semiHidden="1" w:unhideWhenUsed="1"/>
-    <w:lsdException w:name="List" w:semiHidden="1" w:unhideWhenUsed="1"/>
-    <w:lsdException w:name="List Bullet" w:semiHidden="1" w:unhideWhenUsed="1"/>
-    <w:lsdException w:name="List Number" w:semiHidden="1" w:unhideWhenUsed="1"/>
-    <w:lsdException w:name="List 2" w:semiHidden="1" w:unhideWhenUsed="1"/>
-    <w:lsdException w:name="List 3" w:semiHidden="1" w:unhideWhenUsed="1"/>
-    <w:lsdException w:name="List 4" w:semiHidden="1" w:unhideWhenUsed="1"/>
-    <w:lsdException w:name="List 5" w:semiHidden="1" w:unhideWhenUsed="1"/>
-    <w:lsdException w:name="List Bullet 2" w:semiHidden="1" w:unhideWhenUsed="1"/>
-    <w:lsdException w:name="List Bullet 3" w:semiHidden="1" w:unhideWhenUsed="1"/>
-    <w:lsdException w:name="List Bullet 4" w:semiHidden="1" w:unhideWhenUsed="1"/>
-    <w:lsdException w:name="List Bullet 5" w:semiHidden="1" w:unhideWhenUsed="1"/>
-    <w:lsdException w:name="List Number 2" w:semiHidden="1" w:unhideWhenUsed="1"/>
-    <w:lsdException w:name="List Number 3" w:semiHidden="1" w:unhideWhenUsed="1"/>
-    <w:lsdException w:name="List Number 4" w:semiHidden="1" w:unhideWhenUsed="1"/>
-    <w:lsdException w:name="List Number 5" w:semiHidden="1" w:unhideWhenUsed="1"/>
-    <w:lsdException w:name="Title" w:uiPriority="10" w:qFormat="1"/>
-    <w:lsdException w:name="Closing" w:semiHidden="1" w:unhideWhenUsed="1"/>
-    <w:lsdException w:name="Signature" w:semiHidden="1" w:unhideWhenUsed="1"/>
-    <w:lsdException w:name="Default Paragraph Font" w:semiHidden="1" w:uiPriority="1" w:unhideWhenUsed="1"/>
-    <w:lsdException w:name="Body Text" w:semiHidden="1" w:unhideWhenUsed="1"/>
-    <w:lsdException w:name="Body Text Indent" w:semiHidden="1" w:unhideWhenUsed="1"/>
-    <w:lsdException w:name="List Continue" w:semiHidden="1" w:unhideWhenUsed="1"/>
-    <w:lsdException w:name="List Continue 2" w:semiHidden="1" w:unhideWhenUsed="1"/>
-    <w:lsdException w:name="List Continue 3" w:semiHidden="1" w:unhideWhenUsed="1"/>
-    <w:lsdException w:name="List Continue 4" w:semiHidden="1" w:unhideWhenUsed="1"/>
-    <w:lsdException w:name="List Continue 5" w:semiHidden="1" w:unhideWhenUsed="1"/>
-    <w:lsdException w:name="Message Header" w:semiHidden="1" w:unhideWhenUsed="1"/>
-    <w:lsdException w:name="Subtitle" w:uiPriority="11" w:qFormat="1"/>
-    <w:lsdException w:name="Salutation" w:semiHidden="1" w:unhideWhenUsed="1"/>
-    <w:lsdException w:name="Date" w:semiHidden="1" w:unhideWhenUsed="1"/>
-    <w:lsdException w:name="Body Text First Indent" w:semiHidden="1" w:unhideWhenUsed="1"/>
-    <w:lsdException w:name="Body Text First Indent 2" w:semiHidden="1" w:unhideWhenUsed="1"/>
-    <w:lsdException w:name="Note Heading" w:semiHidden="1" w:unhideWhenUsed="1"/>
-    <w:lsdException w:name="Body Text 2" w:semiHidden="1" w:unhideWhenUsed="1"/>
-    <w:lsdException w:name="Body Text 3" w:semiHidden="1" w:unhideWhenUsed="1"/>
-    <w:lsdException w:name="Body Text Indent 2" w:semiHidden="1" w:unhideWhenUsed="1"/>
-    <w:lsdException w:name="Body Text Indent 3" w:semiHidden="1" w:unhideWhenUsed="1"/>
-    <w:lsdException w:name="Block Text" w:semiHidden="1" w:unhideWhenUsed="1"/>
-    <w:lsdException w:name="Hyperlink" w:semiHidden="1" w:unhideWhenUsed="1"/>
-    <w:lsdException w:name="FollowedHyperlink" w:semiHidden="1" w:unhideWhenUsed="1"/>
-    <w:lsdException w:name="Strong" w:uiPriority="22" w:qFormat="1"/>
-    <w:lsdException w:name="Emphasis" w:uiPriority="20" w:qFormat="1"/>
-    <w:lsdException w:name="Document Map" w:semiHidden="1" w:unhideWhenUsed="1"/>
-    <w:lsdException w:name="Plain Text" w:semiHidden="1" w:unhideWhenUsed="1"/>
-    <w:lsdException w:name="E-mail Signature" w:semiHidden="1" w:unhideWhenUsed="1"/>
-    <w:lsdException w:name="HTML Top of Form" w:semiHidden="1" w:unhideWhenUsed="1"/>
-    <w:lsdException w:name="HTML Bottom of Form" w:semiHidden="1" w:unhideWhenUsed="1"/>
-    <w:lsdException w:name="Normal (Web)" w:semiHidden="1" w:unhideWhenUsed="1"/>
-    <w:lsdException w:name="HTML Acronym" w:semiHidden="1" w:unhideWhenUsed="1"/>
-    <w:lsdException w:name="HTML Address" w:semiHidden="1" w:unhideWhenUsed="1"/>
-    <w:lsdException w:name="HTML Cite" w:semiHidden="1" w:unhideWhenUsed="1"/>
-    <w:lsdException w:name="HTML Code" w:semiHidden="1" w:unhideWhenUsed="1"/>
-    <w:lsdException w:name="HTML Definition" w:semiHidden="1" w:unhideWhenUsed="1"/>
-    <w:lsdException w:name="HTML Keyboard" w:semiHidden="1" w:unhideWhenUsed="1"/>
-    <w:lsdException w:name="HTML Preformatted" w:semiHidden="1" w:unhideWhenUsed="1"/>
-    <w:lsdException w:name="HTML Sample" w:semiHidden="1" w:unhideWhenUsed="1"/>
-    <w:lsdException w:name="HTML Typewriter" w:semiHidden="1" w:unhideWhenUsed="1"/>
-    <w:lsdException w:name="HTML Variable" w:semiHidden="1" w:unhideWhenUsed="1"/>
-    <w:lsdException w:name="Normal Table" w:semiHidden="1" w:unhideWhenUsed="1"/>
-    <w:lsdException w:name="annotation subject" w:semiHidden="1" w:unhideWhenUsed="1"/>
-    <w:lsdException w:name="No List" w:semiHidden="1" w:unhideWhenUsed="1"/>
-    <w:lsdException w:name="Outline List 1" w:semiHidden="1" w:unhideWhenUsed="1"/>
-    <w:lsdException w:name="Outline List 2" w:semiHidden="1" w:unhideWhenUsed="1"/>
-    <w:lsdException w:name="Outline List 3" w:semiHidden="1" w:unhideWhenUsed="1"/>
-    <w:lsdException w:name="Table Simple 1" w:semiHidden="1" w:unhideWhenUsed="1"/>
-    <w:lsdException w:name="Table Simple 2" w:semiHidden="1" w:unhideWhenUsed="1"/>
-    <w:lsdException w:name="Table Simple 3" w:semiHidden="1" w:unhideWhenUsed="1"/>
-    <w:lsdException w:name="Table Classic 1" w:semiHidden="1" w:unhideWhenUsed="1"/>
-    <w:lsdException w:name="Table Classic 2" w:semiHidden="1" w:unhideWhenUsed="1"/>
-    <w:lsdException w:name="Table Classic 3" w:semiHidden="1" w:unhideWhenUsed="1"/>
-    <w:lsdException w:name="Table Classic 4" w:semiHidden="1" w:unhideWhenUsed="1"/>
-    <w:lsdException w:name="Table Colorful 1" w:semiHidden="1" w:unhideWhenUsed="1"/>
-    <w:lsdException w:name="Table Colorful 2" w:semiHidden="1" w:unhideWhenUsed="1"/>
-    <w:lsdException w:name="Table Colorful 3" w:semiHidden="1" w:unhideWhenUsed="1"/>
-    <w:lsdException w:name="Table Columns 1" w:semiHidden="1" w:unhideWhenUsed="1"/>
-    <w:lsdException w:name="Table Columns 2" w:semiHidden="1" w:unhideWhenUsed="1"/>
-    <w:lsdException w:name="Table Columns 3" w:semiHidden="1" w:unhideWhenUsed="1"/>
-    <w:lsdException w:name="Table Columns 4" w:semiHidden="1" w:unhideWhenUsed="1"/>
-    <w:lsdException w:name="Table Columns 5" w:semiHidden="1" w:unhideWhenUsed="1"/>
-    <w:lsdException w:name="Table Grid 1" w:semiHidden="1" w:unhideWhenUsed="1"/>
-    <w:lsdException w:name="Table Grid 2" w:semiHidden="1" w:unhideWhenUsed="1"/>
-    <w:lsdException w:name="Table Grid 3" w:semiHidden="1" w:unhideWhenUsed="1"/>
-    <w:lsdException w:name="Table Grid 4" w:semiHidden="1" w:unhideWhenUsed="1"/>
-    <w:lsdException w:name="Table Grid 5" w:semiHidden="1" w:unhideWhenUsed="1"/>
-    <w:lsdException w:name="Table Grid 6" w:semiHidden="1" w:unhideWhenUsed="1"/>
-    <w:lsdException w:name="Table Grid 7" w:semiHidden="1" w:unhideWhenUsed="1"/>
-    <w:lsdException w:name="Table Grid 8" w:semiHidden="1" w:unhideWhenUsed="1"/>
-    <w:lsdException w:name="Table List 1" w:semiHidden="1" w:unhideWhenUsed="1"/>
-    <w:lsdException w:name="Table List 2" w:semiHidden="1" w:unhideWhenUsed="1"/>
-    <w:lsdException w:name="Table List 3" w:semiHidden="1" w:unhideWhenUsed="1"/>
-    <w:lsdException w:name="Table List 4" w:semiHidden="1" w:unhideWhenUsed="1"/>
-    <w:lsdException w:name="Table List 5" w:semiHidden="1" w:unhideWhenUsed="1"/>
-    <w:lsdException w:name="Table List 6" w:semiHidden="1" w:unhideWhenUsed="1"/>
-    <w:lsdException w:name="Table List 7" w:semiHidden="1" w:unhideWhenUsed="1"/>
-    <w:lsdException w:name="Table List 8" w:semiHidden="1" w:unhideWhenUsed="1"/>
-    <w:lsdException w:name="Table 3D effects 1" w:semiHidden="1" w:unhideWhenUsed="1"/>
-    <w:lsdException w:name="Table 3D effects 2" w:semiHidden="1" w:unhideWhenUsed="1"/>
-    <w:lsdException w:name="Table 3D effects 3" w:semiHidden="1" w:unhideWhenUsed="1"/>
-    <w:lsdException w:name="Table Contemporary" w:semiHidden="1" w:unhideWhenUsed="1"/>
-    <w:lsdException w:name="Table Elegant" w:semiHidden="1" w:unhideWhenUsed="1"/>
-    <w:lsdException w:name="Table Professional" w:semiHidden="1" w:unhideWhenUsed="1"/>
-    <w:lsdException w:name="Table Subtle 1" w:semiHidden="1" w:unhideWhenUsed="1"/>
-    <w:lsdException w:name="Table Subtle 2" w:semiHidden="1" w:unhideWhenUsed="1"/>
-    <w:lsdException w:name="Table Web 1" w:semiHidden="1" w:unhideWhenUsed="1"/>
-    <w:lsdException w:name="Table Web 2" w:semiHidden="1" w:unhideWhenUsed="1"/>
-    <w:lsdException w:name="Table Web 3" w:semiHidden="1" w:unhideWhenUsed="1"/>
-    <w:lsdException w:name="Balloon Text" w:semiHidden="1" w:unhideWhenUsed="1"/>
-    <w:lsdException w:name="Table Grid" w:uiPriority="39"/>
-    <w:lsdException w:name="Table Theme" w:semiHidden="1" w:unhideWhenUsed="1"/>
-    <w:lsdException w:name="Placeholder Text" w:semiHidden="1"/>
-    <w:lsdException w:name="No Spacing" w:uiPriority="1" w:qFormat="1"/>
-    <w:lsdException w:name="Light Shading" w:uiPriority="60"/>
-    <w:lsdException w:name="Light List" w:uiPriority="61"/>
-    <w:lsdException w:name="Light Grid" w:uiPriority="62"/>
-    <w:lsdException w:name="Medium Shading 1" w:uiPriority="63"/>
-    <w:lsdException w:name="Medium Shading 2" w:uiPriority="64"/>
-    <w:lsdException w:name="Medium List 1" w:uiPriority="65"/>
-    <w:lsdException w:name="Medium List 2" w:uiPriority="66"/>
-    <w:lsdException w:name="Medium Grid 1" w:uiPriority="67"/>
-    <w:lsdException w:name="Medium Grid 2" w:uiPriority="68"/>
-    <w:lsdException w:name="Medium Grid 3" w:uiPriority="69"/>
-    <w:lsdException w:name="Dark List" w:uiPriority="70"/>
-    <w:lsdException w:name="Colorful Shading" w:uiPriority="71"/>
-    <w:lsdException w:name="Colorful List" w:uiPriority="72"/>
-    <w:lsdException w:name="Colorful Grid" w:uiPriority="73"/>
-    <w:lsdException w:name="Light Shading Accent 1" w:uiPriority="60"/>
-    <w:lsdException w:name="Light List Accent 1" w:uiPriority="61"/>
-    <w:lsdException w:name="Light Grid Accent 1" w:uiPriority="62"/>
-    <w:lsdException w:name="Medium Shading 1 Accent 1" w:uiPriority="63"/>
-    <w:lsdException w:name="Medium Shading 2 Accent 1" w:uiPriority="64"/>
-    <w:lsdException w:name="Medium List 1 Accent 1" w:uiPriority="65"/>
-    <w:lsdException w:name="Revision" w:semiHidden="1"/>
-    <w:lsdException w:name="List Paragraph" w:uiPriority="34" w:qFormat="1"/>
-    <w:lsdException w:name="Quote" w:uiPriority="29" w:qFormat="1"/>
-    <w:lsdException w:name="Intense Quote" w:uiPriority="30" w:qFormat="1"/>
-    <w:lsdException w:name="Medium List 2 Accent 1" w:uiPriority="66"/>
-    <w:lsdException w:name="Medium Grid 1 Accent 1" w:uiPriority="67"/>
-    <w:lsdException w:name="Medium Grid 2 Accent 1" w:uiPriority="68"/>
-    <w:lsdException w:name="Medium Grid 3 Accent 1" w:uiPriority="69"/>
-    <w:lsdException w:name="Dark List Accent 1" w:uiPriority="70"/>
-    <w:lsdException w:name="Colorful Shading Accent 1" w:uiPriority="71"/>
-    <w:lsdException w:name="Colorful List Accent 1" w:uiPriority="72"/>
-    <w:lsdException w:name="Colorful Grid Accent 1" w:uiPriority="73"/>
-    <w:lsdException w:name="Light Shading Accent 2" w:uiPriority="60"/>
-    <w:lsdException w:name="Light List Accent 2" w:uiPriority="61"/>
-    <w:lsdException w:name="Light Grid Accent 2" w:uiPriority="62"/>
-    <w:lsdException w:name="Medium Shading 1 Accent 2" w:uiPriority="63"/>
-    <w:lsdException w:name="Medium Shading 2 Accent 2" w:uiPriority="64"/>
-    <w:lsdException w:name="Medium List 1 Accent 2" w:uiPriority="65"/>
-    <w:lsdException w:name="Medium List 2 Accent 2" w:uiPriority="66"/>
-    <w:lsdException w:name="Medium Grid 1 Accent 2" w:uiPriority="67"/>
-    <w:lsdException w:name="Medium Grid 2 Accent 2" w:uiPriority="68"/>
-    <w:lsdException w:name="Medium Grid 3 Accent 2" w:uiPriority="69"/>
-    <w:lsdException w:name="Dark List Accent 2" w:uiPriority="70"/>
-    <w:lsdException w:name="Colorful Shading Accent 2" w:uiPriority="71"/>
-    <w:lsdException w:name="Colorful List Accent 2" w:uiPriority="72"/>
-    <w:lsdException w:name="Colorful Grid Accent 2" w:uiPriority="73"/>
-    <w:lsdException w:name="Light Shading Accent 3" w:uiPriority="60"/>
-    <w:lsdException w:name="Light List Accent 3" w:uiPriority="61"/>
-    <w:lsdException w:name="Light Grid Accent 3" w:uiPriority="62"/>
-    <w:lsdException w:name="Medium Shading 1 Accent 3" w:uiPriority="63"/>
-    <w:lsdException w:name="Medium Shading 2 Accent 3" w:uiPriority="64"/>
-    <w:lsdException w:name="Medium List 1 Accent 3" w:uiPriority="65"/>
-    <w:lsdException w:name="Medium List 2 Accent 3" w:uiPriority="66"/>
-    <w:lsdException w:name="Medium Grid 1 Accent 3" w:uiPriority="67"/>
-    <w:lsdException w:name="Medium Grid 2 Accent 3" w:uiPriority="68"/>
-    <w:lsdException w:name="Medium Grid 3 Accent 3" w:uiPriority="69"/>
-    <w:lsdException w:name="Dark List Accent 3" w:uiPriority="70"/>
-    <w:lsdException w:name="Colorful Shading Accent 3" w:uiPriority="71"/>
-    <w:lsdException w:name="Colorful List Accent 3" w:uiPriority="72"/>
-    <w:lsdException w:name="Colorful Grid Accent 3" w:uiPriority="73"/>
-    <w:lsdException w:name="Light Shading Accent 4" w:uiPriority="60"/>
-    <w:lsdException w:name="Light List Accent 4" w:uiPriority="61"/>
-    <w:lsdException w:name="Light Grid Accent 4" w:uiPriority="62"/>
-    <w:lsdException w:name="Medium Shading 1 Accent 4" w:uiPriority="63"/>
-    <w:lsdException w:name="Medium Shading 2 Accent 4" w:uiPriority="64"/>
-    <w:lsdException w:name="Medium List 1 Accent 4" w:uiPriority="65"/>
-    <w:lsdException w:name="Medium List 2 Accent 4" w:uiPriority="66"/>
-    <w:lsdException w:name="Medium Grid 1 Accent 4" w:uiPriority="67"/>
-    <w:lsdException w:name="Medium Grid 2 Accent 4" w:uiPriority="68"/>
-    <w:lsdException w:name="Medium Grid 3 Accent 4" w:uiPriority="69"/>
-    <w:lsdException w:name="Dark List Accent 4" w:uiPriority="70"/>
-    <w:lsdException w:name="Colorful Shading Accent 4" w:uiPriority="71"/>
-    <w:lsdException w:name="Colorful List Accent 4" w:uiPriority="72"/>
-    <w:lsdException w:name="Colorful Grid Accent 4" w:uiPriority="73"/>
-    <w:lsdException w:name="Light Shading Accent 5" w:uiPriority="60"/>
-    <w:lsdException w:name="Light List Accent 5" w:uiPriority="61"/>
-    <w:lsdException w:name="Light Grid Accent 5" w:uiPriority="62"/>
-    <w:lsdException w:name="Medium Shading 1 Accent 5" w:uiPriority="63"/>
-    <w:lsdException w:name="Medium Shading 2 Accent 5" w:uiPriority="64"/>
-    <w:lsdException w:name="Medium List 1 Accent 5" w:uiPriority="65"/>
-    <w:lsdException w:name="Medium List 2 Accent 5" w:uiPriority="66"/>
-    <w:lsdException w:name="Medium Grid 1 Accent 5" w:uiPriority="67"/>
-    <w:lsdException w:name="Medium Grid 2 Accent 5" w:uiPriority="68"/>
-    <w:lsdException w:name="Medium Grid 3 Accent 5" w:uiPriority="69"/>
-    <w:lsdException w:name="Dark List Accent 5" w:uiPriority="70"/>
-    <w:lsdException w:name="Colorful Shading Accent 5" w:uiPriority="71"/>
-    <w:lsdException w:name="Colorful List Accent 5" w:uiPriority="72"/>
-    <w:lsdException w:name="Colorful Grid Accent 5" w:uiPriority="73"/>
-    <w:lsdException w:name="Light Shading Accent 6" w:uiPriority="60"/>
-    <w:lsdException w:name="Light List Accent 6" w:uiPriority="61"/>
-    <w:lsdException w:name="Light Grid Accent 6" w:uiPriority="62"/>
-    <w:lsdException w:name="Medium Shading 1 Accent 6" w:uiPriority="63"/>
-    <w:lsdException w:name="Medium Shading 2 Accent 6" w:uiPriority="64"/>
-    <w:lsdException w:name="Medium List 1 Accent 6" w:uiPriority="65"/>
-    <w:lsdException w:name="Medium List 2 Accent 6" w:uiPriority="66"/>
-    <w:lsdException w:name="Medium Grid 1 Accent 6" w:uiPriority="67"/>
-    <w:lsdException w:name="Medium Grid 2 Accent 6" w:uiPriority="68"/>
-    <w:lsdException w:name="Medium Grid 3 Accent 6" w:uiPriority="69"/>
-    <w:lsdException w:name="Dark List Accent 6" w:uiPriority="70"/>
-    <w:lsdException w:name="Colorful Shading Accent 6" w:uiPriority="71"/>
-    <w:lsdException w:name="Colorful List Accent 6" w:uiPriority="72"/>
-    <w:lsdException w:name="Colorful Grid Accent 6" w:uiPriority="73"/>
-    <w:lsdException w:name="Subtle Emphasis" w:uiPriority="19" w:qFormat="1"/>
-    <w:lsdException w:name="Intense Emphasis" w:uiPriority="21" w:qFormat="1"/>
-    <w:lsdException w:name="Subtle Reference" w:uiPriority="31" w:qFormat="1"/>
-    <w:lsdException w:name="Intense Reference" w:uiPriority="32" w:qFormat="1"/>
-    <w:lsdException w:name="Book Title" w:uiPriority="33" w:qFormat="1"/>
-    <w:lsdException w:name="Bibliography" w:semiHidden="1" w:uiPriority="37" w:unhideWhenUsed="1"/>
-    <w:lsdException w:name="TOC Heading" w:semiHidden="1" w:uiPriority="39" w:unhideWhenUsed="1" w:qFormat="1"/>
-    <w:lsdException w:name="Plain Table 1" w:uiPriority="41"/>
-    <w:lsdException w:name="Plain Table 2" w:uiPriority="42"/>
-    <w:lsdException w:name="Plain Table 3" w:uiPriority="43"/>
-    <w:lsdException w:name="Plain Table 4" w:uiPriority="44"/>
-    <w:lsdException w:name="Plain Table 5" w:uiPriority="45"/>
-    <w:lsdException w:name="Grid Table Light" w:uiPriority="40"/>
-    <w:lsdException w:name="Grid Table 1 Light" w:uiPriority="46"/>
-    <w:lsdException w:name="Grid Table 2" w:uiPriority="47"/>
-    <w:lsdException w:name="Grid Table 3" w:uiPriority="48"/>
-    <w:lsdException w:name="Grid Table 4" w:uiPriority="49"/>
-    <w:lsdException w:name="Grid Table 5 Dark" w:uiPriority="50"/>
-    <w:lsdException w:name="Grid Table 6 Colorful" w:uiPriority="51"/>
-    <w:lsdException w:name="Grid Table 7 Colorful" w:uiPriority="52"/>
-    <w:lsdException w:name="Grid Table 1 Light Accent 1" w:uiPriority="46"/>
-    <w:lsdException w:name="Grid Table 2 Accent 1" w:uiPriority="47"/>
-    <w:lsdException w:name="Grid Table 3 Accent 1" w:uiPriority="48"/>
-    <w:lsdException w:name="Grid Table 4 Accent 1" w:uiPriority="49"/>
-    <w:lsdException w:name="Grid Table 5 Dark Accent 1" w:uiPriority="50"/>
-    <w:lsdException w:name="Grid Table 6 Colorful Accent 1" w:uiPriority="51"/>
-    <w:lsdException w:name="Grid Table 7 Colorful Accent 1" w:uiPriority="52"/>
-    <w:lsdException w:name="Grid Table 1 Light Accent 2" w:uiPriority="46"/>
-    <w:lsdException w:name="Grid Table 2 Accent 2" w:uiPriority="47"/>
-    <w:lsdException w:name="Grid Table 3 Accent 2" w:uiPriority="48"/>
-    <w:lsdException w:name="Grid Table 4 Accent 2" w:uiPriority="49"/>
-    <w:lsdException w:name="Grid Table 5 Dark Accent 2" w:uiPriority="50"/>
-    <w:lsdException w:name="Grid Table 6 Colorful Accent 2" w:uiPriority="51"/>
-    <w:lsdException w:name="Grid Table 7 Colorful Accent 2" w:uiPriority="52"/>
-    <w:lsdException w:name="Grid Table 1 Light Accent 3" w:uiPriority="46"/>
-    <w:lsdException w:name="Grid Table 2 Accent 3" w:uiPriority="47"/>
-    <w:lsdException w:name="Grid Table 3 Accent 3" w:uiPriority="48"/>
-    <w:lsdException w:name="Grid Table 4 Accent 3" w:uiPriority="49"/>
-    <w:lsdException w:name="Grid Table 5 Dark Accent 3" w:uiPriority="50"/>
-    <w:lsdException w:name="Grid Table 6 Colorful Accent 3" w:uiPriority="51"/>
-    <w:lsdException w:name="Grid Table 7 Colorful Accent 3" w:uiPriority="52"/>
-    <w:lsdException w:name="Grid Table 1 Light Accent 4" w:uiPriority="46"/>
-    <w:lsdException w:name="Grid Table 2 Accent 4" w:uiPriority="47"/>
-    <w:lsdException w:name="Grid Table 3 Accent 4" w:uiPriority="48"/>
-    <w:lsdException w:name="Grid Table 4 Accent 4" w:uiPriority="49"/>
-    <w:lsdException w:name="Grid Table 5 Dark Accent 4" w:uiPriority="50"/>
-    <w:lsdException w:name="Grid Table 6 Colorful Accent 4" w:uiPriority="51"/>
-    <w:lsdException w:name="Grid Table 7 Colorful Accent 4" w:uiPriority="52"/>
-    <w:lsdException w:name="Grid Table 1 Light Accent 5" w:uiPriority="46"/>
-    <w:lsdException w:name="Grid Table 2 Accent 5" w:uiPriority="47"/>
-    <w:lsdException w:name="Grid Table 3 Accent 5" w:uiPriority="48"/>
-    <w:lsdException w:name="Grid Table 4 Accent 5" w:uiPriority="49"/>
-    <w:lsdException w:name="Grid Table 5 Dark Accent 5" w:uiPriority="50"/>
-    <w:lsdException w:name="Grid Table 6 Colorful Accent 5" w:uiPriority="51"/>
-    <w:lsdException w:name="Grid Table 7 Colorful Accent 5" w:uiPriority="52"/>
-    <w:lsdException w:name="Grid Table 1 Light Accent 6" w:uiPriority="46"/>
-    <w:lsdException w:name="Grid Table 2 Accent 6" w:uiPriority="47"/>
-    <w:lsdException w:name="Grid Table 3 Accent 6" w:uiPriority="48"/>
-    <w:lsdException w:name="Grid Table 4 Accent 6" w:uiPriority="49"/>
-    <w:lsdException w:name="Grid Table 5 Dark Accent 6" w:uiPriority="50"/>
-    <w:lsdException w:name="Grid Table 6 Colorful Accent 6" w:uiPriority="51"/>
-    <w:lsdException w:name="Grid Table 7 Colorful Accent 6" w:uiPriority="52"/>
-    <w:lsdException w:name="List Table 1 Light" w:uiPriority="46"/>
-    <w:lsdException w:name="List Table 2" w:uiPriority="47"/>
-    <w:lsdException w:name="List Table 3" w:uiPriority="48"/>
-    <w:lsdException w:name="List Table 4" w:uiPriority="49"/>
-    <w:lsdException w:name="List Table 5 Dark" w:uiPriority="50"/>
-    <w:lsdException w:name="List Table 6 Colorful" w:uiPriority="51"/>
-    <w:lsdException w:name="List Table 7 Colorful" w:uiPriority="52"/>
-    <w:lsdException w:name="List Table 1 Light Accent 1" w:uiPriority="46"/>
-    <w:lsdException w:name="List Table 2 Accent 1" w:uiPriority="47"/>
-    <w:lsdException w:name="List Table 3 Accent 1" w:uiPriority="48"/>
-    <w:lsdException w:name="List Table 4 Accent 1" w:uiPriority="49"/>
-    <w:lsdException w:name="List Table 5 Dark Accent 1" w:uiPriority="50"/>
-    <w:lsdException w:name="List Table 6 Colorful Accent 1" w:uiPriority="51"/>
-    <w:lsdException w:name="List Table 7 Colorful Accent 1" w:uiPriority="52"/>
-    <w:lsdException w:name="List Table 1 Light Accent 2" w:uiPriority="46"/>
-    <w:lsdException w:name="List Table 2 Accent 2" w:uiPriority="47"/>
-    <w:lsdException w:name="List Table 3 Accent 2" w:uiPriority="48"/>
-    <w:lsdException w:name="List Table 4 Accent 2" w:uiPriority="49"/>
-    <w:lsdException w:name="List Table 5 Dark Accent 2" w:uiPriority="50"/>
-    <w:lsdException w:name="List Table 6 Colorful Accent 2" w:uiPriority="51"/>
-    <w:lsdException w:name="List Table 7 Colorful Accent 2" w:uiPriority="52"/>
-    <w:lsdException w:name="List Table 1 Light Accent 3" w:uiPriority="46"/>
-    <w:lsdException w:name="List Table 2 Accent 3" w:uiPriority="47"/>
-    <w:lsdException w:name="List Table 3 Accent 3" w:uiPriority="48"/>
-    <w:lsdException w:name="List Table 4 Accent 3" w:uiPriority="49"/>
-    <w:lsdException w:name="List Table 5 Dark Accent 3" w:uiPriority="50"/>
-    <w:lsdException w:name="List Table 6 Colorful Accent 3" w:uiPriority="51"/>
-    <w:lsdException w:name="List Table 7 Colorful Accent 3" w:uiPriority="52"/>
-    <w:lsdException w:name="List Table 1 Light Accent 4" w:uiPriority="46"/>
-    <w:lsdException w:name="List Table 2 Accent 4" w:uiPriority="47"/>
-    <w:lsdException w:name="List Table 3 Accent 4" w:uiPriority="48"/>
-    <w:lsdException w:name="List Table 4 Accent 4" w:uiPriority="49"/>
-    <w:lsdException w:name="List Table 5 Dark Accent 4" w:uiPriority="50"/>
-    <w:lsdException w:name="List Table 6 Colorful Accent 4" w:uiPriority="51"/>
-    <w:lsdException w:name="List Table 7 Colorful Accent 4" w:uiPriority="52"/>
-    <w:lsdException w:name="List Table 1 Light Accent 5" w:uiPriority="46"/>
-    <w:lsdException w:name="List Table 2 Accent 5" w:uiPriority="47"/>
-    <w:lsdException w:name="List Table 3 Accent 5" w:uiPriority="48"/>
-    <w:lsdException w:name="List Table 4 Accent 5" w:uiPriority="49"/>
-    <w:lsdException w:name="List Table 5 Dark Accent 5" w:uiPriority="50"/>
-    <w:lsdException w:name="List Table 6 Colorful Accent 5" w:uiPriority="51"/>
-    <w:lsdException w:name="List Table 7 Colorful Accent 5" w:uiPriority="52"/>
-    <w:lsdException w:name="List Table 1 Light Accent 6" w:uiPriority="46"/>
-    <w:lsdException w:name="List Table 2 Accent 6" w:uiPriority="47"/>
-    <w:lsdException w:name="List Table 3 Accent 6" w:uiPriority="48"/>
-    <w:lsdException w:name="List Table 4 Accent 6" w:uiPriority="49"/>
-    <w:lsdException w:name="List Table 5 Dark Accent 6" w:uiPriority="50"/>
-    <w:lsdException w:name="List Table 6 Colorful Accent 6" w:uiPriority="51"/>
-    <w:lsdException w:name="List Table 7 Colorful Accent 6" w:uiPriority="52"/>
-  </w:latentStyles>
-  <w:style w:type="paragraph" w:default="1" w:styleId="Normal">
-    <w:name w:val="Normal"/>
-    <w:qFormat/>
-  </w:style>
-  <w:style w:type="character" w:default="1" w:styleId="DefaultParagraphFont">
-    <w:name w:val="Default Paragraph Font"/>
-    <w:uiPriority w:val="1"/>
-    <w:semiHidden/>
-    <w:unhideWhenUsed/>
-  </w:style>
-  <w:style w:type="table" w:default="1" w:styleId="TableNormal">
-    <w:name w:val="Normal Table"/>
-    <w:uiPriority w:val="99"/>
-    <w:semiHidden/>
-    <w:unhideWhenUsed/>
-    <w:tblPr>
-      <w:tblInd w:w="0" w:type="dxa"/>
-      <w:tblCellMar>
-        <w:top w:w="0" w:type="dxa"/>
-        <w:left w:w="108" w:type="dxa"/>
-        <w:bottom w:w="0" w:type="dxa"/>
-        <w:right w:w="108" w:type="dxa"/>
-      </w:tblCellMar>
-    </w:tblPr>
-  </w:style>
-  <w:style w:type="numbering" w:default="1" w:styleId="NoList">
-    <w:name w:val="No List"/>
-    <w:uiPriority w:val="99"/>
-    <w:semiHidden/>
-    <w:unhideWhenUsed/>
-  </w:style>
-  <w:style w:type="paragraph" w:customStyle="1" w:styleId="EE48694046E548C9BFF7F91BCC3ECF2D">
-    <w:name w:val="EE48694046E548C9BFF7F91BCC3ECF2D"/>
-    <w:rsid w:val="00E83799"/>
-  </w:style>
-  <w:style w:type="paragraph" w:customStyle="1" w:styleId="356849A94539473996FF5D8D64945F4B">
-    <w:name w:val="356849A94539473996FF5D8D64945F4B"/>
-    <w:rsid w:val="00E83799"/>
-  </w:style>
-  <w:style w:type="paragraph" w:customStyle="1" w:styleId="F794098067B1447E84F243C09BDBD9EF">
-    <w:name w:val="F794098067B1447E84F243C09BDBD9EF"/>
-    <w:rsid w:val="00E83799"/>
-  </w:style>
-</w:styles>
-</file>
-
-<file path=word/glossary/webSettings.xml><?xml version="1.0" encoding="utf-8"?>
-<w:webSettings xmlns:mc="http://schemas.openxmlformats.org/markup-compatibility/2006" xmlns:r="http://schemas.openxmlformats.org/officeDocument/2006/relationships" xmlns:w="http://schemas.openxmlformats.org/wordprocessingml/2006/main" xmlns:w14="http://schemas.microsoft.com/office/word/2010/wordml" xmlns:w15="http://schemas.microsoft.com/office/word/2012/wordml" xmlns:w16se="http://schemas.microsoft.com/office/word/2015/wordml/symex" mc:Ignorable="w14 w15 w16se">
-  <w:optimizeForBrowser/>
-  <w:allowPNG/>
-</w:webSettings>
-</file>
-
 <file path=word/theme/theme1.xml><?xml version="1.0" encoding="utf-8"?>
 <a:theme xmlns:a="http://schemas.openxmlformats.org/drawingml/2006/main" name="Office Theme">
   <a:themeElements>
@@ -21301,7 +20614,7 @@
 </file>
 
 <file path=customXml/itemProps1.xml><?xml version="1.0" encoding="utf-8"?>
-<ds:datastoreItem xmlns:ds="http://schemas.openxmlformats.org/officeDocument/2006/customXml" ds:itemID="{F7921FF0-9E50-47E1-92AC-AD7CD41F2028}">
+<ds:datastoreItem xmlns:ds="http://schemas.openxmlformats.org/officeDocument/2006/customXml" ds:itemID="{5AAE8BD2-1B12-437B-8986-B24696FCA965}">
   <ds:schemaRefs>
     <ds:schemaRef ds:uri="http://schemas.openxmlformats.org/officeDocument/2006/bibliography"/>
   </ds:schemaRefs>

</xml_diff>

<commit_message>
master work part 4
</commit_message>
<xml_diff>
--- a/Dokumentacija/FTN_MSc_AleksaPopov.docx
+++ b/Dokumentacija/FTN_MSc_AleksaPopov.docx
@@ -71,7 +71,7 @@
                 <v:shape id="_x0000_i1025" type="#_x0000_t75" style="width:64.5pt;height:64.5pt" o:ole="" fillcolor="window">
                   <v:imagedata r:id="rId8" o:title=""/>
                 </v:shape>
-                <o:OLEObject Type="Embed" ProgID="CorelDraw.Graphic.7" ShapeID="_x0000_i1025" DrawAspect="Content" ObjectID="_1818951941" r:id="rId9"/>
+                <o:OLEObject Type="Embed" ProgID="CorelDraw.Graphic.7" ShapeID="_x0000_i1025" DrawAspect="Content" ObjectID="_1818974433" r:id="rId9"/>
               </w:object>
             </w:r>
           </w:p>
@@ -7652,7 +7652,7 @@
           <w:r>
             <w:fldChar w:fldCharType="separate"/>
           </w:r>
-          <w:hyperlink w:anchor="_Toc208316265" w:history="1">
+          <w:hyperlink w:anchor="_Toc208342006" w:history="1">
             <w:r>
               <w:rPr>
                 <w:rStyle w:val="Hyperlink"/>
@@ -7679,23 +7679,15 @@
               <w:rPr>
                 <w:noProof/>
                 <w:webHidden/>
-                <w:lang w:val="sr-Cyrl-RS"/>
-              </w:rPr>
-              <w:t>....................................................................................................................................................</w:t>
+              </w:rPr>
+              <w:fldChar w:fldCharType="begin"/>
             </w:r>
             <w:r>
               <w:rPr>
                 <w:noProof/>
                 <w:webHidden/>
               </w:rPr>
-              <w:fldChar w:fldCharType="begin"/>
-            </w:r>
-            <w:r>
-              <w:rPr>
-                <w:noProof/>
-                <w:webHidden/>
-              </w:rPr>
-              <w:instrText xml:space="preserve"> PAGEREF _Toc208316265 \h </w:instrText>
+              <w:instrText xml:space="preserve"> PAGEREF _Toc208342006 \h </w:instrText>
             </w:r>
             <w:r>
               <w:rPr>
@@ -7735,7 +7727,7 @@
               <w:lang w:val="en-US"/>
             </w:rPr>
           </w:pPr>
-          <w:hyperlink w:anchor="_Toc208316266" w:history="1">
+          <w:hyperlink w:anchor="_Toc208342007" w:history="1">
             <w:r>
               <w:rPr>
                 <w:rStyle w:val="Hyperlink"/>
@@ -7770,7 +7762,7 @@
                 <w:noProof/>
                 <w:webHidden/>
               </w:rPr>
-              <w:instrText xml:space="preserve"> PAGEREF _Toc208316266 \h </w:instrText>
+              <w:instrText xml:space="preserve"> PAGEREF _Toc208342007 \h </w:instrText>
             </w:r>
             <w:r>
               <w:rPr>
@@ -7810,7 +7802,7 @@
               <w:lang w:val="en-US"/>
             </w:rPr>
           </w:pPr>
-          <w:hyperlink w:anchor="_Toc208316267" w:history="1">
+          <w:hyperlink w:anchor="_Toc208342008" w:history="1">
             <w:r>
               <w:rPr>
                 <w:rStyle w:val="Hyperlink"/>
@@ -7845,7 +7837,7 @@
                 <w:noProof/>
                 <w:webHidden/>
               </w:rPr>
-              <w:instrText xml:space="preserve"> PAGEREF _Toc208316267 \h </w:instrText>
+              <w:instrText xml:space="preserve"> PAGEREF _Toc208342008 \h </w:instrText>
             </w:r>
             <w:r>
               <w:rPr>
@@ -7887,7 +7879,7 @@
               <w:noProof/>
             </w:rPr>
           </w:pPr>
-          <w:hyperlink w:anchor="_Toc208316268" w:history="1">
+          <w:hyperlink w:anchor="_Toc208342009" w:history="1">
             <w:r>
               <w:rPr>
                 <w:rStyle w:val="Hyperlink"/>
@@ -7922,7 +7914,7 @@
                 <w:noProof/>
                 <w:webHidden/>
               </w:rPr>
-              <w:instrText xml:space="preserve"> PAGEREF _Toc208316268 \h </w:instrText>
+              <w:instrText xml:space="preserve"> PAGEREF _Toc208342009 \h </w:instrText>
             </w:r>
             <w:r>
               <w:rPr>
@@ -7964,7 +7956,7 @@
               <w:noProof/>
             </w:rPr>
           </w:pPr>
-          <w:hyperlink w:anchor="_Toc208316269" w:history="1">
+          <w:hyperlink w:anchor="_Toc208342010" w:history="1">
             <w:r>
               <w:rPr>
                 <w:rStyle w:val="Hyperlink"/>
@@ -8007,7 +7999,7 @@
                 <w:noProof/>
                 <w:webHidden/>
               </w:rPr>
-              <w:instrText xml:space="preserve"> PAGEREF _Toc208316269 \h </w:instrText>
+              <w:instrText xml:space="preserve"> PAGEREF _Toc208342010 \h </w:instrText>
             </w:r>
             <w:r>
               <w:rPr>
@@ -8049,7 +8041,7 @@
               <w:noProof/>
             </w:rPr>
           </w:pPr>
-          <w:hyperlink w:anchor="_Toc208316270" w:history="1">
+          <w:hyperlink w:anchor="_Toc208342011" w:history="1">
             <w:r>
               <w:rPr>
                 <w:rStyle w:val="Hyperlink"/>
@@ -8092,7 +8084,7 @@
                 <w:noProof/>
                 <w:webHidden/>
               </w:rPr>
-              <w:instrText xml:space="preserve"> PAGEREF _Toc208316270 \h </w:instrText>
+              <w:instrText xml:space="preserve"> PAGEREF _Toc208342011 \h </w:instrText>
             </w:r>
             <w:r>
               <w:rPr>
@@ -8134,7 +8126,7 @@
               <w:noProof/>
             </w:rPr>
           </w:pPr>
-          <w:hyperlink w:anchor="_Toc208316271" w:history="1">
+          <w:hyperlink w:anchor="_Toc208342012" w:history="1">
             <w:r>
               <w:rPr>
                 <w:rStyle w:val="Hyperlink"/>
@@ -8169,7 +8161,7 @@
                 <w:noProof/>
                 <w:webHidden/>
               </w:rPr>
-              <w:instrText xml:space="preserve"> PAGEREF _Toc208316271 \h </w:instrText>
+              <w:instrText xml:space="preserve"> PAGEREF _Toc208342012 \h </w:instrText>
             </w:r>
             <w:r>
               <w:rPr>
@@ -8211,7 +8203,7 @@
               <w:noProof/>
             </w:rPr>
           </w:pPr>
-          <w:hyperlink w:anchor="_Toc208316272" w:history="1">
+          <w:hyperlink w:anchor="_Toc208342013" w:history="1">
             <w:r>
               <w:rPr>
                 <w:rStyle w:val="Hyperlink"/>
@@ -8239,7 +8231,7 @@
                 <w:noProof/>
                 <w:webHidden/>
               </w:rPr>
-              <w:instrText xml:space="preserve"> PAGEREF _Toc208316272 \h </w:instrText>
+              <w:instrText xml:space="preserve"> PAGEREF _Toc208342013 \h </w:instrText>
             </w:r>
             <w:r>
               <w:rPr>
@@ -8279,7 +8271,7 @@
               <w:lang w:val="en-US"/>
             </w:rPr>
           </w:pPr>
-          <w:hyperlink w:anchor="_Toc208316273" w:history="1">
+          <w:hyperlink w:anchor="_Toc208342014" w:history="1">
             <w:r>
               <w:rPr>
                 <w:rStyle w:val="Hyperlink"/>
@@ -8314,7 +8306,7 @@
                 <w:noProof/>
                 <w:webHidden/>
               </w:rPr>
-              <w:instrText xml:space="preserve"> PAGEREF _Toc208316273 \h </w:instrText>
+              <w:instrText xml:space="preserve"> PAGEREF _Toc208342014 \h </w:instrText>
             </w:r>
             <w:r>
               <w:rPr>
@@ -8335,83 +8327,6 @@
                 <w:webHidden/>
               </w:rPr>
               <w:t>8</w:t>
-            </w:r>
-            <w:r>
-              <w:rPr>
-                <w:noProof/>
-                <w:webHidden/>
-              </w:rPr>
-              <w:fldChar w:fldCharType="end"/>
-            </w:r>
-          </w:hyperlink>
-        </w:p>
-        <w:p>
-          <w:pPr>
-            <w:pStyle w:val="TOC2"/>
-            <w:tabs>
-              <w:tab w:val="right" w:leader="dot" w:pos="9345"/>
-            </w:tabs>
-            <w:rPr>
-              <w:rFonts w:asciiTheme="minorHAnsi" w:eastAsiaTheme="minorEastAsia" w:hAnsiTheme="minorHAnsi" w:cstheme="minorBidi"/>
-              <w:noProof/>
-            </w:rPr>
-          </w:pPr>
-          <w:hyperlink w:anchor="_Toc208316274" w:history="1">
-            <w:r>
-              <w:rPr>
-                <w:rStyle w:val="Hyperlink"/>
-                <w:noProof/>
-                <w:lang w:val="sr-Cyrl-RS"/>
-              </w:rPr>
-              <w:t xml:space="preserve">3.6 Зашто </w:t>
-            </w:r>
-            <w:r>
-              <w:rPr>
-                <w:rStyle w:val="Hyperlink"/>
-                <w:noProof/>
-              </w:rPr>
-              <w:t>React?</w:t>
-            </w:r>
-            <w:r>
-              <w:rPr>
-                <w:noProof/>
-                <w:webHidden/>
-              </w:rPr>
-              <w:tab/>
-            </w:r>
-            <w:r>
-              <w:rPr>
-                <w:noProof/>
-                <w:webHidden/>
-              </w:rPr>
-              <w:fldChar w:fldCharType="begin"/>
-            </w:r>
-            <w:r>
-              <w:rPr>
-                <w:noProof/>
-                <w:webHidden/>
-              </w:rPr>
-              <w:instrText xml:space="preserve"> PAGEREF _Toc208316274 \h </w:instrText>
-            </w:r>
-            <w:r>
-              <w:rPr>
-                <w:noProof/>
-                <w:webHidden/>
-              </w:rPr>
-            </w:r>
-            <w:r>
-              <w:rPr>
-                <w:noProof/>
-                <w:webHidden/>
-              </w:rPr>
-              <w:fldChar w:fldCharType="separate"/>
-            </w:r>
-            <w:r>
-              <w:rPr>
-                <w:noProof/>
-                <w:webHidden/>
-              </w:rPr>
-              <w:t>9</w:t>
             </w:r>
             <w:r>
               <w:rPr>
@@ -8431,14 +8346,14 @@
               <w:lang w:val="en-US"/>
             </w:rPr>
           </w:pPr>
-          <w:hyperlink w:anchor="_Toc208316275" w:history="1">
+          <w:hyperlink w:anchor="_Toc208342015" w:history="1">
             <w:r>
               <w:rPr>
                 <w:rStyle w:val="Hyperlink"/>
                 <w:noProof/>
                 <w:lang w:val="sr-Cyrl-RS"/>
               </w:rPr>
-              <w:t>4. Модел Података</w:t>
+              <w:t>5. Функционална спецификација система</w:t>
             </w:r>
             <w:r>
               <w:rPr>
@@ -8459,7 +8374,7 @@
                 <w:noProof/>
                 <w:webHidden/>
               </w:rPr>
-              <w:instrText xml:space="preserve"> PAGEREF _Toc208316275 \h </w:instrText>
+              <w:instrText xml:space="preserve"> PAGEREF _Toc208342015 \h </w:instrText>
             </w:r>
             <w:r>
               <w:rPr>
@@ -8499,13 +8414,13 @@
               <w:lang w:val="en-US"/>
             </w:rPr>
           </w:pPr>
-          <w:hyperlink w:anchor="_Toc208316276" w:history="1">
+          <w:hyperlink w:anchor="_Toc208342016" w:history="1">
             <w:r>
               <w:rPr>
                 <w:rStyle w:val="Hyperlink"/>
                 <w:noProof/>
               </w:rPr>
-              <w:t xml:space="preserve">5. Backend </w:t>
+              <w:t>6. А</w:t>
             </w:r>
             <w:r>
               <w:rPr>
@@ -8513,7 +8428,7 @@
                 <w:noProof/>
                 <w:lang w:val="sr-Cyrl-RS"/>
               </w:rPr>
-              <w:t>функционалност</w:t>
+              <w:t>рхитектура система</w:t>
             </w:r>
             <w:r>
               <w:rPr>
@@ -8534,7 +8449,7 @@
                 <w:noProof/>
                 <w:webHidden/>
               </w:rPr>
-              <w:instrText xml:space="preserve"> PAGEREF _Toc208316276 \h </w:instrText>
+              <w:instrText xml:space="preserve"> PAGEREF _Toc208342016 \h </w:instrText>
             </w:r>
             <w:r>
               <w:rPr>
@@ -8554,7 +8469,7 @@
                 <w:noProof/>
                 <w:webHidden/>
               </w:rPr>
-              <w:t>12</w:t>
+              <w:t>11</w:t>
             </w:r>
             <w:r>
               <w:rPr>
@@ -8574,29 +8489,14 @@
               <w:lang w:val="en-US"/>
             </w:rPr>
           </w:pPr>
-          <w:hyperlink w:anchor="_Toc208316277" w:history="1">
+          <w:hyperlink w:anchor="_Toc208342017" w:history="1">
             <w:r>
               <w:rPr>
                 <w:rStyle w:val="Hyperlink"/>
                 <w:noProof/>
                 <w:lang w:val="sr-Cyrl-RS"/>
               </w:rPr>
-              <w:t xml:space="preserve">6.  Архитектура </w:t>
-            </w:r>
-            <w:r>
-              <w:rPr>
-                <w:rStyle w:val="Hyperlink"/>
-                <w:noProof/>
-              </w:rPr>
-              <w:t>frontend</w:t>
-            </w:r>
-            <w:r>
-              <w:rPr>
-                <w:rStyle w:val="Hyperlink"/>
-                <w:noProof/>
-                <w:lang w:val="sr-Cyrl-RS"/>
-              </w:rPr>
-              <w:t xml:space="preserve"> апликације</w:t>
+              <w:t>7.  Модел података</w:t>
             </w:r>
             <w:r>
               <w:rPr>
@@ -8617,7 +8517,7 @@
                 <w:noProof/>
                 <w:webHidden/>
               </w:rPr>
-              <w:instrText xml:space="preserve"> PAGEREF _Toc208316277 \h </w:instrText>
+              <w:instrText xml:space="preserve"> PAGEREF _Toc208342017 \h </w:instrText>
             </w:r>
             <w:r>
               <w:rPr>
@@ -8657,7 +8557,7 @@
               <w:lang w:val="en-US"/>
             </w:rPr>
           </w:pPr>
-          <w:hyperlink w:anchor="_Toc208316278" w:history="1">
+          <w:hyperlink w:anchor="_Toc208342018" w:history="1">
             <w:r>
               <w:rPr>
                 <w:rStyle w:val="Hyperlink"/>
@@ -8692,7 +8592,7 @@
                 <w:noProof/>
                 <w:webHidden/>
               </w:rPr>
-              <w:instrText xml:space="preserve"> PAGEREF _Toc208316278 \h </w:instrText>
+              <w:instrText xml:space="preserve"> PAGEREF _Toc208342018 \h </w:instrText>
             </w:r>
             <w:r>
               <w:rPr>
@@ -8712,7 +8612,7 @@
                 <w:noProof/>
                 <w:webHidden/>
               </w:rPr>
-              <w:t>14</w:t>
+              <w:t>15</w:t>
             </w:r>
             <w:r>
               <w:rPr>
@@ -8732,7 +8632,7 @@
               <w:lang w:val="en-US"/>
             </w:rPr>
           </w:pPr>
-          <w:hyperlink w:anchor="_Toc208316279" w:history="1">
+          <w:hyperlink w:anchor="_Toc208342019" w:history="1">
             <w:r>
               <w:rPr>
                 <w:rStyle w:val="Hyperlink"/>
@@ -8760,7 +8660,7 @@
                 <w:noProof/>
                 <w:webHidden/>
               </w:rPr>
-              <w:instrText xml:space="preserve"> PAGEREF _Toc208316279 \h </w:instrText>
+              <w:instrText xml:space="preserve"> PAGEREF _Toc208342019 \h </w:instrText>
             </w:r>
             <w:r>
               <w:rPr>
@@ -8800,7 +8700,7 @@
               <w:lang w:val="en-US"/>
             </w:rPr>
           </w:pPr>
-          <w:hyperlink w:anchor="_Toc208316280" w:history="1">
+          <w:hyperlink w:anchor="_Toc208342020" w:history="1">
             <w:r>
               <w:rPr>
                 <w:rStyle w:val="Hyperlink"/>
@@ -8835,7 +8735,7 @@
                 <w:noProof/>
                 <w:webHidden/>
               </w:rPr>
-              <w:instrText xml:space="preserve"> PAGEREF _Toc208316280 \h </w:instrText>
+              <w:instrText xml:space="preserve"> PAGEREF _Toc208342020 \h </w:instrText>
             </w:r>
             <w:r>
               <w:rPr>
@@ -8855,7 +8755,7 @@
                 <w:noProof/>
                 <w:webHidden/>
               </w:rPr>
-              <w:t>15</w:t>
+              <w:t>16</w:t>
             </w:r>
             <w:r>
               <w:rPr>
@@ -8875,7 +8775,7 @@
               <w:lang w:val="en-US"/>
             </w:rPr>
           </w:pPr>
-          <w:hyperlink w:anchor="_Toc208316281" w:history="1">
+          <w:hyperlink w:anchor="_Toc208342021" w:history="1">
             <w:r>
               <w:rPr>
                 <w:rStyle w:val="Hyperlink"/>
@@ -8903,7 +8803,7 @@
                 <w:noProof/>
                 <w:webHidden/>
               </w:rPr>
-              <w:instrText xml:space="preserve"> PAGEREF _Toc208316281 \h </w:instrText>
+              <w:instrText xml:space="preserve"> PAGEREF _Toc208342021 \h </w:instrText>
             </w:r>
             <w:r>
               <w:rPr>
@@ -8943,7 +8843,7 @@
               <w:lang w:val="en-US"/>
             </w:rPr>
           </w:pPr>
-          <w:hyperlink w:anchor="_Toc208316282" w:history="1">
+          <w:hyperlink w:anchor="_Toc208342022" w:history="1">
             <w:r>
               <w:rPr>
                 <w:rStyle w:val="Hyperlink"/>
@@ -8978,7 +8878,7 @@
                 <w:noProof/>
                 <w:webHidden/>
               </w:rPr>
-              <w:instrText xml:space="preserve"> PAGEREF _Toc208316282 \h </w:instrText>
+              <w:instrText xml:space="preserve"> PAGEREF _Toc208342022 \h </w:instrText>
             </w:r>
             <w:r>
               <w:rPr>
@@ -8998,7 +8898,7 @@
                 <w:noProof/>
                 <w:webHidden/>
               </w:rPr>
-              <w:t>16</w:t>
+              <w:t>17</w:t>
             </w:r>
             <w:r>
               <w:rPr>
@@ -9018,7 +8918,7 @@
               <w:lang w:val="en-US"/>
             </w:rPr>
           </w:pPr>
-          <w:hyperlink w:anchor="_Toc208316283" w:history="1">
+          <w:hyperlink w:anchor="_Toc208342023" w:history="1">
             <w:r>
               <w:rPr>
                 <w:rStyle w:val="Hyperlink"/>
@@ -9045,7 +8945,7 @@
                 <w:noProof/>
                 <w:webHidden/>
               </w:rPr>
-              <w:instrText xml:space="preserve"> PAGEREF _Toc208316283 \h </w:instrText>
+              <w:instrText xml:space="preserve"> PAGEREF _Toc208342023 \h </w:instrText>
             </w:r>
             <w:r>
               <w:rPr>
@@ -9085,7 +8985,7 @@
               <w:lang w:val="en-US"/>
             </w:rPr>
           </w:pPr>
-          <w:hyperlink w:anchor="_Toc208316284" w:history="1">
+          <w:hyperlink w:anchor="_Toc208342024" w:history="1">
             <w:r>
               <w:rPr>
                 <w:rStyle w:val="Hyperlink"/>
@@ -9120,7 +9020,7 @@
                 <w:noProof/>
                 <w:webHidden/>
               </w:rPr>
-              <w:instrText xml:space="preserve"> PAGEREF _Toc208316284 \h </w:instrText>
+              <w:instrText xml:space="preserve"> PAGEREF _Toc208342024 \h </w:instrText>
             </w:r>
             <w:r>
               <w:rPr>
@@ -9160,7 +9060,7 @@
               <w:lang w:val="en-US"/>
             </w:rPr>
           </w:pPr>
-          <w:hyperlink w:anchor="_Toc208316285" w:history="1">
+          <w:hyperlink w:anchor="_Toc208342025" w:history="1">
             <w:r>
               <w:rPr>
                 <w:rStyle w:val="Hyperlink"/>
@@ -9203,7 +9103,7 @@
                 <w:noProof/>
                 <w:webHidden/>
               </w:rPr>
-              <w:instrText xml:space="preserve"> PAGEREF _Toc208316285 \h </w:instrText>
+              <w:instrText xml:space="preserve"> PAGEREF _Toc208342025 \h </w:instrText>
             </w:r>
             <w:r>
               <w:rPr>
@@ -9243,7 +9143,7 @@
               <w:lang w:val="en-US"/>
             </w:rPr>
           </w:pPr>
-          <w:hyperlink w:anchor="_Toc208316286" w:history="1">
+          <w:hyperlink w:anchor="_Toc208342026" w:history="1">
             <w:r>
               <w:rPr>
                 <w:rStyle w:val="Hyperlink"/>
@@ -9271,7 +9171,7 @@
                 <w:noProof/>
                 <w:webHidden/>
               </w:rPr>
-              <w:instrText xml:space="preserve"> PAGEREF _Toc208316286 \h </w:instrText>
+              <w:instrText xml:space="preserve"> PAGEREF _Toc208342026 \h </w:instrText>
             </w:r>
             <w:r>
               <w:rPr>
@@ -9311,7 +9211,7 @@
               <w:lang w:val="en-US"/>
             </w:rPr>
           </w:pPr>
-          <w:hyperlink w:anchor="_Toc208316287" w:history="1">
+          <w:hyperlink w:anchor="_Toc208342027" w:history="1">
             <w:r>
               <w:rPr>
                 <w:rStyle w:val="Hyperlink"/>
@@ -9339,7 +9239,7 @@
                 <w:noProof/>
                 <w:webHidden/>
               </w:rPr>
-              <w:instrText xml:space="preserve"> PAGEREF _Toc208316287 \h </w:instrText>
+              <w:instrText xml:space="preserve"> PAGEREF _Toc208342027 \h </w:instrText>
             </w:r>
             <w:r>
               <w:rPr>
@@ -9379,7 +9279,7 @@
               <w:lang w:val="en-US"/>
             </w:rPr>
           </w:pPr>
-          <w:hyperlink w:anchor="_Toc208316288" w:history="1">
+          <w:hyperlink w:anchor="_Toc208342028" w:history="1">
             <w:r>
               <w:rPr>
                 <w:rStyle w:val="Hyperlink"/>
@@ -9407,7 +9307,7 @@
                 <w:noProof/>
                 <w:webHidden/>
               </w:rPr>
-              <w:instrText xml:space="preserve"> PAGEREF _Toc208316288 \h </w:instrText>
+              <w:instrText xml:space="preserve"> PAGEREF _Toc208342028 \h </w:instrText>
             </w:r>
             <w:r>
               <w:rPr>
@@ -9447,7 +9347,7 @@
               <w:lang w:val="en-US"/>
             </w:rPr>
           </w:pPr>
-          <w:hyperlink w:anchor="_Toc208316289" w:history="1">
+          <w:hyperlink w:anchor="_Toc208342029" w:history="1">
             <w:r>
               <w:rPr>
                 <w:rStyle w:val="Hyperlink"/>
@@ -9474,7 +9374,7 @@
                 <w:noProof/>
                 <w:webHidden/>
               </w:rPr>
-              <w:instrText xml:space="preserve"> PAGEREF _Toc208316289 \h </w:instrText>
+              <w:instrText xml:space="preserve"> PAGEREF _Toc208342029 \h </w:instrText>
             </w:r>
             <w:r>
               <w:rPr>
@@ -9514,7 +9414,7 @@
               <w:lang w:val="en-US"/>
             </w:rPr>
           </w:pPr>
-          <w:hyperlink w:anchor="_Toc208316290" w:history="1">
+          <w:hyperlink w:anchor="_Toc208342030" w:history="1">
             <w:r>
               <w:rPr>
                 <w:rStyle w:val="Hyperlink"/>
@@ -9542,7 +9442,7 @@
                 <w:noProof/>
                 <w:webHidden/>
               </w:rPr>
-              <w:instrText xml:space="preserve"> PAGEREF _Toc208316290 \h </w:instrText>
+              <w:instrText xml:space="preserve"> PAGEREF _Toc208342030 \h </w:instrText>
             </w:r>
             <w:r>
               <w:rPr>
@@ -9611,7 +9511,7 @@
         </w:rPr>
       </w:pPr>
       <w:bookmarkStart w:id="0" w:name="_Toc18506402"/>
-      <w:bookmarkStart w:id="1" w:name="_Toc208316265"/>
+      <w:bookmarkStart w:id="1" w:name="_Toc208342006"/>
       <w:r>
         <w:rPr>
           <w:sz w:val="36"/>
@@ -9798,7 +9698,7 @@
           <w:lang w:val="sr-Cyrl-RS"/>
         </w:rPr>
       </w:pPr>
-      <w:bookmarkStart w:id="2" w:name="_Toc208316266"/>
+      <w:bookmarkStart w:id="2" w:name="_Toc208342007"/>
       <w:r>
         <w:rPr>
           <w:sz w:val="36"/>
@@ -9898,7 +9798,7 @@
       <w:bookmarkStart w:id="3" w:name="_Toc18083375"/>
       <w:bookmarkStart w:id="4" w:name="_Toc18083154"/>
       <w:bookmarkStart w:id="5" w:name="_Toc18506403"/>
-      <w:bookmarkStart w:id="6" w:name="_Toc208316267"/>
+      <w:bookmarkStart w:id="6" w:name="_Toc208342008"/>
       <w:r>
         <w:rPr>
           <w:sz w:val="36"/>
@@ -9942,7 +9842,7 @@
       <w:r>
         <w:br/>
       </w:r>
-      <w:bookmarkStart w:id="10" w:name="_Toc208316268"/>
+      <w:bookmarkStart w:id="10" w:name="_Toc208342009"/>
       <w:r>
         <w:rPr>
           <w:lang w:val="sr-Cyrl-RS"/>
@@ -10142,7 +10042,7 @@
           <w:lang w:val="sr-Cyrl-RS"/>
         </w:rPr>
       </w:pPr>
-      <w:bookmarkStart w:id="11" w:name="_Toc208316269"/>
+      <w:bookmarkStart w:id="11" w:name="_Toc208342010"/>
       <w:r>
         <w:rPr>
           <w:lang w:val="sr-Cyrl-RS"/>
@@ -10454,7 +10354,7 @@
           <w:lang w:val="sr-Cyrl-RS"/>
         </w:rPr>
       </w:pPr>
-      <w:bookmarkStart w:id="12" w:name="_Toc208316270"/>
+      <w:bookmarkStart w:id="12" w:name="_Toc208342011"/>
       <w:r>
         <w:rPr>
           <w:lang w:val="sr-Cyrl-RS"/>
@@ -10600,7 +10500,7 @@
           <w:lang w:val="sr-Cyrl-RS"/>
         </w:rPr>
       </w:pPr>
-      <w:bookmarkStart w:id="13" w:name="_Toc208316271"/>
+      <w:bookmarkStart w:id="13" w:name="_Toc208342012"/>
       <w:r>
         <w:rPr>
           <w:lang w:val="sr-Cyrl-RS"/>
@@ -10660,7 +10560,7 @@
           <w:lang w:val="sr-Cyrl-RS"/>
         </w:rPr>
       </w:pPr>
-      <w:bookmarkStart w:id="14" w:name="_Toc208316272"/>
+      <w:bookmarkStart w:id="14" w:name="_Toc208342013"/>
       <w:r>
         <w:rPr>
           <w:lang w:val="sr-Cyrl-RS"/>
@@ -10769,7 +10669,7 @@
           <w:lang w:val="sr-Cyrl-RS"/>
         </w:rPr>
       </w:pPr>
-      <w:bookmarkStart w:id="15" w:name="_Toc208316273"/>
+      <w:bookmarkStart w:id="15" w:name="_Toc208342014"/>
       <w:r>
         <w:lastRenderedPageBreak/>
         <w:t>4</w:t>
@@ -11525,24 +11425,32 @@
         <w:lastRenderedPageBreak/>
         <w:br/>
       </w:r>
-      <w:bookmarkStart w:id="16" w:name="_Toc208316275"/>
+      <w:bookmarkStart w:id="16" w:name="_Toc208342015"/>
       <w:r>
         <w:rPr>
           <w:sz w:val="36"/>
           <w:szCs w:val="36"/>
           <w:lang w:val="sr-Cyrl-RS"/>
         </w:rPr>
-        <w:t xml:space="preserve">4. </w:t>
-      </w:r>
-      <w:bookmarkEnd w:id="16"/>
+        <w:t>5</w:t>
+      </w:r>
       <w:r>
         <w:rPr>
           <w:sz w:val="36"/>
           <w:szCs w:val="36"/>
           <w:lang w:val="sr-Cyrl-RS"/>
         </w:rPr>
+        <w:t xml:space="preserve">. </w:t>
+      </w:r>
+      <w:r>
+        <w:rPr>
+          <w:sz w:val="36"/>
+          <w:szCs w:val="36"/>
+          <w:lang w:val="sr-Cyrl-RS"/>
+        </w:rPr>
         <w:t>Функционална спецификација система</w:t>
       </w:r>
+      <w:bookmarkEnd w:id="16"/>
     </w:p>
     <w:p>
       <w:pPr>
@@ -12103,30 +12011,37 @@
           <w:lang w:val="sr-Cyrl-RS"/>
         </w:rPr>
       </w:pPr>
-      <w:bookmarkStart w:id="17" w:name="_Toc208316276"/>
+      <w:bookmarkStart w:id="17" w:name="_Toc208342016"/>
       <w:r>
         <w:rPr>
           <w:sz w:val="36"/>
           <w:szCs w:val="36"/>
         </w:rPr>
-        <w:t xml:space="preserve">5. </w:t>
-      </w:r>
-      <w:bookmarkEnd w:id="17"/>
+        <w:t>6</w:t>
+      </w:r>
       <w:r>
         <w:rPr>
           <w:sz w:val="36"/>
           <w:szCs w:val="36"/>
         </w:rPr>
-        <w:t>А</w:t>
+        <w:t xml:space="preserve">. </w:t>
       </w:r>
       <w:r>
         <w:rPr>
           <w:sz w:val="36"/>
           <w:szCs w:val="36"/>
+        </w:rPr>
+        <w:t>А</w:t>
+      </w:r>
+      <w:r>
+        <w:rPr>
+          <w:sz w:val="36"/>
+          <w:szCs w:val="36"/>
           <w:lang w:val="sr-Cyrl-RS"/>
         </w:rPr>
         <w:t>рхитектура система</w:t>
       </w:r>
+      <w:bookmarkEnd w:id="17"/>
     </w:p>
     <w:p>
       <w:pPr>
@@ -12286,6 +12201,7 @@
         <w:rPr>
           <w:rFonts w:ascii="Times New Roman" w:hAnsi="Times New Roman"/>
           <w:iCs/>
+          <w:noProof/>
           <w:szCs w:val="20"/>
         </w:rPr>
         <w:drawing>
@@ -12576,14 +12492,14 @@
         </w:rPr>
         <w:br/>
       </w:r>
-      <w:bookmarkStart w:id="18" w:name="_Toc208316277"/>
+      <w:bookmarkStart w:id="18" w:name="_Toc208342017"/>
       <w:r>
         <w:rPr>
           <w:sz w:val="36"/>
           <w:szCs w:val="36"/>
           <w:lang w:val="sr-Cyrl-RS"/>
         </w:rPr>
-        <w:t xml:space="preserve">6. </w:t>
+        <w:t>7</w:t>
       </w:r>
       <w:r>
         <w:rPr>
@@ -12591,7 +12507,7 @@
           <w:szCs w:val="36"/>
           <w:lang w:val="sr-Cyrl-RS"/>
         </w:rPr>
-        <w:t xml:space="preserve"> </w:t>
+        <w:t xml:space="preserve">. </w:t>
       </w:r>
       <w:r>
         <w:rPr>
@@ -12599,30 +12515,23 @@
           <w:szCs w:val="36"/>
           <w:lang w:val="sr-Cyrl-RS"/>
         </w:rPr>
-        <w:t xml:space="preserve">Архитектура </w:t>
+        <w:t xml:space="preserve"> </w:t>
       </w:r>
       <w:r>
         <w:rPr>
           <w:sz w:val="36"/>
           <w:szCs w:val="36"/>
-        </w:rPr>
-        <w:t>frontend</w:t>
-      </w:r>
+          <w:lang w:val="sr-Cyrl-RS"/>
+        </w:rPr>
+        <w:t>Модел података</w:t>
+      </w:r>
+      <w:bookmarkEnd w:id="18"/>
       <w:r>
         <w:rPr>
           <w:sz w:val="36"/>
           <w:szCs w:val="36"/>
           <w:lang w:val="sr-Cyrl-RS"/>
         </w:rPr>
-        <w:t xml:space="preserve"> апликације</w:t>
-      </w:r>
-      <w:bookmarkEnd w:id="18"/>
-      <w:r>
-        <w:rPr>
-          <w:sz w:val="36"/>
-          <w:szCs w:val="36"/>
-          <w:lang w:val="sr-Cyrl-RS"/>
-        </w:rPr>
         <w:t xml:space="preserve"> </w:t>
       </w:r>
     </w:p>
@@ -12636,16 +12545,185 @@
     <w:p>
       <w:pPr>
         <w:jc w:val="both"/>
+        <w:rPr>
+          <w:lang w:val="sr-Cyrl-RS"/>
+        </w:rPr>
       </w:pPr>
       <w:r>
         <w:rPr>
           <w:lang w:val="sr-Cyrl-RS"/>
         </w:rPr>
         <w:tab/>
-        <w:t>Предња страна апликације је подељена у више компоненти. Компоненте су подељене на два типа,</w:t>
-      </w:r>
-      <w:bookmarkStart w:id="19" w:name="_GoBack"/>
-      <w:bookmarkEnd w:id="19"/>
+      </w:r>
+      <w:r>
+        <w:rPr>
+          <w:lang w:val="sr-Cyrl-RS"/>
+        </w:rPr>
+        <w:t>Модел података представља основу сваког информационог система, јер дефинише начин на који се подаци структурирају, чувају и користе у оквиру система. У контексту развоја платформе за аутоматизовану трговину енергијом, модел података омогућава јасно разумевање веза између кључних ентитета као што су корисници, батерије, стратегије трговања и историјске цене.</w:t>
+      </w:r>
+      <w:r>
+        <w:rPr>
+          <w:lang w:val="sr-Cyrl-RS"/>
+        </w:rPr>
+        <w:t xml:space="preserve"> </w:t>
+      </w:r>
+      <w:r>
+        <w:rPr>
+          <w:lang w:val="sr-Cyrl-RS"/>
+        </w:rPr>
+        <w:t>У контексту микросервисне архитектуре, какву ова платформа користи, модел података има још већу улогу, будући да сваки сервис мора знати како да приступи подацима и на који начин да их дели са другим деловима система. Тиме се обезбеђује конзистентност и флексибилност, па је могуће да се систем временом надограђује новим функционалностима без нарушавања постојеће структуре. Управо због тога, приказ модела података није само технички корак у развоју, већ кључни елемент који обезбеђује стабилност и дугорочну одрживост целокупног решења.</w:t>
+      </w:r>
+    </w:p>
+    <w:p>
+      <w:pPr>
+        <w:jc w:val="both"/>
+        <w:rPr>
+          <w:lang w:val="sr-Cyrl-RS"/>
+        </w:rPr>
+      </w:pPr>
+      <w:r>
+        <w:rPr>
+          <w:lang w:val="sr-Cyrl-RS"/>
+        </w:rPr>
+        <w:t>За приказ логичке структуре података у систему користи се ER дијаграм (Entity–Relationship)</w:t>
+      </w:r>
+      <w:r>
+        <w:rPr>
+          <w:lang w:val="sr-Cyrl-RS"/>
+        </w:rPr>
+        <w:t xml:space="preserve"> са слике 4</w:t>
+      </w:r>
+      <w:r>
+        <w:rPr>
+          <w:lang w:val="sr-Cyrl-RS"/>
+        </w:rPr>
+        <w:t>, који омогућава визуелно представљање ентитета, њихових атрибута и релација. ER дијаграм је стандардни модел у области софтверског инжењерства, јер пружа апстрактан, али јасан приказ начина на који су подаци организовани, као и начина на који они међусобно комуницирају.</w:t>
+      </w:r>
+    </w:p>
+    <w:p>
+      <w:pPr>
+        <w:jc w:val="both"/>
+        <w:rPr>
+          <w:lang w:val="sr-Cyrl-RS"/>
+        </w:rPr>
+      </w:pPr>
+      <w:r>
+        <w:rPr>
+          <w:lang w:val="sr-Cyrl-RS"/>
+        </w:rPr>
+        <w:t xml:space="preserve">У оквиру приказаног модела могу се издвојити следећи кључни ентитети: </w:t>
+      </w:r>
+      <w:r>
+        <w:rPr>
+          <w:b/>
+          <w:lang w:val="sr-Cyrl-RS"/>
+        </w:rPr>
+        <w:t>User</w:t>
+      </w:r>
+      <w:r>
+        <w:rPr>
+          <w:lang w:val="sr-Cyrl-RS"/>
+        </w:rPr>
+        <w:t xml:space="preserve">, </w:t>
+      </w:r>
+      <w:r>
+        <w:rPr>
+          <w:b/>
+          <w:lang w:val="sr-Cyrl-RS"/>
+        </w:rPr>
+        <w:t>Wallet</w:t>
+      </w:r>
+      <w:r>
+        <w:rPr>
+          <w:lang w:val="sr-Cyrl-RS"/>
+        </w:rPr>
+        <w:t xml:space="preserve">, </w:t>
+      </w:r>
+      <w:r>
+        <w:rPr>
+          <w:b/>
+          <w:lang w:val="sr-Cyrl-RS"/>
+        </w:rPr>
+        <w:t>Battery</w:t>
+      </w:r>
+      <w:r>
+        <w:rPr>
+          <w:lang w:val="sr-Cyrl-RS"/>
+        </w:rPr>
+        <w:t xml:space="preserve">, </w:t>
+      </w:r>
+      <w:r>
+        <w:rPr>
+          <w:b/>
+          <w:lang w:val="sr-Cyrl-RS"/>
+        </w:rPr>
+        <w:t>TradingStrategy</w:t>
+      </w:r>
+      <w:r>
+        <w:rPr>
+          <w:lang w:val="sr-Cyrl-RS"/>
+        </w:rPr>
+        <w:t xml:space="preserve">, </w:t>
+      </w:r>
+      <w:r>
+        <w:rPr>
+          <w:b/>
+          <w:lang w:val="sr-Cyrl-RS"/>
+        </w:rPr>
+        <w:t>PriceHistory</w:t>
+      </w:r>
+      <w:r>
+        <w:rPr>
+          <w:lang w:val="sr-Cyrl-RS"/>
+        </w:rPr>
+        <w:t xml:space="preserve"> и </w:t>
+      </w:r>
+      <w:r>
+        <w:rPr>
+          <w:b/>
+          <w:lang w:val="sr-Cyrl-RS"/>
+        </w:rPr>
+        <w:t>TransactionHistory</w:t>
+      </w:r>
+      <w:r>
+        <w:rPr>
+          <w:lang w:val="sr-Cyrl-RS"/>
+        </w:rPr>
+        <w:t>. Сваки од ових ентитета има своје атрибуте и јасно дефинисану улогу у систему.</w:t>
+      </w:r>
+    </w:p>
+    <w:p>
+      <w:pPr>
+        <w:jc w:val="both"/>
+        <w:rPr>
+          <w:lang w:val="sr-Cyrl-RS"/>
+        </w:rPr>
+      </w:pPr>
+      <w:r>
+        <w:rPr>
+          <w:lang w:val="sr-Cyrl-RS"/>
+        </w:rPr>
+        <w:t>User (корисник) представља централни ентитет, јер свака интеракција у систему почиње од корисника. Корисник се идентификује путем јединственог корисничког имена, док остали атрибути попут пуног имена, лозинке и типа корисника описују његову улогу и овлашћења у систему. Са корисником је директно повезан ентитет Wallet (новчаник), у односу један према један. Овај ентитет чува податке о расположивим средствима и тренутном стању новчаника, што омогућава контролу финансијских ресурса који се користе у трговању.</w:t>
+      </w:r>
+    </w:p>
+    <w:p>
+      <w:pPr>
+        <w:jc w:val="both"/>
+        <w:rPr>
+          <w:lang w:val="sr-Cyrl-RS"/>
+        </w:rPr>
+      </w:pPr>
+      <w:r>
+        <w:rPr>
+          <w:lang w:val="sr-Cyrl-RS"/>
+        </w:rPr>
+        <w:t>Даље, корисник је у односу један према више са ентитетом Battery (батерија). Свака батерија припада једном кориснику, али један корисник може поседовати више батерија. Батерија има атрибуте који дефинишу њен капацитет, тренутни степен напуњености и стање у ком се налази (нпр. пуњење, пражњење, мировање). Посебно је важно истаћи да је свака батерија повезана са TradingStrategy (стратегијом трговања), која дефинише правила понашања током трговања. Однос између ова два ентитета може се описати као једна батерија користи једну стратегију, док једна стратегија може бити примењена на више батерија. Стратегија има назив, опис, тип и параметре који омогућавају прилагођавање различитим условима на тржишту.</w:t>
+      </w:r>
+    </w:p>
+    <w:p>
+      <w:pPr>
+        <w:jc w:val="both"/>
+      </w:pPr>
     </w:p>
     <w:p>
       <w:pPr>
@@ -12656,13 +12734,17 @@
       </w:pPr>
       <w:r>
         <w:rPr>
-          <w:noProof/>
-        </w:rPr>
+          <w:rFonts w:ascii="Times New Roman" w:hAnsi="Times New Roman"/>
+          <w:b/>
+          <w:iCs/>
+          <w:szCs w:val="20"/>
+        </w:rPr>
+        <w:lastRenderedPageBreak/>
         <w:drawing>
-          <wp:inline distT="0" distB="0" distL="0" distR="0" wp14:anchorId="2F95B64F" wp14:editId="07540E46">
-            <wp:extent cx="5883910" cy="2878455"/>
-            <wp:effectExtent l="0" t="0" r="2540" b="0"/>
-            <wp:docPr id="107" name="Picture 107"/>
+          <wp:inline distT="0" distB="0" distL="0" distR="0" wp14:anchorId="1769E09E" wp14:editId="06C0150B">
+            <wp:extent cx="5681708" cy="6153150"/>
+            <wp:effectExtent l="0" t="0" r="0" b="0"/>
+            <wp:docPr id="1284637912" name="Picture 3"/>
             <wp:cNvGraphicFramePr>
               <a:graphicFrameLocks xmlns:a="http://schemas.openxmlformats.org/drawingml/2006/main" noChangeAspect="1"/>
             </wp:cNvGraphicFramePr>
@@ -12670,13 +12752,13 @@
               <a:graphicData uri="http://schemas.openxmlformats.org/drawingml/2006/picture">
                 <pic:pic xmlns:pic="http://schemas.openxmlformats.org/drawingml/2006/picture">
                   <pic:nvPicPr>
-                    <pic:cNvPr id="0" name="Picture 35"/>
+                    <pic:cNvPr id="0" name="Picture 3"/>
                     <pic:cNvPicPr>
                       <a:picLocks noChangeAspect="1" noChangeArrowheads="1"/>
                     </pic:cNvPicPr>
                   </pic:nvPicPr>
                   <pic:blipFill>
-                    <a:blip r:embed="rId27">
+                    <a:blip r:embed="rId27" cstate="print">
                       <a:extLst>
                         <a:ext uri="{28A0092B-C50C-407E-A947-70E740481C1C}">
                           <a14:useLocalDpi xmlns:a14="http://schemas.microsoft.com/office/drawing/2010/main" val="0"/>
@@ -12691,7 +12773,7 @@
                   <pic:spPr bwMode="auto">
                     <a:xfrm>
                       <a:off x="0" y="0"/>
-                      <a:ext cx="5883910" cy="2878455"/>
+                      <a:ext cx="5840206" cy="6324800"/>
                     </a:xfrm>
                     <a:prstGeom prst="rect">
                       <a:avLst/>
@@ -12712,32 +12794,68 @@
           <w:lang w:val="sr-Cyrl-RS"/>
         </w:rPr>
         <w:br/>
-        <w:t xml:space="preserve">Слика 7 – Имплементација </w:t>
-      </w:r>
-      <w:r>
-        <w:t>Redux Persist</w:t>
-      </w:r>
-      <w:r>
-        <w:rPr>
-          <w:lang w:val="sr-Cyrl-RS"/>
-        </w:rPr>
-        <w:t>-а</w:t>
-      </w:r>
-      <w:r>
-        <w:rPr>
-          <w:lang w:val="sr-Cyrl-RS"/>
-        </w:rPr>
-        <w:t xml:space="preserve"> и структура </w:t>
-      </w:r>
-      <w:r>
-        <w:t>Redux</w:t>
-      </w:r>
-      <w:r>
-        <w:rPr>
-          <w:lang w:val="sr-Cyrl-RS"/>
-        </w:rPr>
-        <w:t>-а</w:t>
-      </w:r>
+        <w:t>Слика 4</w:t>
+      </w:r>
+      <w:r>
+        <w:rPr>
+          <w:lang w:val="sr-Cyrl-RS"/>
+        </w:rPr>
+        <w:t xml:space="preserve"> – </w:t>
+      </w:r>
+      <w:r>
+        <w:rPr>
+          <w:lang w:val="sr-Cyrl-RS"/>
+        </w:rPr>
+        <w:t>Модел података</w:t>
+      </w:r>
+    </w:p>
+    <w:p>
+      <w:pPr>
+        <w:jc w:val="both"/>
+        <w:rPr>
+          <w:lang w:val="sr-Cyrl-RS"/>
+        </w:rPr>
+      </w:pPr>
+      <w:r>
+        <w:rPr>
+          <w:lang w:val="sr-Cyrl-RS"/>
+        </w:rPr>
+        <w:t>Ентитет PriceHistory (историја цена) представља основу за све одлуке у систему. Он бележи историјске податке о ценама електричне енергије, при чему сваки запис садржи цену и временску ознаку. Ови подаци омогућавају анализу тржишних кретања и служе као полазиште за алгоритме вештачке интелигенције који предвиђају будуће цене.</w:t>
+      </w:r>
+    </w:p>
+    <w:p>
+      <w:pPr>
+        <w:jc w:val="both"/>
+        <w:rPr>
+          <w:lang w:val="sr-Cyrl-RS"/>
+        </w:rPr>
+      </w:pPr>
+      <w:r>
+        <w:rPr>
+          <w:lang w:val="sr-Cyrl-RS"/>
+        </w:rPr>
+        <w:t>Коначно, ентитет TransactionHistory (историја трансакција) омогућава праћење свих активности у систему. Он бележи корисника који је извршио трансакцију, тип трансакције (куповина или продаја), износ, временску ознаку и стратегију која је искоришћена приликом извршења. Овим се обезбеђује потпуна евиденција о раду система и добијају се подаци неопходни за каснију анализу успешности различитих стратегија трговања.</w:t>
+      </w:r>
+      <w:r>
+        <w:rPr>
+          <w:lang w:val="sr-Cyrl-RS"/>
+        </w:rPr>
+        <w:t xml:space="preserve"> </w:t>
+      </w:r>
+      <w:r>
+        <w:rPr>
+          <w:lang w:val="sr-Cyrl-RS"/>
+        </w:rPr>
+        <w:t>Релације између ентитета показују јасно дефинисане зависности: корисник поседује новчаник и батерије, батерије користе стратегије, а све активности које се спроводе бележе се у историји трансакција. Историја цена је, иако независна у моделу, логички повезана са трансакцијама, јер управо подаци о ценама утичу на одлуке које касније резултују конкретним трансакцијама.</w:t>
+      </w:r>
+    </w:p>
+    <w:p>
+      <w:pPr>
+        <w:jc w:val="both"/>
+        <w:rPr>
+          <w:lang w:val="sr-Cyrl-RS"/>
+        </w:rPr>
+      </w:pPr>
     </w:p>
     <w:p>
       <w:pPr>
@@ -12746,18 +12864,35 @@
           <w:lang w:val="sr-Cyrl-RS"/>
         </w:rPr>
       </w:pPr>
-      <w:bookmarkStart w:id="20" w:name="_Toc208316278"/>
-      <w:r>
-        <w:t xml:space="preserve">6.1 </w:t>
-      </w:r>
-      <w:r>
-        <w:rPr>
-          <w:lang w:val="sr-Cyrl-RS"/>
-        </w:rPr>
-        <w:t>Сталне компоненте</w:t>
-      </w:r>
-      <w:bookmarkEnd w:id="20"/>
-    </w:p>
+      <w:bookmarkStart w:id="19" w:name="_Toc208342018"/>
+      <w:r>
+        <w:rPr>
+          <w:sz w:val="36"/>
+          <w:szCs w:val="36"/>
+        </w:rPr>
+        <w:t>8</w:t>
+      </w:r>
+      <w:bookmarkEnd w:id="19"/>
+      <w:r>
+        <w:t xml:space="preserve"> </w:t>
+      </w:r>
+      <w:r>
+        <w:rPr>
+          <w:sz w:val="36"/>
+          <w:szCs w:val="36"/>
+          <w:lang w:val="sr-Cyrl-RS"/>
+        </w:rPr>
+        <w:t xml:space="preserve">Имплементација </w:t>
+      </w:r>
+      <w:r>
+        <w:rPr>
+          <w:sz w:val="36"/>
+          <w:szCs w:val="36"/>
+        </w:rPr>
+        <w:t>система</w:t>
+      </w:r>
+    </w:p>
+    <w:p/>
     <w:p>
       <w:pPr>
         <w:jc w:val="both"/>
@@ -12769,62 +12904,13 @@
         <w:rPr>
           <w:lang w:val="sr-Cyrl-RS"/>
         </w:rPr>
-        <w:tab/>
-        <w:t>Сталне компоненте су компоненте које су стално видљиве кориснику. Најчешће су то разн</w:t>
-      </w:r>
-      <w:r>
-        <w:rPr>
-          <w:lang w:val="sr-Cyrl-RS"/>
-        </w:rPr>
-        <w:t xml:space="preserve">е опције за навигацију по веб сајту, наслов, хедер </w:t>
-      </w:r>
-      <w:r>
-        <w:t>(header)</w:t>
-      </w:r>
-      <w:r>
-        <w:rPr>
-          <w:lang w:val="sr-Cyrl-RS"/>
-        </w:rPr>
-        <w:t>, футер</w:t>
-      </w:r>
-      <w:r>
-        <w:t xml:space="preserve"> (footer)</w:t>
-      </w:r>
-      <w:r>
-        <w:rPr>
-          <w:lang w:val="sr-Cyrl-RS"/>
-        </w:rPr>
-        <w:t>. У апликацији тренутно постоје сајдбар (</w:t>
-      </w:r>
-      <w:r>
-        <w:t xml:space="preserve">sidebar, </w:t>
-      </w:r>
-      <w:r>
-        <w:rPr>
-          <w:lang w:val="sr-Cyrl-RS"/>
-        </w:rPr>
-        <w:t>навигациони мени са леве стране), навбар (</w:t>
-      </w:r>
-      <w:r>
-        <w:t xml:space="preserve">navbar, </w:t>
-      </w:r>
-      <w:r>
-        <w:rPr>
-          <w:lang w:val="sr-Cyrl-RS"/>
-        </w:rPr>
-        <w:t>мени са опцијама на горњој страни)</w:t>
-      </w:r>
-      <w:r>
-        <w:rPr>
-          <w:lang w:val="en-GB"/>
-        </w:rPr>
-        <w:t xml:space="preserve">, </w:t>
-      </w:r>
-      <w:r>
-        <w:rPr>
-          <w:lang w:val="sr-Cyrl-RS"/>
-        </w:rPr>
-        <w:t xml:space="preserve">као и стандардни футер. </w:t>
+        <w:t>У овом поглављу биће представљена имплементација система за аутоматизовано трговање енергијом. Циљ је да се прикаже на који начин су концепти описани у претходним поглављима преточени у практично решење. Фокус ће бити на објашњењу структуре пројекта, организацији микросервиса, као и на међусобној комуникацији између њих.</w:t>
+      </w:r>
+      <w:r>
+        <w:rPr>
+          <w:lang w:val="sr-Cyrl-RS"/>
+        </w:rPr>
+        <w:t xml:space="preserve"> </w:t>
       </w:r>
     </w:p>
     <w:p>
@@ -12838,13 +12924,36 @@
         <w:rPr>
           <w:lang w:val="sr-Cyrl-RS"/>
         </w:rPr>
-        <w:t xml:space="preserve">Сајдбар садржи елементе (трафостанице) које добавља из базе података, док навбар </w:t>
-      </w:r>
-      <w:r>
-        <w:rPr>
-          <w:lang w:val="sr-Cyrl-RS"/>
-        </w:rPr>
-        <w:t xml:space="preserve">има опције одабира за које тржиште ће бити рађен приказ (Европско и Америчко тржиште имају различите ознаке у приказу) као и могућност додавања нових трафостаница. </w:t>
+        <w:t xml:space="preserve">Пројекат је реализован </w:t>
+      </w:r>
+      <w:r>
+        <w:rPr>
+          <w:lang w:val="sr-Cyrl-RS"/>
+        </w:rPr>
+        <w:t xml:space="preserve">унутар </w:t>
+      </w:r>
+      <w:r>
+        <w:rPr>
+          <w:lang w:val="sr-Cyrl-RS"/>
+        </w:rPr>
+        <w:t>заједничког репозиторијума у оквиру кога се налазе сви микросервиси и фронтенд апликација. Овакав приступ одабран је ради једноставнијег управљања, централизоване конфигурације и лакше интеграције свих делова система. На највишем нивоу, структура пројекта подељена је у два главна директоријума: frontend, који садржи React апликацију за кориснички интерфејс, и microservices, у оквиру кога се налазе сви појединачни сервиси задужени за обраду података и имплементацију логике пословања.</w:t>
+      </w:r>
+      <w:r>
+        <w:rPr>
+          <w:lang w:val="sr-Cyrl-RS"/>
+        </w:rPr>
+        <w:t xml:space="preserve"> </w:t>
+      </w:r>
+    </w:p>
+    <w:p>
+      <w:pPr>
+        <w:jc w:val="both"/>
+      </w:pPr>
+      <w:r>
+        <w:rPr>
+          <w:lang w:val="sr-Cyrl-RS"/>
+        </w:rPr>
+        <w:t>У директоријуму microservices сваки сервис има сопствени поддиректоријум, као што су microservice-user, microservice-data, microservice-trade и microservice-ai. Сваки од ових директоријума организован је на исти начин: садрже конфигурационе фајлове (package.json, Dockerfile), изворни код у оквиру src директоријума, као и потребне зависности. На овај начин обезбеђена је конзистентност у развоју и једноставнија интеграција, јер сваки сервис може независно да се развија, тестира и покреће.</w:t>
       </w:r>
     </w:p>
     <w:p>
@@ -12859,10 +12968,10 @@
           <w:noProof/>
         </w:rPr>
         <w:drawing>
-          <wp:inline distT="0" distB="0" distL="0" distR="0" wp14:anchorId="57F88429" wp14:editId="4DAFD133">
-            <wp:extent cx="2743200" cy="1123950"/>
+          <wp:inline distT="0" distB="0" distL="0" distR="0" wp14:anchorId="3E6A941D" wp14:editId="621BCD91">
+            <wp:extent cx="3048000" cy="2957628"/>
             <wp:effectExtent l="0" t="0" r="0" b="0"/>
-            <wp:docPr id="9" name="Picture 9"/>
+            <wp:docPr id="1" name="Picture 1"/>
             <wp:cNvGraphicFramePr>
               <a:graphicFrameLocks xmlns:a="http://schemas.openxmlformats.org/drawingml/2006/main" noChangeAspect="1"/>
             </wp:cNvGraphicFramePr>
@@ -12870,36 +12979,23 @@
               <a:graphicData uri="http://schemas.openxmlformats.org/drawingml/2006/picture">
                 <pic:pic xmlns:pic="http://schemas.openxmlformats.org/drawingml/2006/picture">
                   <pic:nvPicPr>
-                    <pic:cNvPr id="0" name="Picture 3"/>
-                    <pic:cNvPicPr>
-                      <a:picLocks noChangeAspect="1" noChangeArrowheads="1"/>
-                    </pic:cNvPicPr>
+                    <pic:cNvPr id="1" name=""/>
+                    <pic:cNvPicPr/>
                   </pic:nvPicPr>
                   <pic:blipFill>
-                    <a:blip r:embed="rId28">
-                      <a:extLst>
-                        <a:ext uri="{28A0092B-C50C-407E-A947-70E740481C1C}">
-                          <a14:useLocalDpi xmlns:a14="http://schemas.microsoft.com/office/drawing/2010/main" val="0"/>
-                        </a:ext>
-                      </a:extLst>
-                    </a:blip>
-                    <a:srcRect/>
+                    <a:blip r:embed="rId28"/>
                     <a:stretch>
                       <a:fillRect/>
                     </a:stretch>
                   </pic:blipFill>
-                  <pic:spPr bwMode="auto">
+                  <pic:spPr>
                     <a:xfrm>
                       <a:off x="0" y="0"/>
-                      <a:ext cx="2743200" cy="1123950"/>
+                      <a:ext cx="3058367" cy="2967687"/>
                     </a:xfrm>
                     <a:prstGeom prst="rect">
                       <a:avLst/>
                     </a:prstGeom>
-                    <a:noFill/>
-                    <a:ln>
-                      <a:noFill/>
-                    </a:ln>
                   </pic:spPr>
                 </pic:pic>
               </a:graphicData>
@@ -12912,24 +13008,55 @@
           <w:lang w:val="sr-Cyrl-RS"/>
         </w:rPr>
         <w:br/>
-        <w:t>Слика 8 – Сталне компоненте</w:t>
+        <w:t>Слика 5</w:t>
+      </w:r>
+      <w:r>
+        <w:rPr>
+          <w:lang w:val="sr-Cyrl-RS"/>
+        </w:rPr>
+        <w:t xml:space="preserve"> – </w:t>
+      </w:r>
+      <w:r>
+        <w:rPr>
+          <w:lang w:val="sr-Cyrl-RS"/>
+        </w:rPr>
+        <w:t>Основна структура</w:t>
+      </w:r>
+    </w:p>
+    <w:p>
+      <w:pPr>
+        <w:jc w:val="both"/>
+        <w:rPr>
+          <w:lang w:val="sr-Cyrl-RS"/>
+        </w:rPr>
+      </w:pPr>
+      <w:r>
+        <w:rPr>
+          <w:lang w:val="sr-Cyrl-RS"/>
+        </w:rPr>
+        <w:t>Посебну улогу у структури пројекта имају Docker и Docker Compose који омогућавају изолацију сваког микросервиса у оквиру сопственог контејнера, као и њихово повезивање у заједничку целину. На овај начин се постиже репродуктивност окружења и једноставније постављање система без обзира на платформу.</w:t>
       </w:r>
     </w:p>
     <w:p>
       <w:pPr>
         <w:pStyle w:val="Heading1"/>
-        <w:rPr>
-          <w:lang w:val="sr-Cyrl-RS"/>
-        </w:rPr>
-      </w:pPr>
-      <w:bookmarkStart w:id="21" w:name="_Toc208316279"/>
+      </w:pPr>
+      <w:bookmarkStart w:id="20" w:name="_Toc208342019"/>
       <w:r>
         <w:rPr>
           <w:lang w:val="sr-Cyrl-RS"/>
         </w:rPr>
         <w:lastRenderedPageBreak/>
-        <w:t>6.2 Компоненте променљивог приказа</w:t>
-      </w:r>
+        <w:t>8.1</w:t>
+      </w:r>
+      <w:r>
+        <w:rPr>
+          <w:lang w:val="sr-Cyrl-RS"/>
+        </w:rPr>
+        <w:t xml:space="preserve"> Компоненте променљивог приказа</w:t>
+      </w:r>
+      <w:bookmarkStart w:id="21" w:name="_GoBack"/>
+      <w:bookmarkEnd w:id="20"/>
       <w:bookmarkEnd w:id="21"/>
     </w:p>
     <w:p>
@@ -13079,7 +13206,7 @@
           <w:lang w:val="sr-Cyrl-RS"/>
         </w:rPr>
       </w:pPr>
-      <w:bookmarkStart w:id="22" w:name="_Toc208316280"/>
+      <w:bookmarkStart w:id="22" w:name="_Toc208342020"/>
       <w:r>
         <w:rPr>
           <w:sz w:val="36"/>
@@ -13133,7 +13260,7 @@
           <w:lang w:val="sr-Cyrl-RS"/>
         </w:rPr>
       </w:pPr>
-      <w:bookmarkStart w:id="23" w:name="_Toc208316281"/>
+      <w:bookmarkStart w:id="23" w:name="_Toc208342021"/>
       <w:r>
         <w:rPr>
           <w:lang w:val="sr-Cyrl-RS"/>
@@ -13294,7 +13421,7 @@
           <w:lang w:val="sr-Cyrl-RS"/>
         </w:rPr>
       </w:pPr>
-      <w:bookmarkStart w:id="24" w:name="_Toc208316282"/>
+      <w:bookmarkStart w:id="24" w:name="_Toc208342022"/>
       <w:r>
         <w:rPr>
           <w:lang w:val="sr-Cyrl-RS"/>
@@ -13657,7 +13784,7 @@
           <w:lang w:val="sr-Cyrl-RS"/>
         </w:rPr>
       </w:pPr>
-      <w:bookmarkStart w:id="25" w:name="_Toc208316283"/>
+      <w:bookmarkStart w:id="25" w:name="_Toc208342023"/>
       <w:r>
         <w:t>7.3 Sidebar</w:t>
       </w:r>
@@ -13789,7 +13916,7 @@
           <w:lang w:val="sr-Cyrl-RS"/>
         </w:rPr>
       </w:pPr>
-      <w:bookmarkStart w:id="26" w:name="_Toc208316284"/>
+      <w:bookmarkStart w:id="26" w:name="_Toc208342024"/>
       <w:r>
         <w:rPr>
           <w:lang w:val="sr-Cyrl-RS"/>
@@ -14517,7 +14644,7 @@
           <w:lang w:val="sr-Cyrl-RS"/>
         </w:rPr>
       </w:pPr>
-      <w:bookmarkStart w:id="27" w:name="_Toc208316285"/>
+      <w:bookmarkStart w:id="27" w:name="_Toc208342025"/>
       <w:r>
         <w:rPr>
           <w:lang w:val="sr-Cyrl-RS"/>
@@ -14813,7 +14940,7 @@
           <w:lang w:val="sr-Cyrl-RS"/>
         </w:rPr>
       </w:pPr>
-      <w:bookmarkStart w:id="28" w:name="_Toc208316286"/>
+      <w:bookmarkStart w:id="28" w:name="_Toc208342026"/>
       <w:r>
         <w:rPr>
           <w:lang w:val="sr-Cyrl-RS"/>
@@ -15350,7 +15477,7 @@
           <w:lang w:val="sr-Cyrl-RS"/>
         </w:rPr>
       </w:pPr>
-      <w:bookmarkStart w:id="29" w:name="_Toc208316287"/>
+      <w:bookmarkStart w:id="29" w:name="_Toc208342027"/>
       <w:r>
         <w:rPr>
           <w:lang w:val="sr-Cyrl-RS"/>
@@ -15764,7 +15891,7 @@
           <w:lang w:val="sr-Cyrl-RS"/>
         </w:rPr>
       </w:pPr>
-      <w:bookmarkStart w:id="30" w:name="_Toc208316288"/>
+      <w:bookmarkStart w:id="30" w:name="_Toc208342028"/>
       <w:r>
         <w:rPr>
           <w:sz w:val="36"/>
@@ -15939,7 +16066,7 @@
           <w:szCs w:val="36"/>
         </w:rPr>
       </w:pPr>
-      <w:bookmarkStart w:id="31" w:name="_Toc208316289"/>
+      <w:bookmarkStart w:id="31" w:name="_Toc208342029"/>
       <w:r>
         <w:rPr>
           <w:sz w:val="36"/>
@@ -16076,7 +16203,7 @@
           <w:lang w:val="sr-Cyrl-RS"/>
         </w:rPr>
       </w:pPr>
-      <w:bookmarkStart w:id="32" w:name="_Toc208316290"/>
+      <w:bookmarkStart w:id="32" w:name="_Toc208342030"/>
       <w:r>
         <w:rPr>
           <w:sz w:val="36"/>
@@ -16263,7 +16390,7 @@
         <w:rStyle w:val="PageNumber"/>
         <w:noProof/>
       </w:rPr>
-      <w:t>14</w:t>
+      <w:t>16</w:t>
     </w:r>
     <w:r>
       <w:rPr>
@@ -20321,6 +20448,43 @@
       <w:shd w:val="clear" w:color="auto" w:fill="E1DFDD"/>
     </w:rPr>
   </w:style>
+  <w:style w:type="paragraph" w:customStyle="1" w:styleId="CodeBase">
+    <w:name w:val="CodeBase"/>
+    <w:basedOn w:val="Normal"/>
+    <w:link w:val="CodeBaseChar"/>
+    <w:qFormat/>
+    <w:rsid w:val="00A31E03"/>
+    <w:pPr>
+      <w:pBdr>
+        <w:top w:val="single" w:sz="18" w:space="1" w:color="auto"/>
+        <w:left w:val="single" w:sz="18" w:space="4" w:color="auto"/>
+        <w:bottom w:val="single" w:sz="18" w:space="1" w:color="auto"/>
+        <w:right w:val="single" w:sz="18" w:space="4" w:color="auto"/>
+      </w:pBdr>
+      <w:shd w:val="clear" w:color="auto" w:fill="F2F2F2" w:themeFill="background1" w:themeFillShade="F2"/>
+      <w:spacing w:before="240" w:after="240"/>
+    </w:pPr>
+    <w:rPr>
+      <w:rFonts w:ascii="Consolas" w:hAnsi="Consolas"/>
+      <w:color w:val="000000" w:themeColor="text1"/>
+      <w:sz w:val="24"/>
+      <w:lang w:val="sr-Cyrl-RS"/>
+    </w:rPr>
+  </w:style>
+  <w:style w:type="character" w:customStyle="1" w:styleId="CodeBaseChar">
+    <w:name w:val="CodeBase Char"/>
+    <w:basedOn w:val="DefaultParagraphFont"/>
+    <w:link w:val="CodeBase"/>
+    <w:rsid w:val="00A31E03"/>
+    <w:rPr>
+      <w:rFonts w:ascii="Consolas" w:hAnsi="Consolas"/>
+      <w:color w:val="000000" w:themeColor="text1"/>
+      <w:sz w:val="24"/>
+      <w:szCs w:val="22"/>
+      <w:shd w:val="clear" w:color="auto" w:fill="F2F2F2" w:themeFill="background1" w:themeFillShade="F2"/>
+      <w:lang w:val="sr-Cyrl-RS"/>
+    </w:rPr>
+  </w:style>
 </w:styles>
 </file>
 
@@ -20614,7 +20778,7 @@
 </file>
 
 <file path=customXml/itemProps1.xml><?xml version="1.0" encoding="utf-8"?>
-<ds:datastoreItem xmlns:ds="http://schemas.openxmlformats.org/officeDocument/2006/customXml" ds:itemID="{5AAE8BD2-1B12-437B-8986-B24696FCA965}">
+<ds:datastoreItem xmlns:ds="http://schemas.openxmlformats.org/officeDocument/2006/customXml" ds:itemID="{CFB966CA-7F19-4210-8835-EA1DE7BB061E}">
   <ds:schemaRefs>
     <ds:schemaRef ds:uri="http://schemas.openxmlformats.org/officeDocument/2006/bibliography"/>
   </ds:schemaRefs>

</xml_diff>